<commit_message>
Sociometry 7-B: fill in student and supervisor
Co-Authored-By: Claude Opus 5.5 <noreply@anthropic.com>
Claude-Session: https://claude.ai/code/session_01GFu2W451x5XtQ2jX1R5bt2
</commit_message>
<xml_diff>
--- a/praktika/sociometria_7B/Sociometria_7B.docx
+++ b/praktika/sociometria_7B/Sociometria_7B.docx
@@ -177,7 +177,7 @@
           <w:b w:val="0"/>
           <w:i w:val="0"/>
         </w:rPr>
-        <w:t>[ФИО студентки]</w:t>
+        <w:t>Бычкова Ульяна Андреевна</w:t>
       </w:r>
     </w:p>
     <w:p>
@@ -212,7 +212,21 @@
           <w:b w:val="0"/>
           <w:i w:val="0"/>
         </w:rPr>
-        <w:t>[должность, ФИО руководителя]</w:t>
+        <w:t>доцент кафедры общей и педагогической психологии</w:t>
+      </w:r>
+    </w:p>
+    <w:p>
+      <w:pPr>
+        <w:spacing w:after="0" w:line="276" w:lineRule="auto"/>
+        <w:ind w:left="4535"/>
+        <w:jc w:val="left"/>
+      </w:pPr>
+      <w:r>
+        <w:rPr>
+          <w:b w:val="0"/>
+          <w:i w:val="0"/>
+        </w:rPr>
+        <w:t>Колосова Е. В.</w:t>
       </w:r>
     </w:p>
     <w:p>

</xml_diff>

<commit_message>
Sociometry 7-B: fix pagination, proper questionnaire form
Co-Authored-By: Claude Opus 5.5 <noreply@anthropic.com>
Claude-Session: https://claude.ai/code/session_01GFu2W451x5XtQ2jX1R5bt2
</commit_message>
<xml_diff>
--- a/praktika/sociometria_7B/Sociometria_7B.docx
+++ b/praktika/sociometria_7B/Sociometria_7B.docx
@@ -298,6 +298,8 @@
     </w:p>
     <w:p>
       <w:pPr>
+        <w:keepNext/>
+        <w:pageBreakBefore w:val="0"/>
         <w:spacing w:after="120" w:line="276" w:lineRule="auto"/>
         <w:jc w:val="center"/>
       </w:pPr>
@@ -395,6 +397,8 @@
     </w:p>
     <w:p>
       <w:pPr>
+        <w:keepNext/>
+        <w:pageBreakBefore/>
         <w:spacing w:after="120" w:line="276" w:lineRule="auto"/>
         <w:jc w:val="center"/>
       </w:pPr>
@@ -424,11 +428,16 @@
             <w:tcW w:type="dxa" w:w="680"/>
           </w:tcPr>
           <w:p>
+            <w:pPr>
+              <w:spacing w:after="0" w:line="240" w:lineRule="auto"/>
+              <w:ind w:firstLine="0"/>
+              <w:jc w:val="left"/>
+            </w:pPr>
             <w:r/>
             <w:r>
               <w:rPr>
                 <w:b/>
-                <w:sz w:val="22"/>
+                <w:sz w:val="20"/>
               </w:rPr>
               <w:t>№</w:t>
             </w:r>
@@ -439,11 +448,16 @@
             <w:tcW w:type="dxa" w:w="3969"/>
           </w:tcPr>
           <w:p>
+            <w:pPr>
+              <w:spacing w:after="0" w:line="240" w:lineRule="auto"/>
+              <w:ind w:firstLine="0"/>
+              <w:jc w:val="left"/>
+            </w:pPr>
             <w:r/>
             <w:r>
               <w:rPr>
                 <w:b/>
-                <w:sz w:val="22"/>
+                <w:sz w:val="20"/>
               </w:rPr>
               <w:t>Обучающийся</w:t>
             </w:r>
@@ -454,11 +468,16 @@
             <w:tcW w:type="dxa" w:w="1134"/>
           </w:tcPr>
           <w:p>
+            <w:pPr>
+              <w:spacing w:after="0" w:line="240" w:lineRule="auto"/>
+              <w:ind w:firstLine="0"/>
+              <w:jc w:val="left"/>
+            </w:pPr>
             <w:r/>
             <w:r>
               <w:rPr>
                 <w:b/>
-                <w:sz w:val="22"/>
+                <w:sz w:val="20"/>
               </w:rPr>
               <w:t>Пол</w:t>
             </w:r>
@@ -469,11 +488,16 @@
             <w:tcW w:type="dxa" w:w="1134"/>
           </w:tcPr>
           <w:p>
+            <w:pPr>
+              <w:spacing w:after="0" w:line="240" w:lineRule="auto"/>
+              <w:ind w:firstLine="0"/>
+              <w:jc w:val="left"/>
+            </w:pPr>
             <w:r/>
             <w:r>
               <w:rPr>
                 <w:b/>
-                <w:sz w:val="22"/>
+                <w:sz w:val="20"/>
               </w:rPr>
               <w:t>Анкета</w:t>
             </w:r>
@@ -486,10 +510,15 @@
             <w:tcW w:type="dxa" w:w="680"/>
           </w:tcPr>
           <w:p>
-            <w:r/>
-            <w:r>
-              <w:rPr>
-                <w:sz w:val="22"/>
+            <w:pPr>
+              <w:spacing w:after="0" w:line="240" w:lineRule="auto"/>
+              <w:ind w:firstLine="0"/>
+              <w:jc w:val="left"/>
+            </w:pPr>
+            <w:r/>
+            <w:r>
+              <w:rPr>
+                <w:sz w:val="20"/>
               </w:rPr>
               <w:t>1</w:t>
             </w:r>
@@ -500,10 +529,15 @@
             <w:tcW w:type="dxa" w:w="3969"/>
           </w:tcPr>
           <w:p>
-            <w:r/>
-            <w:r>
-              <w:rPr>
-                <w:sz w:val="22"/>
+            <w:pPr>
+              <w:spacing w:after="0" w:line="240" w:lineRule="auto"/>
+              <w:ind w:firstLine="0"/>
+              <w:jc w:val="left"/>
+            </w:pPr>
+            <w:r/>
+            <w:r>
+              <w:rPr>
+                <w:sz w:val="20"/>
               </w:rPr>
               <w:t>Бабишев А.</w:t>
             </w:r>
@@ -514,10 +548,15 @@
             <w:tcW w:type="dxa" w:w="1134"/>
           </w:tcPr>
           <w:p>
-            <w:r/>
-            <w:r>
-              <w:rPr>
-                <w:sz w:val="22"/>
+            <w:pPr>
+              <w:spacing w:after="0" w:line="240" w:lineRule="auto"/>
+              <w:ind w:firstLine="0"/>
+              <w:jc w:val="left"/>
+            </w:pPr>
+            <w:r/>
+            <w:r>
+              <w:rPr>
+                <w:sz w:val="20"/>
               </w:rPr>
               <w:t>м</w:t>
             </w:r>
@@ -528,10 +567,15 @@
             <w:tcW w:type="dxa" w:w="1134"/>
           </w:tcPr>
           <w:p>
-            <w:r/>
-            <w:r>
-              <w:rPr>
-                <w:sz w:val="22"/>
+            <w:pPr>
+              <w:spacing w:after="0" w:line="240" w:lineRule="auto"/>
+              <w:ind w:firstLine="0"/>
+              <w:jc w:val="left"/>
+            </w:pPr>
+            <w:r/>
+            <w:r>
+              <w:rPr>
+                <w:sz w:val="20"/>
               </w:rPr>
               <w:t>+</w:t>
             </w:r>
@@ -544,10 +588,15 @@
             <w:tcW w:type="dxa" w:w="680"/>
           </w:tcPr>
           <w:p>
-            <w:r/>
-            <w:r>
-              <w:rPr>
-                <w:sz w:val="22"/>
+            <w:pPr>
+              <w:spacing w:after="0" w:line="240" w:lineRule="auto"/>
+              <w:ind w:firstLine="0"/>
+              <w:jc w:val="left"/>
+            </w:pPr>
+            <w:r/>
+            <w:r>
+              <w:rPr>
+                <w:sz w:val="20"/>
               </w:rPr>
               <w:t>2</w:t>
             </w:r>
@@ -558,10 +607,15 @@
             <w:tcW w:type="dxa" w:w="3969"/>
           </w:tcPr>
           <w:p>
-            <w:r/>
-            <w:r>
-              <w:rPr>
-                <w:sz w:val="22"/>
+            <w:pPr>
+              <w:spacing w:after="0" w:line="240" w:lineRule="auto"/>
+              <w:ind w:firstLine="0"/>
+              <w:jc w:val="left"/>
+            </w:pPr>
+            <w:r/>
+            <w:r>
+              <w:rPr>
+                <w:sz w:val="20"/>
               </w:rPr>
               <w:t>Бакин Г. (?)</w:t>
             </w:r>
@@ -572,10 +626,15 @@
             <w:tcW w:type="dxa" w:w="1134"/>
           </w:tcPr>
           <w:p>
-            <w:r/>
-            <w:r>
-              <w:rPr>
-                <w:sz w:val="22"/>
+            <w:pPr>
+              <w:spacing w:after="0" w:line="240" w:lineRule="auto"/>
+              <w:ind w:firstLine="0"/>
+              <w:jc w:val="left"/>
+            </w:pPr>
+            <w:r/>
+            <w:r>
+              <w:rPr>
+                <w:sz w:val="20"/>
               </w:rPr>
               <w:t>м</w:t>
             </w:r>
@@ -586,10 +645,15 @@
             <w:tcW w:type="dxa" w:w="1134"/>
           </w:tcPr>
           <w:p>
-            <w:r/>
-            <w:r>
-              <w:rPr>
-                <w:sz w:val="22"/>
+            <w:pPr>
+              <w:spacing w:after="0" w:line="240" w:lineRule="auto"/>
+              <w:ind w:firstLine="0"/>
+              <w:jc w:val="left"/>
+            </w:pPr>
+            <w:r/>
+            <w:r>
+              <w:rPr>
+                <w:sz w:val="20"/>
               </w:rPr>
               <w:t>+</w:t>
             </w:r>
@@ -602,10 +666,15 @@
             <w:tcW w:type="dxa" w:w="680"/>
           </w:tcPr>
           <w:p>
-            <w:r/>
-            <w:r>
-              <w:rPr>
-                <w:sz w:val="22"/>
+            <w:pPr>
+              <w:spacing w:after="0" w:line="240" w:lineRule="auto"/>
+              <w:ind w:firstLine="0"/>
+              <w:jc w:val="left"/>
+            </w:pPr>
+            <w:r/>
+            <w:r>
+              <w:rPr>
+                <w:sz w:val="20"/>
               </w:rPr>
               <w:t>3</w:t>
             </w:r>
@@ -616,10 +685,15 @@
             <w:tcW w:type="dxa" w:w="3969"/>
           </w:tcPr>
           <w:p>
-            <w:r/>
-            <w:r>
-              <w:rPr>
-                <w:sz w:val="22"/>
+            <w:pPr>
+              <w:spacing w:after="0" w:line="240" w:lineRule="auto"/>
+              <w:ind w:firstLine="0"/>
+              <w:jc w:val="left"/>
+            </w:pPr>
+            <w:r/>
+            <w:r>
+              <w:rPr>
+                <w:sz w:val="20"/>
               </w:rPr>
               <w:t>Бельская А.</w:t>
             </w:r>
@@ -630,10 +704,15 @@
             <w:tcW w:type="dxa" w:w="1134"/>
           </w:tcPr>
           <w:p>
-            <w:r/>
-            <w:r>
-              <w:rPr>
-                <w:sz w:val="22"/>
+            <w:pPr>
+              <w:spacing w:after="0" w:line="240" w:lineRule="auto"/>
+              <w:ind w:firstLine="0"/>
+              <w:jc w:val="left"/>
+            </w:pPr>
+            <w:r/>
+            <w:r>
+              <w:rPr>
+                <w:sz w:val="20"/>
               </w:rPr>
               <w:t>ж</w:t>
             </w:r>
@@ -644,10 +723,15 @@
             <w:tcW w:type="dxa" w:w="1134"/>
           </w:tcPr>
           <w:p>
-            <w:r/>
-            <w:r>
-              <w:rPr>
-                <w:sz w:val="22"/>
+            <w:pPr>
+              <w:spacing w:after="0" w:line="240" w:lineRule="auto"/>
+              <w:ind w:firstLine="0"/>
+              <w:jc w:val="left"/>
+            </w:pPr>
+            <w:r/>
+            <w:r>
+              <w:rPr>
+                <w:sz w:val="20"/>
               </w:rPr>
               <w:t>+</w:t>
             </w:r>
@@ -660,10 +744,15 @@
             <w:tcW w:type="dxa" w:w="680"/>
           </w:tcPr>
           <w:p>
-            <w:r/>
-            <w:r>
-              <w:rPr>
-                <w:sz w:val="22"/>
+            <w:pPr>
+              <w:spacing w:after="0" w:line="240" w:lineRule="auto"/>
+              <w:ind w:firstLine="0"/>
+              <w:jc w:val="left"/>
+            </w:pPr>
+            <w:r/>
+            <w:r>
+              <w:rPr>
+                <w:sz w:val="20"/>
               </w:rPr>
               <w:t>4</w:t>
             </w:r>
@@ -674,10 +763,15 @@
             <w:tcW w:type="dxa" w:w="3969"/>
           </w:tcPr>
           <w:p>
-            <w:r/>
-            <w:r>
-              <w:rPr>
-                <w:sz w:val="22"/>
+            <w:pPr>
+              <w:spacing w:after="0" w:line="240" w:lineRule="auto"/>
+              <w:ind w:firstLine="0"/>
+              <w:jc w:val="left"/>
+            </w:pPr>
+            <w:r/>
+            <w:r>
+              <w:rPr>
+                <w:sz w:val="20"/>
               </w:rPr>
               <w:t>Белявцева В.</w:t>
             </w:r>
@@ -688,10 +782,15 @@
             <w:tcW w:type="dxa" w:w="1134"/>
           </w:tcPr>
           <w:p>
-            <w:r/>
-            <w:r>
-              <w:rPr>
-                <w:sz w:val="22"/>
+            <w:pPr>
+              <w:spacing w:after="0" w:line="240" w:lineRule="auto"/>
+              <w:ind w:firstLine="0"/>
+              <w:jc w:val="left"/>
+            </w:pPr>
+            <w:r/>
+            <w:r>
+              <w:rPr>
+                <w:sz w:val="20"/>
               </w:rPr>
               <w:t>ж</w:t>
             </w:r>
@@ -702,10 +801,15 @@
             <w:tcW w:type="dxa" w:w="1134"/>
           </w:tcPr>
           <w:p>
-            <w:r/>
-            <w:r>
-              <w:rPr>
-                <w:sz w:val="22"/>
+            <w:pPr>
+              <w:spacing w:after="0" w:line="240" w:lineRule="auto"/>
+              <w:ind w:firstLine="0"/>
+              <w:jc w:val="left"/>
+            </w:pPr>
+            <w:r/>
+            <w:r>
+              <w:rPr>
+                <w:sz w:val="20"/>
               </w:rPr>
               <w:t>+</w:t>
             </w:r>
@@ -718,10 +822,15 @@
             <w:tcW w:type="dxa" w:w="680"/>
           </w:tcPr>
           <w:p>
-            <w:r/>
-            <w:r>
-              <w:rPr>
-                <w:sz w:val="22"/>
+            <w:pPr>
+              <w:spacing w:after="0" w:line="240" w:lineRule="auto"/>
+              <w:ind w:firstLine="0"/>
+              <w:jc w:val="left"/>
+            </w:pPr>
+            <w:r/>
+            <w:r>
+              <w:rPr>
+                <w:sz w:val="20"/>
               </w:rPr>
               <w:t>5</w:t>
             </w:r>
@@ -732,10 +841,15 @@
             <w:tcW w:type="dxa" w:w="3969"/>
           </w:tcPr>
           <w:p>
-            <w:r/>
-            <w:r>
-              <w:rPr>
-                <w:sz w:val="22"/>
+            <w:pPr>
+              <w:spacing w:after="0" w:line="240" w:lineRule="auto"/>
+              <w:ind w:firstLine="0"/>
+              <w:jc w:val="left"/>
+            </w:pPr>
+            <w:r/>
+            <w:r>
+              <w:rPr>
+                <w:sz w:val="20"/>
               </w:rPr>
               <w:t>Евдокимова З.</w:t>
             </w:r>
@@ -746,10 +860,15 @@
             <w:tcW w:type="dxa" w:w="1134"/>
           </w:tcPr>
           <w:p>
-            <w:r/>
-            <w:r>
-              <w:rPr>
-                <w:sz w:val="22"/>
+            <w:pPr>
+              <w:spacing w:after="0" w:line="240" w:lineRule="auto"/>
+              <w:ind w:firstLine="0"/>
+              <w:jc w:val="left"/>
+            </w:pPr>
+            <w:r/>
+            <w:r>
+              <w:rPr>
+                <w:sz w:val="20"/>
               </w:rPr>
               <w:t>ж</w:t>
             </w:r>
@@ -760,10 +879,15 @@
             <w:tcW w:type="dxa" w:w="1134"/>
           </w:tcPr>
           <w:p>
-            <w:r/>
-            <w:r>
-              <w:rPr>
-                <w:sz w:val="22"/>
+            <w:pPr>
+              <w:spacing w:after="0" w:line="240" w:lineRule="auto"/>
+              <w:ind w:firstLine="0"/>
+              <w:jc w:val="left"/>
+            </w:pPr>
+            <w:r/>
+            <w:r>
+              <w:rPr>
+                <w:sz w:val="20"/>
               </w:rPr>
               <w:t>+</w:t>
             </w:r>
@@ -776,10 +900,15 @@
             <w:tcW w:type="dxa" w:w="680"/>
           </w:tcPr>
           <w:p>
-            <w:r/>
-            <w:r>
-              <w:rPr>
-                <w:sz w:val="22"/>
+            <w:pPr>
+              <w:spacing w:after="0" w:line="240" w:lineRule="auto"/>
+              <w:ind w:firstLine="0"/>
+              <w:jc w:val="left"/>
+            </w:pPr>
+            <w:r/>
+            <w:r>
+              <w:rPr>
+                <w:sz w:val="20"/>
               </w:rPr>
               <w:t>6</w:t>
             </w:r>
@@ -790,10 +919,15 @@
             <w:tcW w:type="dxa" w:w="3969"/>
           </w:tcPr>
           <w:p>
-            <w:r/>
-            <w:r>
-              <w:rPr>
-                <w:sz w:val="22"/>
+            <w:pPr>
+              <w:spacing w:after="0" w:line="240" w:lineRule="auto"/>
+              <w:ind w:firstLine="0"/>
+              <w:jc w:val="left"/>
+            </w:pPr>
+            <w:r/>
+            <w:r>
+              <w:rPr>
+                <w:sz w:val="20"/>
               </w:rPr>
               <w:t>Карцев С.</w:t>
             </w:r>
@@ -804,10 +938,15 @@
             <w:tcW w:type="dxa" w:w="1134"/>
           </w:tcPr>
           <w:p>
-            <w:r/>
-            <w:r>
-              <w:rPr>
-                <w:sz w:val="22"/>
+            <w:pPr>
+              <w:spacing w:after="0" w:line="240" w:lineRule="auto"/>
+              <w:ind w:firstLine="0"/>
+              <w:jc w:val="left"/>
+            </w:pPr>
+            <w:r/>
+            <w:r>
+              <w:rPr>
+                <w:sz w:val="20"/>
               </w:rPr>
               <w:t>м</w:t>
             </w:r>
@@ -818,10 +957,15 @@
             <w:tcW w:type="dxa" w:w="1134"/>
           </w:tcPr>
           <w:p>
-            <w:r/>
-            <w:r>
-              <w:rPr>
-                <w:sz w:val="22"/>
+            <w:pPr>
+              <w:spacing w:after="0" w:line="240" w:lineRule="auto"/>
+              <w:ind w:firstLine="0"/>
+              <w:jc w:val="left"/>
+            </w:pPr>
+            <w:r/>
+            <w:r>
+              <w:rPr>
+                <w:sz w:val="20"/>
               </w:rPr>
               <w:t>+</w:t>
             </w:r>
@@ -834,10 +978,15 @@
             <w:tcW w:type="dxa" w:w="680"/>
           </w:tcPr>
           <w:p>
-            <w:r/>
-            <w:r>
-              <w:rPr>
-                <w:sz w:val="22"/>
+            <w:pPr>
+              <w:spacing w:after="0" w:line="240" w:lineRule="auto"/>
+              <w:ind w:firstLine="0"/>
+              <w:jc w:val="left"/>
+            </w:pPr>
+            <w:r/>
+            <w:r>
+              <w:rPr>
+                <w:sz w:val="20"/>
               </w:rPr>
               <w:t>7</w:t>
             </w:r>
@@ -848,10 +997,15 @@
             <w:tcW w:type="dxa" w:w="3969"/>
           </w:tcPr>
           <w:p>
-            <w:r/>
-            <w:r>
-              <w:rPr>
-                <w:sz w:val="22"/>
+            <w:pPr>
+              <w:spacing w:after="0" w:line="240" w:lineRule="auto"/>
+              <w:ind w:firstLine="0"/>
+              <w:jc w:val="left"/>
+            </w:pPr>
+            <w:r/>
+            <w:r>
+              <w:rPr>
+                <w:sz w:val="20"/>
               </w:rPr>
               <w:t>Кирьянова Е.</w:t>
             </w:r>
@@ -862,10 +1016,15 @@
             <w:tcW w:type="dxa" w:w="1134"/>
           </w:tcPr>
           <w:p>
-            <w:r/>
-            <w:r>
-              <w:rPr>
-                <w:sz w:val="22"/>
+            <w:pPr>
+              <w:spacing w:after="0" w:line="240" w:lineRule="auto"/>
+              <w:ind w:firstLine="0"/>
+              <w:jc w:val="left"/>
+            </w:pPr>
+            <w:r/>
+            <w:r>
+              <w:rPr>
+                <w:sz w:val="20"/>
               </w:rPr>
               <w:t>ж</w:t>
             </w:r>
@@ -876,10 +1035,15 @@
             <w:tcW w:type="dxa" w:w="1134"/>
           </w:tcPr>
           <w:p>
-            <w:r/>
-            <w:r>
-              <w:rPr>
-                <w:sz w:val="22"/>
+            <w:pPr>
+              <w:spacing w:after="0" w:line="240" w:lineRule="auto"/>
+              <w:ind w:firstLine="0"/>
+              <w:jc w:val="left"/>
+            </w:pPr>
+            <w:r/>
+            <w:r>
+              <w:rPr>
+                <w:sz w:val="20"/>
               </w:rPr>
               <w:t>+</w:t>
             </w:r>
@@ -892,10 +1056,15 @@
             <w:tcW w:type="dxa" w:w="680"/>
           </w:tcPr>
           <w:p>
-            <w:r/>
-            <w:r>
-              <w:rPr>
-                <w:sz w:val="22"/>
+            <w:pPr>
+              <w:spacing w:after="0" w:line="240" w:lineRule="auto"/>
+              <w:ind w:firstLine="0"/>
+              <w:jc w:val="left"/>
+            </w:pPr>
+            <w:r/>
+            <w:r>
+              <w:rPr>
+                <w:sz w:val="20"/>
               </w:rPr>
               <w:t>8</w:t>
             </w:r>
@@ -906,10 +1075,15 @@
             <w:tcW w:type="dxa" w:w="3969"/>
           </w:tcPr>
           <w:p>
-            <w:r/>
-            <w:r>
-              <w:rPr>
-                <w:sz w:val="22"/>
+            <w:pPr>
+              <w:spacing w:after="0" w:line="240" w:lineRule="auto"/>
+              <w:ind w:firstLine="0"/>
+              <w:jc w:val="left"/>
+            </w:pPr>
+            <w:r/>
+            <w:r>
+              <w:rPr>
+                <w:sz w:val="20"/>
               </w:rPr>
               <w:t>Колчин М.</w:t>
             </w:r>
@@ -920,10 +1094,15 @@
             <w:tcW w:type="dxa" w:w="1134"/>
           </w:tcPr>
           <w:p>
-            <w:r/>
-            <w:r>
-              <w:rPr>
-                <w:sz w:val="22"/>
+            <w:pPr>
+              <w:spacing w:after="0" w:line="240" w:lineRule="auto"/>
+              <w:ind w:firstLine="0"/>
+              <w:jc w:val="left"/>
+            </w:pPr>
+            <w:r/>
+            <w:r>
+              <w:rPr>
+                <w:sz w:val="20"/>
               </w:rPr>
               <w:t>м</w:t>
             </w:r>
@@ -934,10 +1113,15 @@
             <w:tcW w:type="dxa" w:w="1134"/>
           </w:tcPr>
           <w:p>
-            <w:r/>
-            <w:r>
-              <w:rPr>
-                <w:sz w:val="22"/>
+            <w:pPr>
+              <w:spacing w:after="0" w:line="240" w:lineRule="auto"/>
+              <w:ind w:firstLine="0"/>
+              <w:jc w:val="left"/>
+            </w:pPr>
+            <w:r/>
+            <w:r>
+              <w:rPr>
+                <w:sz w:val="20"/>
               </w:rPr>
               <w:t>+</w:t>
             </w:r>
@@ -950,10 +1134,15 @@
             <w:tcW w:type="dxa" w:w="680"/>
           </w:tcPr>
           <w:p>
-            <w:r/>
-            <w:r>
-              <w:rPr>
-                <w:sz w:val="22"/>
+            <w:pPr>
+              <w:spacing w:after="0" w:line="240" w:lineRule="auto"/>
+              <w:ind w:firstLine="0"/>
+              <w:jc w:val="left"/>
+            </w:pPr>
+            <w:r/>
+            <w:r>
+              <w:rPr>
+                <w:sz w:val="20"/>
               </w:rPr>
               <w:t>9</w:t>
             </w:r>
@@ -964,10 +1153,15 @@
             <w:tcW w:type="dxa" w:w="3969"/>
           </w:tcPr>
           <w:p>
-            <w:r/>
-            <w:r>
-              <w:rPr>
-                <w:sz w:val="22"/>
+            <w:pPr>
+              <w:spacing w:after="0" w:line="240" w:lineRule="auto"/>
+              <w:ind w:firstLine="0"/>
+              <w:jc w:val="left"/>
+            </w:pPr>
+            <w:r/>
+            <w:r>
+              <w:rPr>
+                <w:sz w:val="20"/>
               </w:rPr>
               <w:t>Колчина В.</w:t>
             </w:r>
@@ -978,10 +1172,15 @@
             <w:tcW w:type="dxa" w:w="1134"/>
           </w:tcPr>
           <w:p>
-            <w:r/>
-            <w:r>
-              <w:rPr>
-                <w:sz w:val="22"/>
+            <w:pPr>
+              <w:spacing w:after="0" w:line="240" w:lineRule="auto"/>
+              <w:ind w:firstLine="0"/>
+              <w:jc w:val="left"/>
+            </w:pPr>
+            <w:r/>
+            <w:r>
+              <w:rPr>
+                <w:sz w:val="20"/>
               </w:rPr>
               <w:t>ж</w:t>
             </w:r>
@@ -992,10 +1191,15 @@
             <w:tcW w:type="dxa" w:w="1134"/>
           </w:tcPr>
           <w:p>
-            <w:r/>
-            <w:r>
-              <w:rPr>
-                <w:sz w:val="22"/>
+            <w:pPr>
+              <w:spacing w:after="0" w:line="240" w:lineRule="auto"/>
+              <w:ind w:firstLine="0"/>
+              <w:jc w:val="left"/>
+            </w:pPr>
+            <w:r/>
+            <w:r>
+              <w:rPr>
+                <w:sz w:val="20"/>
               </w:rPr>
               <w:t>+</w:t>
             </w:r>
@@ -1008,10 +1212,15 @@
             <w:tcW w:type="dxa" w:w="680"/>
           </w:tcPr>
           <w:p>
-            <w:r/>
-            <w:r>
-              <w:rPr>
-                <w:sz w:val="22"/>
+            <w:pPr>
+              <w:spacing w:after="0" w:line="240" w:lineRule="auto"/>
+              <w:ind w:firstLine="0"/>
+              <w:jc w:val="left"/>
+            </w:pPr>
+            <w:r/>
+            <w:r>
+              <w:rPr>
+                <w:sz w:val="20"/>
               </w:rPr>
               <w:t>10</w:t>
             </w:r>
@@ -1022,10 +1231,15 @@
             <w:tcW w:type="dxa" w:w="3969"/>
           </w:tcPr>
           <w:p>
-            <w:r/>
-            <w:r>
-              <w:rPr>
-                <w:sz w:val="22"/>
+            <w:pPr>
+              <w:spacing w:after="0" w:line="240" w:lineRule="auto"/>
+              <w:ind w:firstLine="0"/>
+              <w:jc w:val="left"/>
+            </w:pPr>
+            <w:r/>
+            <w:r>
+              <w:rPr>
+                <w:sz w:val="20"/>
               </w:rPr>
               <w:t>Кораблинова А.</w:t>
             </w:r>
@@ -1036,10 +1250,15 @@
             <w:tcW w:type="dxa" w:w="1134"/>
           </w:tcPr>
           <w:p>
-            <w:r/>
-            <w:r>
-              <w:rPr>
-                <w:sz w:val="22"/>
+            <w:pPr>
+              <w:spacing w:after="0" w:line="240" w:lineRule="auto"/>
+              <w:ind w:firstLine="0"/>
+              <w:jc w:val="left"/>
+            </w:pPr>
+            <w:r/>
+            <w:r>
+              <w:rPr>
+                <w:sz w:val="20"/>
               </w:rPr>
               <w:t>ж</w:t>
             </w:r>
@@ -1050,10 +1269,15 @@
             <w:tcW w:type="dxa" w:w="1134"/>
           </w:tcPr>
           <w:p>
-            <w:r/>
-            <w:r>
-              <w:rPr>
-                <w:sz w:val="22"/>
+            <w:pPr>
+              <w:spacing w:after="0" w:line="240" w:lineRule="auto"/>
+              <w:ind w:firstLine="0"/>
+              <w:jc w:val="left"/>
+            </w:pPr>
+            <w:r/>
+            <w:r>
+              <w:rPr>
+                <w:sz w:val="20"/>
               </w:rPr>
               <w:t>+</w:t>
             </w:r>
@@ -1066,10 +1290,15 @@
             <w:tcW w:type="dxa" w:w="680"/>
           </w:tcPr>
           <w:p>
-            <w:r/>
-            <w:r>
-              <w:rPr>
-                <w:sz w:val="22"/>
+            <w:pPr>
+              <w:spacing w:after="0" w:line="240" w:lineRule="auto"/>
+              <w:ind w:firstLine="0"/>
+              <w:jc w:val="left"/>
+            </w:pPr>
+            <w:r/>
+            <w:r>
+              <w:rPr>
+                <w:sz w:val="20"/>
               </w:rPr>
               <w:t>11</w:t>
             </w:r>
@@ -1080,10 +1309,15 @@
             <w:tcW w:type="dxa" w:w="3969"/>
           </w:tcPr>
           <w:p>
-            <w:r/>
-            <w:r>
-              <w:rPr>
-                <w:sz w:val="22"/>
+            <w:pPr>
+              <w:spacing w:after="0" w:line="240" w:lineRule="auto"/>
+              <w:ind w:firstLine="0"/>
+              <w:jc w:val="left"/>
+            </w:pPr>
+            <w:r/>
+            <w:r>
+              <w:rPr>
+                <w:sz w:val="20"/>
               </w:rPr>
               <w:t>Костров</w:t>
             </w:r>
@@ -1094,10 +1328,15 @@
             <w:tcW w:type="dxa" w:w="1134"/>
           </w:tcPr>
           <w:p>
-            <w:r/>
-            <w:r>
-              <w:rPr>
-                <w:sz w:val="22"/>
+            <w:pPr>
+              <w:spacing w:after="0" w:line="240" w:lineRule="auto"/>
+              <w:ind w:firstLine="0"/>
+              <w:jc w:val="left"/>
+            </w:pPr>
+            <w:r/>
+            <w:r>
+              <w:rPr>
+                <w:sz w:val="20"/>
               </w:rPr>
               <w:t>м</w:t>
             </w:r>
@@ -1108,10 +1347,15 @@
             <w:tcW w:type="dxa" w:w="1134"/>
           </w:tcPr>
           <w:p>
-            <w:r/>
-            <w:r>
-              <w:rPr>
-                <w:sz w:val="22"/>
+            <w:pPr>
+              <w:spacing w:after="0" w:line="240" w:lineRule="auto"/>
+              <w:ind w:firstLine="0"/>
+              <w:jc w:val="left"/>
+            </w:pPr>
+            <w:r/>
+            <w:r>
+              <w:rPr>
+                <w:sz w:val="20"/>
               </w:rPr>
               <w:t>—</w:t>
             </w:r>
@@ -1124,10 +1368,15 @@
             <w:tcW w:type="dxa" w:w="680"/>
           </w:tcPr>
           <w:p>
-            <w:r/>
-            <w:r>
-              <w:rPr>
-                <w:sz w:val="22"/>
+            <w:pPr>
+              <w:spacing w:after="0" w:line="240" w:lineRule="auto"/>
+              <w:ind w:firstLine="0"/>
+              <w:jc w:val="left"/>
+            </w:pPr>
+            <w:r/>
+            <w:r>
+              <w:rPr>
+                <w:sz w:val="20"/>
               </w:rPr>
               <w:t>12</w:t>
             </w:r>
@@ -1138,10 +1387,15 @@
             <w:tcW w:type="dxa" w:w="3969"/>
           </w:tcPr>
           <w:p>
-            <w:r/>
-            <w:r>
-              <w:rPr>
-                <w:sz w:val="22"/>
+            <w:pPr>
+              <w:spacing w:after="0" w:line="240" w:lineRule="auto"/>
+              <w:ind w:firstLine="0"/>
+              <w:jc w:val="left"/>
+            </w:pPr>
+            <w:r/>
+            <w:r>
+              <w:rPr>
+                <w:sz w:val="20"/>
               </w:rPr>
               <w:t>Лубошева М.</w:t>
             </w:r>
@@ -1152,10 +1406,15 @@
             <w:tcW w:type="dxa" w:w="1134"/>
           </w:tcPr>
           <w:p>
-            <w:r/>
-            <w:r>
-              <w:rPr>
-                <w:sz w:val="22"/>
+            <w:pPr>
+              <w:spacing w:after="0" w:line="240" w:lineRule="auto"/>
+              <w:ind w:firstLine="0"/>
+              <w:jc w:val="left"/>
+            </w:pPr>
+            <w:r/>
+            <w:r>
+              <w:rPr>
+                <w:sz w:val="20"/>
               </w:rPr>
               <w:t>ж</w:t>
             </w:r>
@@ -1166,10 +1425,15 @@
             <w:tcW w:type="dxa" w:w="1134"/>
           </w:tcPr>
           <w:p>
-            <w:r/>
-            <w:r>
-              <w:rPr>
-                <w:sz w:val="22"/>
+            <w:pPr>
+              <w:spacing w:after="0" w:line="240" w:lineRule="auto"/>
+              <w:ind w:firstLine="0"/>
+              <w:jc w:val="left"/>
+            </w:pPr>
+            <w:r/>
+            <w:r>
+              <w:rPr>
+                <w:sz w:val="20"/>
               </w:rPr>
               <w:t>+</w:t>
             </w:r>
@@ -1182,10 +1446,15 @@
             <w:tcW w:type="dxa" w:w="680"/>
           </w:tcPr>
           <w:p>
-            <w:r/>
-            <w:r>
-              <w:rPr>
-                <w:sz w:val="22"/>
+            <w:pPr>
+              <w:spacing w:after="0" w:line="240" w:lineRule="auto"/>
+              <w:ind w:firstLine="0"/>
+              <w:jc w:val="left"/>
+            </w:pPr>
+            <w:r/>
+            <w:r>
+              <w:rPr>
+                <w:sz w:val="20"/>
               </w:rPr>
               <w:t>13</w:t>
             </w:r>
@@ -1196,10 +1465,15 @@
             <w:tcW w:type="dxa" w:w="3969"/>
           </w:tcPr>
           <w:p>
-            <w:r/>
-            <w:r>
-              <w:rPr>
-                <w:sz w:val="22"/>
+            <w:pPr>
+              <w:spacing w:after="0" w:line="240" w:lineRule="auto"/>
+              <w:ind w:firstLine="0"/>
+              <w:jc w:val="left"/>
+            </w:pPr>
+            <w:r/>
+            <w:r>
+              <w:rPr>
+                <w:sz w:val="20"/>
               </w:rPr>
               <w:t>Марчукова М.</w:t>
             </w:r>
@@ -1210,10 +1484,15 @@
             <w:tcW w:type="dxa" w:w="1134"/>
           </w:tcPr>
           <w:p>
-            <w:r/>
-            <w:r>
-              <w:rPr>
-                <w:sz w:val="22"/>
+            <w:pPr>
+              <w:spacing w:after="0" w:line="240" w:lineRule="auto"/>
+              <w:ind w:firstLine="0"/>
+              <w:jc w:val="left"/>
+            </w:pPr>
+            <w:r/>
+            <w:r>
+              <w:rPr>
+                <w:sz w:val="20"/>
               </w:rPr>
               <w:t>ж</w:t>
             </w:r>
@@ -1224,10 +1503,15 @@
             <w:tcW w:type="dxa" w:w="1134"/>
           </w:tcPr>
           <w:p>
-            <w:r/>
-            <w:r>
-              <w:rPr>
-                <w:sz w:val="22"/>
+            <w:pPr>
+              <w:spacing w:after="0" w:line="240" w:lineRule="auto"/>
+              <w:ind w:firstLine="0"/>
+              <w:jc w:val="left"/>
+            </w:pPr>
+            <w:r/>
+            <w:r>
+              <w:rPr>
+                <w:sz w:val="20"/>
               </w:rPr>
               <w:t>+</w:t>
             </w:r>
@@ -1240,10 +1524,15 @@
             <w:tcW w:type="dxa" w:w="680"/>
           </w:tcPr>
           <w:p>
-            <w:r/>
-            <w:r>
-              <w:rPr>
-                <w:sz w:val="22"/>
+            <w:pPr>
+              <w:spacing w:after="0" w:line="240" w:lineRule="auto"/>
+              <w:ind w:firstLine="0"/>
+              <w:jc w:val="left"/>
+            </w:pPr>
+            <w:r/>
+            <w:r>
+              <w:rPr>
+                <w:sz w:val="20"/>
               </w:rPr>
               <w:t>14</w:t>
             </w:r>
@@ -1254,10 +1543,15 @@
             <w:tcW w:type="dxa" w:w="3969"/>
           </w:tcPr>
           <w:p>
-            <w:r/>
-            <w:r>
-              <w:rPr>
-                <w:sz w:val="22"/>
+            <w:pPr>
+              <w:spacing w:after="0" w:line="240" w:lineRule="auto"/>
+              <w:ind w:firstLine="0"/>
+              <w:jc w:val="left"/>
+            </w:pPr>
+            <w:r/>
+            <w:r>
+              <w:rPr>
+                <w:sz w:val="20"/>
               </w:rPr>
               <w:t>Мастеренко А.</w:t>
             </w:r>
@@ -1268,10 +1562,15 @@
             <w:tcW w:type="dxa" w:w="1134"/>
           </w:tcPr>
           <w:p>
-            <w:r/>
-            <w:r>
-              <w:rPr>
-                <w:sz w:val="22"/>
+            <w:pPr>
+              <w:spacing w:after="0" w:line="240" w:lineRule="auto"/>
+              <w:ind w:firstLine="0"/>
+              <w:jc w:val="left"/>
+            </w:pPr>
+            <w:r/>
+            <w:r>
+              <w:rPr>
+                <w:sz w:val="20"/>
               </w:rPr>
               <w:t>ж</w:t>
             </w:r>
@@ -1282,10 +1581,15 @@
             <w:tcW w:type="dxa" w:w="1134"/>
           </w:tcPr>
           <w:p>
-            <w:r/>
-            <w:r>
-              <w:rPr>
-                <w:sz w:val="22"/>
+            <w:pPr>
+              <w:spacing w:after="0" w:line="240" w:lineRule="auto"/>
+              <w:ind w:firstLine="0"/>
+              <w:jc w:val="left"/>
+            </w:pPr>
+            <w:r/>
+            <w:r>
+              <w:rPr>
+                <w:sz w:val="20"/>
               </w:rPr>
               <w:t>+</w:t>
             </w:r>
@@ -1298,10 +1602,15 @@
             <w:tcW w:type="dxa" w:w="680"/>
           </w:tcPr>
           <w:p>
-            <w:r/>
-            <w:r>
-              <w:rPr>
-                <w:sz w:val="22"/>
+            <w:pPr>
+              <w:spacing w:after="0" w:line="240" w:lineRule="auto"/>
+              <w:ind w:firstLine="0"/>
+              <w:jc w:val="left"/>
+            </w:pPr>
+            <w:r/>
+            <w:r>
+              <w:rPr>
+                <w:sz w:val="20"/>
               </w:rPr>
               <w:t>15</w:t>
             </w:r>
@@ -1312,10 +1621,15 @@
             <w:tcW w:type="dxa" w:w="3969"/>
           </w:tcPr>
           <w:p>
-            <w:r/>
-            <w:r>
-              <w:rPr>
-                <w:sz w:val="22"/>
+            <w:pPr>
+              <w:spacing w:after="0" w:line="240" w:lineRule="auto"/>
+              <w:ind w:firstLine="0"/>
+              <w:jc w:val="left"/>
+            </w:pPr>
+            <w:r/>
+            <w:r>
+              <w:rPr>
+                <w:sz w:val="20"/>
               </w:rPr>
               <w:t>Машкина</w:t>
             </w:r>
@@ -1326,10 +1640,15 @@
             <w:tcW w:type="dxa" w:w="1134"/>
           </w:tcPr>
           <w:p>
-            <w:r/>
-            <w:r>
-              <w:rPr>
-                <w:sz w:val="22"/>
+            <w:pPr>
+              <w:spacing w:after="0" w:line="240" w:lineRule="auto"/>
+              <w:ind w:firstLine="0"/>
+              <w:jc w:val="left"/>
+            </w:pPr>
+            <w:r/>
+            <w:r>
+              <w:rPr>
+                <w:sz w:val="20"/>
               </w:rPr>
               <w:t>ж</w:t>
             </w:r>
@@ -1340,10 +1659,15 @@
             <w:tcW w:type="dxa" w:w="1134"/>
           </w:tcPr>
           <w:p>
-            <w:r/>
-            <w:r>
-              <w:rPr>
-                <w:sz w:val="22"/>
+            <w:pPr>
+              <w:spacing w:after="0" w:line="240" w:lineRule="auto"/>
+              <w:ind w:firstLine="0"/>
+              <w:jc w:val="left"/>
+            </w:pPr>
+            <w:r/>
+            <w:r>
+              <w:rPr>
+                <w:sz w:val="20"/>
               </w:rPr>
               <w:t>—</w:t>
             </w:r>
@@ -1356,10 +1680,15 @@
             <w:tcW w:type="dxa" w:w="680"/>
           </w:tcPr>
           <w:p>
-            <w:r/>
-            <w:r>
-              <w:rPr>
-                <w:sz w:val="22"/>
+            <w:pPr>
+              <w:spacing w:after="0" w:line="240" w:lineRule="auto"/>
+              <w:ind w:firstLine="0"/>
+              <w:jc w:val="left"/>
+            </w:pPr>
+            <w:r/>
+            <w:r>
+              <w:rPr>
+                <w:sz w:val="20"/>
               </w:rPr>
               <w:t>16</w:t>
             </w:r>
@@ -1370,10 +1699,15 @@
             <w:tcW w:type="dxa" w:w="3969"/>
           </w:tcPr>
           <w:p>
-            <w:r/>
-            <w:r>
-              <w:rPr>
-                <w:sz w:val="22"/>
+            <w:pPr>
+              <w:spacing w:after="0" w:line="240" w:lineRule="auto"/>
+              <w:ind w:firstLine="0"/>
+              <w:jc w:val="left"/>
+            </w:pPr>
+            <w:r/>
+            <w:r>
+              <w:rPr>
+                <w:sz w:val="20"/>
               </w:rPr>
               <w:t>Нестеренко К.</w:t>
             </w:r>
@@ -1384,10 +1718,15 @@
             <w:tcW w:type="dxa" w:w="1134"/>
           </w:tcPr>
           <w:p>
-            <w:r/>
-            <w:r>
-              <w:rPr>
-                <w:sz w:val="22"/>
+            <w:pPr>
+              <w:spacing w:after="0" w:line="240" w:lineRule="auto"/>
+              <w:ind w:firstLine="0"/>
+              <w:jc w:val="left"/>
+            </w:pPr>
+            <w:r/>
+            <w:r>
+              <w:rPr>
+                <w:sz w:val="20"/>
               </w:rPr>
               <w:t>м</w:t>
             </w:r>
@@ -1398,10 +1737,15 @@
             <w:tcW w:type="dxa" w:w="1134"/>
           </w:tcPr>
           <w:p>
-            <w:r/>
-            <w:r>
-              <w:rPr>
-                <w:sz w:val="22"/>
+            <w:pPr>
+              <w:spacing w:after="0" w:line="240" w:lineRule="auto"/>
+              <w:ind w:firstLine="0"/>
+              <w:jc w:val="left"/>
+            </w:pPr>
+            <w:r/>
+            <w:r>
+              <w:rPr>
+                <w:sz w:val="20"/>
               </w:rPr>
               <w:t>+</w:t>
             </w:r>
@@ -1414,10 +1758,15 @@
             <w:tcW w:type="dxa" w:w="680"/>
           </w:tcPr>
           <w:p>
-            <w:r/>
-            <w:r>
-              <w:rPr>
-                <w:sz w:val="22"/>
+            <w:pPr>
+              <w:spacing w:after="0" w:line="240" w:lineRule="auto"/>
+              <w:ind w:firstLine="0"/>
+              <w:jc w:val="left"/>
+            </w:pPr>
+            <w:r/>
+            <w:r>
+              <w:rPr>
+                <w:sz w:val="20"/>
               </w:rPr>
               <w:t>17</w:t>
             </w:r>
@@ -1428,10 +1777,15 @@
             <w:tcW w:type="dxa" w:w="3969"/>
           </w:tcPr>
           <w:p>
-            <w:r/>
-            <w:r>
-              <w:rPr>
-                <w:sz w:val="22"/>
+            <w:pPr>
+              <w:spacing w:after="0" w:line="240" w:lineRule="auto"/>
+              <w:ind w:firstLine="0"/>
+              <w:jc w:val="left"/>
+            </w:pPr>
+            <w:r/>
+            <w:r>
+              <w:rPr>
+                <w:sz w:val="20"/>
               </w:rPr>
               <w:t>Новиков М.</w:t>
             </w:r>
@@ -1442,10 +1796,15 @@
             <w:tcW w:type="dxa" w:w="1134"/>
           </w:tcPr>
           <w:p>
-            <w:r/>
-            <w:r>
-              <w:rPr>
-                <w:sz w:val="22"/>
+            <w:pPr>
+              <w:spacing w:after="0" w:line="240" w:lineRule="auto"/>
+              <w:ind w:firstLine="0"/>
+              <w:jc w:val="left"/>
+            </w:pPr>
+            <w:r/>
+            <w:r>
+              <w:rPr>
+                <w:sz w:val="20"/>
               </w:rPr>
               <w:t>м</w:t>
             </w:r>
@@ -1456,10 +1815,15 @@
             <w:tcW w:type="dxa" w:w="1134"/>
           </w:tcPr>
           <w:p>
-            <w:r/>
-            <w:r>
-              <w:rPr>
-                <w:sz w:val="22"/>
+            <w:pPr>
+              <w:spacing w:after="0" w:line="240" w:lineRule="auto"/>
+              <w:ind w:firstLine="0"/>
+              <w:jc w:val="left"/>
+            </w:pPr>
+            <w:r/>
+            <w:r>
+              <w:rPr>
+                <w:sz w:val="20"/>
               </w:rPr>
               <w:t>+</w:t>
             </w:r>
@@ -1472,10 +1836,15 @@
             <w:tcW w:type="dxa" w:w="680"/>
           </w:tcPr>
           <w:p>
-            <w:r/>
-            <w:r>
-              <w:rPr>
-                <w:sz w:val="22"/>
+            <w:pPr>
+              <w:spacing w:after="0" w:line="240" w:lineRule="auto"/>
+              <w:ind w:firstLine="0"/>
+              <w:jc w:val="left"/>
+            </w:pPr>
+            <w:r/>
+            <w:r>
+              <w:rPr>
+                <w:sz w:val="20"/>
               </w:rPr>
               <w:t>18</w:t>
             </w:r>
@@ -1486,10 +1855,15 @@
             <w:tcW w:type="dxa" w:w="3969"/>
           </w:tcPr>
           <w:p>
-            <w:r/>
-            <w:r>
-              <w:rPr>
-                <w:sz w:val="22"/>
+            <w:pPr>
+              <w:spacing w:after="0" w:line="240" w:lineRule="auto"/>
+              <w:ind w:firstLine="0"/>
+              <w:jc w:val="left"/>
+            </w:pPr>
+            <w:r/>
+            <w:r>
+              <w:rPr>
+                <w:sz w:val="20"/>
               </w:rPr>
               <w:t>Поливаев М.</w:t>
             </w:r>
@@ -1500,10 +1874,15 @@
             <w:tcW w:type="dxa" w:w="1134"/>
           </w:tcPr>
           <w:p>
-            <w:r/>
-            <w:r>
-              <w:rPr>
-                <w:sz w:val="22"/>
+            <w:pPr>
+              <w:spacing w:after="0" w:line="240" w:lineRule="auto"/>
+              <w:ind w:firstLine="0"/>
+              <w:jc w:val="left"/>
+            </w:pPr>
+            <w:r/>
+            <w:r>
+              <w:rPr>
+                <w:sz w:val="20"/>
               </w:rPr>
               <w:t>м</w:t>
             </w:r>
@@ -1514,10 +1893,15 @@
             <w:tcW w:type="dxa" w:w="1134"/>
           </w:tcPr>
           <w:p>
-            <w:r/>
-            <w:r>
-              <w:rPr>
-                <w:sz w:val="22"/>
+            <w:pPr>
+              <w:spacing w:after="0" w:line="240" w:lineRule="auto"/>
+              <w:ind w:firstLine="0"/>
+              <w:jc w:val="left"/>
+            </w:pPr>
+            <w:r/>
+            <w:r>
+              <w:rPr>
+                <w:sz w:val="20"/>
               </w:rPr>
               <w:t>+</w:t>
             </w:r>
@@ -1530,10 +1914,15 @@
             <w:tcW w:type="dxa" w:w="680"/>
           </w:tcPr>
           <w:p>
-            <w:r/>
-            <w:r>
-              <w:rPr>
-                <w:sz w:val="22"/>
+            <w:pPr>
+              <w:spacing w:after="0" w:line="240" w:lineRule="auto"/>
+              <w:ind w:firstLine="0"/>
+              <w:jc w:val="left"/>
+            </w:pPr>
+            <w:r/>
+            <w:r>
+              <w:rPr>
+                <w:sz w:val="20"/>
               </w:rPr>
               <w:t>19</w:t>
             </w:r>
@@ -1544,10 +1933,15 @@
             <w:tcW w:type="dxa" w:w="3969"/>
           </w:tcPr>
           <w:p>
-            <w:r/>
-            <w:r>
-              <w:rPr>
-                <w:sz w:val="22"/>
+            <w:pPr>
+              <w:spacing w:after="0" w:line="240" w:lineRule="auto"/>
+              <w:ind w:firstLine="0"/>
+              <w:jc w:val="left"/>
+            </w:pPr>
+            <w:r/>
+            <w:r>
+              <w:rPr>
+                <w:sz w:val="20"/>
               </w:rPr>
               <w:t>Разумный Е.</w:t>
             </w:r>
@@ -1558,10 +1952,15 @@
             <w:tcW w:type="dxa" w:w="1134"/>
           </w:tcPr>
           <w:p>
-            <w:r/>
-            <w:r>
-              <w:rPr>
-                <w:sz w:val="22"/>
+            <w:pPr>
+              <w:spacing w:after="0" w:line="240" w:lineRule="auto"/>
+              <w:ind w:firstLine="0"/>
+              <w:jc w:val="left"/>
+            </w:pPr>
+            <w:r/>
+            <w:r>
+              <w:rPr>
+                <w:sz w:val="20"/>
               </w:rPr>
               <w:t>м</w:t>
             </w:r>
@@ -1572,10 +1971,15 @@
             <w:tcW w:type="dxa" w:w="1134"/>
           </w:tcPr>
           <w:p>
-            <w:r/>
-            <w:r>
-              <w:rPr>
-                <w:sz w:val="22"/>
+            <w:pPr>
+              <w:spacing w:after="0" w:line="240" w:lineRule="auto"/>
+              <w:ind w:firstLine="0"/>
+              <w:jc w:val="left"/>
+            </w:pPr>
+            <w:r/>
+            <w:r>
+              <w:rPr>
+                <w:sz w:val="20"/>
               </w:rPr>
               <w:t>+</w:t>
             </w:r>
@@ -1588,10 +1992,15 @@
             <w:tcW w:type="dxa" w:w="680"/>
           </w:tcPr>
           <w:p>
-            <w:r/>
-            <w:r>
-              <w:rPr>
-                <w:sz w:val="22"/>
+            <w:pPr>
+              <w:spacing w:after="0" w:line="240" w:lineRule="auto"/>
+              <w:ind w:firstLine="0"/>
+              <w:jc w:val="left"/>
+            </w:pPr>
+            <w:r/>
+            <w:r>
+              <w:rPr>
+                <w:sz w:val="20"/>
               </w:rPr>
               <w:t>20</w:t>
             </w:r>
@@ -1602,10 +2011,15 @@
             <w:tcW w:type="dxa" w:w="3969"/>
           </w:tcPr>
           <w:p>
-            <w:r/>
-            <w:r>
-              <w:rPr>
-                <w:sz w:val="22"/>
+            <w:pPr>
+              <w:spacing w:after="0" w:line="240" w:lineRule="auto"/>
+              <w:ind w:firstLine="0"/>
+              <w:jc w:val="left"/>
+            </w:pPr>
+            <w:r/>
+            <w:r>
+              <w:rPr>
+                <w:sz w:val="20"/>
               </w:rPr>
               <w:t>Рягузов М.</w:t>
             </w:r>
@@ -1616,10 +2030,15 @@
             <w:tcW w:type="dxa" w:w="1134"/>
           </w:tcPr>
           <w:p>
-            <w:r/>
-            <w:r>
-              <w:rPr>
-                <w:sz w:val="22"/>
+            <w:pPr>
+              <w:spacing w:after="0" w:line="240" w:lineRule="auto"/>
+              <w:ind w:firstLine="0"/>
+              <w:jc w:val="left"/>
+            </w:pPr>
+            <w:r/>
+            <w:r>
+              <w:rPr>
+                <w:sz w:val="20"/>
               </w:rPr>
               <w:t>м</w:t>
             </w:r>
@@ -1630,10 +2049,15 @@
             <w:tcW w:type="dxa" w:w="1134"/>
           </w:tcPr>
           <w:p>
-            <w:r/>
-            <w:r>
-              <w:rPr>
-                <w:sz w:val="22"/>
+            <w:pPr>
+              <w:spacing w:after="0" w:line="240" w:lineRule="auto"/>
+              <w:ind w:firstLine="0"/>
+              <w:jc w:val="left"/>
+            </w:pPr>
+            <w:r/>
+            <w:r>
+              <w:rPr>
+                <w:sz w:val="20"/>
               </w:rPr>
               <w:t>+</w:t>
             </w:r>
@@ -1646,10 +2070,15 @@
             <w:tcW w:type="dxa" w:w="680"/>
           </w:tcPr>
           <w:p>
-            <w:r/>
-            <w:r>
-              <w:rPr>
-                <w:sz w:val="22"/>
+            <w:pPr>
+              <w:spacing w:after="0" w:line="240" w:lineRule="auto"/>
+              <w:ind w:firstLine="0"/>
+              <w:jc w:val="left"/>
+            </w:pPr>
+            <w:r/>
+            <w:r>
+              <w:rPr>
+                <w:sz w:val="20"/>
               </w:rPr>
               <w:t>21</w:t>
             </w:r>
@@ -1660,10 +2089,15 @@
             <w:tcW w:type="dxa" w:w="3969"/>
           </w:tcPr>
           <w:p>
-            <w:r/>
-            <w:r>
-              <w:rPr>
-                <w:sz w:val="22"/>
+            <w:pPr>
+              <w:spacing w:after="0" w:line="240" w:lineRule="auto"/>
+              <w:ind w:firstLine="0"/>
+              <w:jc w:val="left"/>
+            </w:pPr>
+            <w:r/>
+            <w:r>
+              <w:rPr>
+                <w:sz w:val="20"/>
               </w:rPr>
               <w:t>Спирин Р.</w:t>
             </w:r>
@@ -1674,10 +2108,15 @@
             <w:tcW w:type="dxa" w:w="1134"/>
           </w:tcPr>
           <w:p>
-            <w:r/>
-            <w:r>
-              <w:rPr>
-                <w:sz w:val="22"/>
+            <w:pPr>
+              <w:spacing w:after="0" w:line="240" w:lineRule="auto"/>
+              <w:ind w:firstLine="0"/>
+              <w:jc w:val="left"/>
+            </w:pPr>
+            <w:r/>
+            <w:r>
+              <w:rPr>
+                <w:sz w:val="20"/>
               </w:rPr>
               <w:t>м</w:t>
             </w:r>
@@ -1688,10 +2127,15 @@
             <w:tcW w:type="dxa" w:w="1134"/>
           </w:tcPr>
           <w:p>
-            <w:r/>
-            <w:r>
-              <w:rPr>
-                <w:sz w:val="22"/>
+            <w:pPr>
+              <w:spacing w:after="0" w:line="240" w:lineRule="auto"/>
+              <w:ind w:firstLine="0"/>
+              <w:jc w:val="left"/>
+            </w:pPr>
+            <w:r/>
+            <w:r>
+              <w:rPr>
+                <w:sz w:val="20"/>
               </w:rPr>
               <w:t>+</w:t>
             </w:r>
@@ -1704,10 +2148,15 @@
             <w:tcW w:type="dxa" w:w="680"/>
           </w:tcPr>
           <w:p>
-            <w:r/>
-            <w:r>
-              <w:rPr>
-                <w:sz w:val="22"/>
+            <w:pPr>
+              <w:spacing w:after="0" w:line="240" w:lineRule="auto"/>
+              <w:ind w:firstLine="0"/>
+              <w:jc w:val="left"/>
+            </w:pPr>
+            <w:r/>
+            <w:r>
+              <w:rPr>
+                <w:sz w:val="20"/>
               </w:rPr>
               <w:t>22</w:t>
             </w:r>
@@ -1718,10 +2167,15 @@
             <w:tcW w:type="dxa" w:w="3969"/>
           </w:tcPr>
           <w:p>
-            <w:r/>
-            <w:r>
-              <w:rPr>
-                <w:sz w:val="22"/>
+            <w:pPr>
+              <w:spacing w:after="0" w:line="240" w:lineRule="auto"/>
+              <w:ind w:firstLine="0"/>
+              <w:jc w:val="left"/>
+            </w:pPr>
+            <w:r/>
+            <w:r>
+              <w:rPr>
+                <w:sz w:val="20"/>
               </w:rPr>
               <w:t>Стрекач В.</w:t>
             </w:r>
@@ -1732,10 +2186,15 @@
             <w:tcW w:type="dxa" w:w="1134"/>
           </w:tcPr>
           <w:p>
-            <w:r/>
-            <w:r>
-              <w:rPr>
-                <w:sz w:val="22"/>
+            <w:pPr>
+              <w:spacing w:after="0" w:line="240" w:lineRule="auto"/>
+              <w:ind w:firstLine="0"/>
+              <w:jc w:val="left"/>
+            </w:pPr>
+            <w:r/>
+            <w:r>
+              <w:rPr>
+                <w:sz w:val="20"/>
               </w:rPr>
               <w:t>ж</w:t>
             </w:r>
@@ -1746,10 +2205,15 @@
             <w:tcW w:type="dxa" w:w="1134"/>
           </w:tcPr>
           <w:p>
-            <w:r/>
-            <w:r>
-              <w:rPr>
-                <w:sz w:val="22"/>
+            <w:pPr>
+              <w:spacing w:after="0" w:line="240" w:lineRule="auto"/>
+              <w:ind w:firstLine="0"/>
+              <w:jc w:val="left"/>
+            </w:pPr>
+            <w:r/>
+            <w:r>
+              <w:rPr>
+                <w:sz w:val="20"/>
               </w:rPr>
               <w:t>+</w:t>
             </w:r>
@@ -1762,10 +2226,15 @@
             <w:tcW w:type="dxa" w:w="680"/>
           </w:tcPr>
           <w:p>
-            <w:r/>
-            <w:r>
-              <w:rPr>
-                <w:sz w:val="22"/>
+            <w:pPr>
+              <w:spacing w:after="0" w:line="240" w:lineRule="auto"/>
+              <w:ind w:firstLine="0"/>
+              <w:jc w:val="left"/>
+            </w:pPr>
+            <w:r/>
+            <w:r>
+              <w:rPr>
+                <w:sz w:val="20"/>
               </w:rPr>
               <w:t>23</w:t>
             </w:r>
@@ -1776,10 +2245,15 @@
             <w:tcW w:type="dxa" w:w="3969"/>
           </w:tcPr>
           <w:p>
-            <w:r/>
-            <w:r>
-              <w:rPr>
-                <w:sz w:val="22"/>
+            <w:pPr>
+              <w:spacing w:after="0" w:line="240" w:lineRule="auto"/>
+              <w:ind w:firstLine="0"/>
+              <w:jc w:val="left"/>
+            </w:pPr>
+            <w:r/>
+            <w:r>
+              <w:rPr>
+                <w:sz w:val="20"/>
               </w:rPr>
               <w:t>Тарариков Д. (?)</w:t>
             </w:r>
@@ -1790,10 +2264,15 @@
             <w:tcW w:type="dxa" w:w="1134"/>
           </w:tcPr>
           <w:p>
-            <w:r/>
-            <w:r>
-              <w:rPr>
-                <w:sz w:val="22"/>
+            <w:pPr>
+              <w:spacing w:after="0" w:line="240" w:lineRule="auto"/>
+              <w:ind w:firstLine="0"/>
+              <w:jc w:val="left"/>
+            </w:pPr>
+            <w:r/>
+            <w:r>
+              <w:rPr>
+                <w:sz w:val="20"/>
               </w:rPr>
               <w:t>м</w:t>
             </w:r>
@@ -1804,10 +2283,15 @@
             <w:tcW w:type="dxa" w:w="1134"/>
           </w:tcPr>
           <w:p>
-            <w:r/>
-            <w:r>
-              <w:rPr>
-                <w:sz w:val="22"/>
+            <w:pPr>
+              <w:spacing w:after="0" w:line="240" w:lineRule="auto"/>
+              <w:ind w:firstLine="0"/>
+              <w:jc w:val="left"/>
+            </w:pPr>
+            <w:r/>
+            <w:r>
+              <w:rPr>
+                <w:sz w:val="20"/>
               </w:rPr>
               <w:t>+</w:t>
             </w:r>
@@ -1820,10 +2304,15 @@
             <w:tcW w:type="dxa" w:w="680"/>
           </w:tcPr>
           <w:p>
-            <w:r/>
-            <w:r>
-              <w:rPr>
-                <w:sz w:val="22"/>
+            <w:pPr>
+              <w:spacing w:after="0" w:line="240" w:lineRule="auto"/>
+              <w:ind w:firstLine="0"/>
+              <w:jc w:val="left"/>
+            </w:pPr>
+            <w:r/>
+            <w:r>
+              <w:rPr>
+                <w:sz w:val="20"/>
               </w:rPr>
               <w:t>24</w:t>
             </w:r>
@@ -1834,10 +2323,15 @@
             <w:tcW w:type="dxa" w:w="3969"/>
           </w:tcPr>
           <w:p>
-            <w:r/>
-            <w:r>
-              <w:rPr>
-                <w:sz w:val="22"/>
+            <w:pPr>
+              <w:spacing w:after="0" w:line="240" w:lineRule="auto"/>
+              <w:ind w:firstLine="0"/>
+              <w:jc w:val="left"/>
+            </w:pPr>
+            <w:r/>
+            <w:r>
+              <w:rPr>
+                <w:sz w:val="20"/>
               </w:rPr>
               <w:t>Хохлов М. (?)</w:t>
             </w:r>
@@ -1848,10 +2342,15 @@
             <w:tcW w:type="dxa" w:w="1134"/>
           </w:tcPr>
           <w:p>
-            <w:r/>
-            <w:r>
-              <w:rPr>
-                <w:sz w:val="22"/>
+            <w:pPr>
+              <w:spacing w:after="0" w:line="240" w:lineRule="auto"/>
+              <w:ind w:firstLine="0"/>
+              <w:jc w:val="left"/>
+            </w:pPr>
+            <w:r/>
+            <w:r>
+              <w:rPr>
+                <w:sz w:val="20"/>
               </w:rPr>
               <w:t>м</w:t>
             </w:r>
@@ -1862,10 +2361,15 @@
             <w:tcW w:type="dxa" w:w="1134"/>
           </w:tcPr>
           <w:p>
-            <w:r/>
-            <w:r>
-              <w:rPr>
-                <w:sz w:val="22"/>
+            <w:pPr>
+              <w:spacing w:after="0" w:line="240" w:lineRule="auto"/>
+              <w:ind w:firstLine="0"/>
+              <w:jc w:val="left"/>
+            </w:pPr>
+            <w:r/>
+            <w:r>
+              <w:rPr>
+                <w:sz w:val="20"/>
               </w:rPr>
               <w:t>+</w:t>
             </w:r>
@@ -1878,10 +2382,15 @@
             <w:tcW w:type="dxa" w:w="680"/>
           </w:tcPr>
           <w:p>
-            <w:r/>
-            <w:r>
-              <w:rPr>
-                <w:sz w:val="22"/>
+            <w:pPr>
+              <w:spacing w:after="0" w:line="240" w:lineRule="auto"/>
+              <w:ind w:firstLine="0"/>
+              <w:jc w:val="left"/>
+            </w:pPr>
+            <w:r/>
+            <w:r>
+              <w:rPr>
+                <w:sz w:val="20"/>
               </w:rPr>
               <w:t>25</w:t>
             </w:r>
@@ -1892,10 +2401,15 @@
             <w:tcW w:type="dxa" w:w="3969"/>
           </w:tcPr>
           <w:p>
-            <w:r/>
-            <w:r>
-              <w:rPr>
-                <w:sz w:val="22"/>
+            <w:pPr>
+              <w:spacing w:after="0" w:line="240" w:lineRule="auto"/>
+              <w:ind w:firstLine="0"/>
+              <w:jc w:val="left"/>
+            </w:pPr>
+            <w:r/>
+            <w:r>
+              <w:rPr>
+                <w:sz w:val="20"/>
               </w:rPr>
               <w:t>Черников Ф.</w:t>
             </w:r>
@@ -1906,10 +2420,15 @@
             <w:tcW w:type="dxa" w:w="1134"/>
           </w:tcPr>
           <w:p>
-            <w:r/>
-            <w:r>
-              <w:rPr>
-                <w:sz w:val="22"/>
+            <w:pPr>
+              <w:spacing w:after="0" w:line="240" w:lineRule="auto"/>
+              <w:ind w:firstLine="0"/>
+              <w:jc w:val="left"/>
+            </w:pPr>
+            <w:r/>
+            <w:r>
+              <w:rPr>
+                <w:sz w:val="20"/>
               </w:rPr>
               <w:t>м</w:t>
             </w:r>
@@ -1920,10 +2439,15 @@
             <w:tcW w:type="dxa" w:w="1134"/>
           </w:tcPr>
           <w:p>
-            <w:r/>
-            <w:r>
-              <w:rPr>
-                <w:sz w:val="22"/>
+            <w:pPr>
+              <w:spacing w:after="0" w:line="240" w:lineRule="auto"/>
+              <w:ind w:firstLine="0"/>
+              <w:jc w:val="left"/>
+            </w:pPr>
+            <w:r/>
+            <w:r>
+              <w:rPr>
+                <w:sz w:val="20"/>
               </w:rPr>
               <w:t>—</w:t>
             </w:r>
@@ -1936,10 +2460,15 @@
             <w:tcW w:type="dxa" w:w="680"/>
           </w:tcPr>
           <w:p>
-            <w:r/>
-            <w:r>
-              <w:rPr>
-                <w:sz w:val="22"/>
+            <w:pPr>
+              <w:spacing w:after="0" w:line="240" w:lineRule="auto"/>
+              <w:ind w:firstLine="0"/>
+              <w:jc w:val="left"/>
+            </w:pPr>
+            <w:r/>
+            <w:r>
+              <w:rPr>
+                <w:sz w:val="20"/>
               </w:rPr>
               <w:t>26</w:t>
             </w:r>
@@ -1950,10 +2479,15 @@
             <w:tcW w:type="dxa" w:w="3969"/>
           </w:tcPr>
           <w:p>
-            <w:r/>
-            <w:r>
-              <w:rPr>
-                <w:sz w:val="22"/>
+            <w:pPr>
+              <w:spacing w:after="0" w:line="240" w:lineRule="auto"/>
+              <w:ind w:firstLine="0"/>
+              <w:jc w:val="left"/>
+            </w:pPr>
+            <w:r/>
+            <w:r>
+              <w:rPr>
+                <w:sz w:val="20"/>
               </w:rPr>
               <w:t>Чернышев</w:t>
             </w:r>
@@ -1964,10 +2498,15 @@
             <w:tcW w:type="dxa" w:w="1134"/>
           </w:tcPr>
           <w:p>
-            <w:r/>
-            <w:r>
-              <w:rPr>
-                <w:sz w:val="22"/>
+            <w:pPr>
+              <w:spacing w:after="0" w:line="240" w:lineRule="auto"/>
+              <w:ind w:firstLine="0"/>
+              <w:jc w:val="left"/>
+            </w:pPr>
+            <w:r/>
+            <w:r>
+              <w:rPr>
+                <w:sz w:val="20"/>
               </w:rPr>
               <w:t>м</w:t>
             </w:r>
@@ -1978,10 +2517,15 @@
             <w:tcW w:type="dxa" w:w="1134"/>
           </w:tcPr>
           <w:p>
-            <w:r/>
-            <w:r>
-              <w:rPr>
-                <w:sz w:val="22"/>
+            <w:pPr>
+              <w:spacing w:after="0" w:line="240" w:lineRule="auto"/>
+              <w:ind w:firstLine="0"/>
+              <w:jc w:val="left"/>
+            </w:pPr>
+            <w:r/>
+            <w:r>
+              <w:rPr>
+                <w:sz w:val="20"/>
               </w:rPr>
               <w:t>—</w:t>
             </w:r>
@@ -1994,10 +2538,15 @@
             <w:tcW w:type="dxa" w:w="680"/>
           </w:tcPr>
           <w:p>
-            <w:r/>
-            <w:r>
-              <w:rPr>
-                <w:sz w:val="22"/>
+            <w:pPr>
+              <w:spacing w:after="0" w:line="240" w:lineRule="auto"/>
+              <w:ind w:firstLine="0"/>
+              <w:jc w:val="left"/>
+            </w:pPr>
+            <w:r/>
+            <w:r>
+              <w:rPr>
+                <w:sz w:val="20"/>
               </w:rPr>
               <w:t>27</w:t>
             </w:r>
@@ -2008,10 +2557,15 @@
             <w:tcW w:type="dxa" w:w="3969"/>
           </w:tcPr>
           <w:p>
-            <w:r/>
-            <w:r>
-              <w:rPr>
-                <w:sz w:val="22"/>
+            <w:pPr>
+              <w:spacing w:after="0" w:line="240" w:lineRule="auto"/>
+              <w:ind w:firstLine="0"/>
+              <w:jc w:val="left"/>
+            </w:pPr>
+            <w:r/>
+            <w:r>
+              <w:rPr>
+                <w:sz w:val="20"/>
               </w:rPr>
               <w:t>Чумакова М.</w:t>
             </w:r>
@@ -2022,10 +2576,15 @@
             <w:tcW w:type="dxa" w:w="1134"/>
           </w:tcPr>
           <w:p>
-            <w:r/>
-            <w:r>
-              <w:rPr>
-                <w:sz w:val="22"/>
+            <w:pPr>
+              <w:spacing w:after="0" w:line="240" w:lineRule="auto"/>
+              <w:ind w:firstLine="0"/>
+              <w:jc w:val="left"/>
+            </w:pPr>
+            <w:r/>
+            <w:r>
+              <w:rPr>
+                <w:sz w:val="20"/>
               </w:rPr>
               <w:t>ж</w:t>
             </w:r>
@@ -2036,10 +2595,15 @@
             <w:tcW w:type="dxa" w:w="1134"/>
           </w:tcPr>
           <w:p>
-            <w:r/>
-            <w:r>
-              <w:rPr>
-                <w:sz w:val="22"/>
+            <w:pPr>
+              <w:spacing w:after="0" w:line="240" w:lineRule="auto"/>
+              <w:ind w:firstLine="0"/>
+              <w:jc w:val="left"/>
+            </w:pPr>
+            <w:r/>
+            <w:r>
+              <w:rPr>
+                <w:sz w:val="20"/>
               </w:rPr>
               <w:t>—</w:t>
             </w:r>
@@ -2052,10 +2616,15 @@
             <w:tcW w:type="dxa" w:w="680"/>
           </w:tcPr>
           <w:p>
-            <w:r/>
-            <w:r>
-              <w:rPr>
-                <w:sz w:val="22"/>
+            <w:pPr>
+              <w:spacing w:after="0" w:line="240" w:lineRule="auto"/>
+              <w:ind w:firstLine="0"/>
+              <w:jc w:val="left"/>
+            </w:pPr>
+            <w:r/>
+            <w:r>
+              <w:rPr>
+                <w:sz w:val="20"/>
               </w:rPr>
               <w:t>28</w:t>
             </w:r>
@@ -2066,10 +2635,15 @@
             <w:tcW w:type="dxa" w:w="3969"/>
           </w:tcPr>
           <w:p>
-            <w:r/>
-            <w:r>
-              <w:rPr>
-                <w:sz w:val="22"/>
+            <w:pPr>
+              <w:spacing w:after="0" w:line="240" w:lineRule="auto"/>
+              <w:ind w:firstLine="0"/>
+              <w:jc w:val="left"/>
+            </w:pPr>
+            <w:r/>
+            <w:r>
+              <w:rPr>
+                <w:sz w:val="20"/>
               </w:rPr>
               <w:t>Шипилова А.</w:t>
             </w:r>
@@ -2080,10 +2654,15 @@
             <w:tcW w:type="dxa" w:w="1134"/>
           </w:tcPr>
           <w:p>
-            <w:r/>
-            <w:r>
-              <w:rPr>
-                <w:sz w:val="22"/>
+            <w:pPr>
+              <w:spacing w:after="0" w:line="240" w:lineRule="auto"/>
+              <w:ind w:firstLine="0"/>
+              <w:jc w:val="left"/>
+            </w:pPr>
+            <w:r/>
+            <w:r>
+              <w:rPr>
+                <w:sz w:val="20"/>
               </w:rPr>
               <w:t>ж</w:t>
             </w:r>
@@ -2094,10 +2673,15 @@
             <w:tcW w:type="dxa" w:w="1134"/>
           </w:tcPr>
           <w:p>
-            <w:r/>
-            <w:r>
-              <w:rPr>
-                <w:sz w:val="22"/>
+            <w:pPr>
+              <w:spacing w:after="0" w:line="240" w:lineRule="auto"/>
+              <w:ind w:firstLine="0"/>
+              <w:jc w:val="left"/>
+            </w:pPr>
+            <w:r/>
+            <w:r>
+              <w:rPr>
+                <w:sz w:val="20"/>
               </w:rPr>
               <w:t>+</w:t>
             </w:r>
@@ -2110,10 +2694,15 @@
             <w:tcW w:type="dxa" w:w="680"/>
           </w:tcPr>
           <w:p>
-            <w:r/>
-            <w:r>
-              <w:rPr>
-                <w:sz w:val="22"/>
+            <w:pPr>
+              <w:spacing w:after="0" w:line="240" w:lineRule="auto"/>
+              <w:ind w:firstLine="0"/>
+              <w:jc w:val="left"/>
+            </w:pPr>
+            <w:r/>
+            <w:r>
+              <w:rPr>
+                <w:sz w:val="20"/>
               </w:rPr>
               <w:t>29</w:t>
             </w:r>
@@ -2124,10 +2713,15 @@
             <w:tcW w:type="dxa" w:w="3969"/>
           </w:tcPr>
           <w:p>
-            <w:r/>
-            <w:r>
-              <w:rPr>
-                <w:sz w:val="22"/>
+            <w:pPr>
+              <w:spacing w:after="0" w:line="240" w:lineRule="auto"/>
+              <w:ind w:firstLine="0"/>
+              <w:jc w:val="left"/>
+            </w:pPr>
+            <w:r/>
+            <w:r>
+              <w:rPr>
+                <w:sz w:val="20"/>
               </w:rPr>
               <w:t>Шкурлетов</w:t>
             </w:r>
@@ -2138,10 +2732,15 @@
             <w:tcW w:type="dxa" w:w="1134"/>
           </w:tcPr>
           <w:p>
-            <w:r/>
-            <w:r>
-              <w:rPr>
-                <w:sz w:val="22"/>
+            <w:pPr>
+              <w:spacing w:after="0" w:line="240" w:lineRule="auto"/>
+              <w:ind w:firstLine="0"/>
+              <w:jc w:val="left"/>
+            </w:pPr>
+            <w:r/>
+            <w:r>
+              <w:rPr>
+                <w:sz w:val="20"/>
               </w:rPr>
               <w:t>м</w:t>
             </w:r>
@@ -2152,10 +2751,15 @@
             <w:tcW w:type="dxa" w:w="1134"/>
           </w:tcPr>
           <w:p>
-            <w:r/>
-            <w:r>
-              <w:rPr>
-                <w:sz w:val="22"/>
+            <w:pPr>
+              <w:spacing w:after="0" w:line="240" w:lineRule="auto"/>
+              <w:ind w:firstLine="0"/>
+              <w:jc w:val="left"/>
+            </w:pPr>
+            <w:r/>
+            <w:r>
+              <w:rPr>
+                <w:sz w:val="20"/>
               </w:rPr>
               <w:t>—</w:t>
             </w:r>
@@ -2168,10 +2772,15 @@
             <w:tcW w:type="dxa" w:w="680"/>
           </w:tcPr>
           <w:p>
-            <w:r/>
-            <w:r>
-              <w:rPr>
-                <w:sz w:val="22"/>
+            <w:pPr>
+              <w:spacing w:after="0" w:line="240" w:lineRule="auto"/>
+              <w:ind w:firstLine="0"/>
+              <w:jc w:val="left"/>
+            </w:pPr>
+            <w:r/>
+            <w:r>
+              <w:rPr>
+                <w:sz w:val="20"/>
               </w:rPr>
               <w:t>30</w:t>
             </w:r>
@@ -2182,10 +2791,15 @@
             <w:tcW w:type="dxa" w:w="3969"/>
           </w:tcPr>
           <w:p>
-            <w:r/>
-            <w:r>
-              <w:rPr>
-                <w:sz w:val="22"/>
+            <w:pPr>
+              <w:spacing w:after="0" w:line="240" w:lineRule="auto"/>
+              <w:ind w:firstLine="0"/>
+              <w:jc w:val="left"/>
+            </w:pPr>
+            <w:r/>
+            <w:r>
+              <w:rPr>
+                <w:sz w:val="20"/>
               </w:rPr>
               <w:t>Шульгин Т.</w:t>
             </w:r>
@@ -2196,10 +2810,15 @@
             <w:tcW w:type="dxa" w:w="1134"/>
           </w:tcPr>
           <w:p>
-            <w:r/>
-            <w:r>
-              <w:rPr>
-                <w:sz w:val="22"/>
+            <w:pPr>
+              <w:spacing w:after="0" w:line="240" w:lineRule="auto"/>
+              <w:ind w:firstLine="0"/>
+              <w:jc w:val="left"/>
+            </w:pPr>
+            <w:r/>
+            <w:r>
+              <w:rPr>
+                <w:sz w:val="20"/>
               </w:rPr>
               <w:t>м</w:t>
             </w:r>
@@ -2210,10 +2829,15 @@
             <w:tcW w:type="dxa" w:w="1134"/>
           </w:tcPr>
           <w:p>
-            <w:r/>
-            <w:r>
-              <w:rPr>
-                <w:sz w:val="22"/>
+            <w:pPr>
+              <w:spacing w:after="0" w:line="240" w:lineRule="auto"/>
+              <w:ind w:firstLine="0"/>
+              <w:jc w:val="left"/>
+            </w:pPr>
+            <w:r/>
+            <w:r>
+              <w:rPr>
+                <w:sz w:val="20"/>
               </w:rPr>
               <w:t>+</w:t>
             </w:r>
@@ -2226,10 +2850,15 @@
             <w:tcW w:type="dxa" w:w="680"/>
           </w:tcPr>
           <w:p>
-            <w:r/>
-            <w:r>
-              <w:rPr>
-                <w:sz w:val="22"/>
+            <w:pPr>
+              <w:spacing w:after="0" w:line="240" w:lineRule="auto"/>
+              <w:ind w:firstLine="0"/>
+              <w:jc w:val="left"/>
+            </w:pPr>
+            <w:r/>
+            <w:r>
+              <w:rPr>
+                <w:sz w:val="20"/>
               </w:rPr>
               <w:t>31</w:t>
             </w:r>
@@ -2240,10 +2869,15 @@
             <w:tcW w:type="dxa" w:w="3969"/>
           </w:tcPr>
           <w:p>
-            <w:r/>
-            <w:r>
-              <w:rPr>
-                <w:sz w:val="22"/>
+            <w:pPr>
+              <w:spacing w:after="0" w:line="240" w:lineRule="auto"/>
+              <w:ind w:firstLine="0"/>
+              <w:jc w:val="left"/>
+            </w:pPr>
+            <w:r/>
+            <w:r>
+              <w:rPr>
+                <w:sz w:val="20"/>
               </w:rPr>
               <w:t>Юневич</w:t>
             </w:r>
@@ -2254,10 +2888,15 @@
             <w:tcW w:type="dxa" w:w="1134"/>
           </w:tcPr>
           <w:p>
-            <w:r/>
-            <w:r>
-              <w:rPr>
-                <w:sz w:val="22"/>
+            <w:pPr>
+              <w:spacing w:after="0" w:line="240" w:lineRule="auto"/>
+              <w:ind w:firstLine="0"/>
+              <w:jc w:val="left"/>
+            </w:pPr>
+            <w:r/>
+            <w:r>
+              <w:rPr>
+                <w:sz w:val="20"/>
               </w:rPr>
               <w:t>?</w:t>
             </w:r>
@@ -2268,10 +2907,15 @@
             <w:tcW w:type="dxa" w:w="1134"/>
           </w:tcPr>
           <w:p>
-            <w:r/>
-            <w:r>
-              <w:rPr>
-                <w:sz w:val="22"/>
+            <w:pPr>
+              <w:spacing w:after="0" w:line="240" w:lineRule="auto"/>
+              <w:ind w:firstLine="0"/>
+              <w:jc w:val="left"/>
+            </w:pPr>
+            <w:r/>
+            <w:r>
+              <w:rPr>
+                <w:sz w:val="20"/>
               </w:rPr>
               <w:t>—</w:t>
             </w:r>
@@ -2284,10 +2928,15 @@
             <w:tcW w:type="dxa" w:w="680"/>
           </w:tcPr>
           <w:p>
-            <w:r/>
-            <w:r>
-              <w:rPr>
-                <w:sz w:val="22"/>
+            <w:pPr>
+              <w:spacing w:after="0" w:line="240" w:lineRule="auto"/>
+              <w:ind w:firstLine="0"/>
+              <w:jc w:val="left"/>
+            </w:pPr>
+            <w:r/>
+            <w:r>
+              <w:rPr>
+                <w:sz w:val="20"/>
               </w:rPr>
               <w:t>А</w:t>
             </w:r>
@@ -2298,10 +2947,15 @@
             <w:tcW w:type="dxa" w:w="3969"/>
           </w:tcPr>
           <w:p>
-            <w:r/>
-            <w:r>
-              <w:rPr>
-                <w:sz w:val="22"/>
+            <w:pPr>
+              <w:spacing w:after="0" w:line="240" w:lineRule="auto"/>
+              <w:ind w:firstLine="0"/>
+              <w:jc w:val="left"/>
+            </w:pPr>
+            <w:r/>
+            <w:r>
+              <w:rPr>
+                <w:sz w:val="20"/>
               </w:rPr>
               <w:t>Анкета без подписи</w:t>
             </w:r>
@@ -2312,10 +2966,15 @@
             <w:tcW w:type="dxa" w:w="1134"/>
           </w:tcPr>
           <w:p>
-            <w:r/>
-            <w:r>
-              <w:rPr>
-                <w:sz w:val="22"/>
+            <w:pPr>
+              <w:spacing w:after="0" w:line="240" w:lineRule="auto"/>
+              <w:ind w:firstLine="0"/>
+              <w:jc w:val="left"/>
+            </w:pPr>
+            <w:r/>
+            <w:r>
+              <w:rPr>
+                <w:sz w:val="20"/>
               </w:rPr>
               <w:t>м (?)</w:t>
             </w:r>
@@ -2326,10 +2985,15 @@
             <w:tcW w:type="dxa" w:w="1134"/>
           </w:tcPr>
           <w:p>
-            <w:r/>
-            <w:r>
-              <w:rPr>
-                <w:sz w:val="22"/>
+            <w:pPr>
+              <w:spacing w:after="0" w:line="240" w:lineRule="auto"/>
+              <w:ind w:firstLine="0"/>
+              <w:jc w:val="left"/>
+            </w:pPr>
+            <w:r/>
+            <w:r>
+              <w:rPr>
+                <w:sz w:val="20"/>
               </w:rPr>
               <w:t>+</w:t>
             </w:r>
@@ -2354,6 +3018,8 @@
     </w:p>
     <w:p>
       <w:pPr>
+        <w:keepNext/>
+        <w:pageBreakBefore/>
         <w:spacing w:after="120" w:line="276" w:lineRule="auto"/>
         <w:jc w:val="center"/>
       </w:pPr>
@@ -2368,6 +3034,20 @@
     <w:p>
       <w:pPr>
         <w:spacing w:after="0" w:line="276" w:lineRule="auto"/>
+        <w:jc w:val="center"/>
+      </w:pPr>
+      <w:r>
+        <w:rPr>
+          <w:b/>
+          <w:i w:val="0"/>
+          <w:sz w:val="24"/>
+        </w:rPr>
+        <w:t>Анкета учащегося</w:t>
+      </w:r>
+    </w:p>
+    <w:p>
+      <w:pPr>
+        <w:spacing w:after="80" w:line="276" w:lineRule="auto"/>
         <w:jc w:val="both"/>
       </w:pPr>
       <w:r>
@@ -2376,12 +3056,29 @@
           <w:i w:val="0"/>
           <w:sz w:val="24"/>
         </w:rPr>
-        <w:t>Анкета учащегося</w:t>
+        <w:t>Фамилия, имя: ______________________________ Класс: ________ Дата: ________</w:t>
       </w:r>
     </w:p>
     <w:p>
       <w:pPr>
+        <w:keepNext/>
+        <w:spacing w:after="0" w:line="276" w:lineRule="auto" w:before="80"/>
+        <w:jc w:val="both"/>
+      </w:pPr>
+      <w:r>
+        <w:rPr>
+          <w:b/>
+          <w:i w:val="0"/>
+          <w:sz w:val="24"/>
+        </w:rPr>
+        <w:t>1. Нравится ли тебе учиться в этом классе?</w:t>
+      </w:r>
+    </w:p>
+    <w:p>
+      <w:pPr>
+        <w:keepNext/>
         <w:spacing w:after="0" w:line="276" w:lineRule="auto"/>
+        <w:ind w:left="567"/>
         <w:jc w:val="both"/>
       </w:pPr>
       <w:r>
@@ -2390,12 +3087,14 @@
           <w:i w:val="0"/>
           <w:sz w:val="24"/>
         </w:rPr>
-        <w:t>Фамилия, имя: ______________________ Класс: ______ Дата: ______</w:t>
+        <w:t>•  Да, очень</w:t>
       </w:r>
     </w:p>
     <w:p>
       <w:pPr>
+        <w:keepNext/>
         <w:spacing w:after="0" w:line="276" w:lineRule="auto"/>
+        <w:ind w:left="567"/>
         <w:jc w:val="both"/>
       </w:pPr>
       <w:r>
@@ -2404,12 +3103,14 @@
           <w:i w:val="0"/>
           <w:sz w:val="24"/>
         </w:rPr>
-        <w:t>1. Нравится ли тебе учиться в этом классе? (да, очень; скорее да; скорее нет; нет)</w:t>
+        <w:t>•  Скорее да</w:t>
       </w:r>
     </w:p>
     <w:p>
       <w:pPr>
+        <w:keepNext/>
         <w:spacing w:after="0" w:line="276" w:lineRule="auto"/>
+        <w:ind w:left="567"/>
         <w:jc w:val="both"/>
       </w:pPr>
       <w:r>
@@ -2418,12 +3119,14 @@
           <w:i w:val="0"/>
           <w:sz w:val="24"/>
         </w:rPr>
-        <w:t>2. Как бы ты оценил(а) отношения с одноклассниками? (очень хорошие; хорошие; нормальные; не очень хорошие)</w:t>
+        <w:t>•  Скорее нет</w:t>
       </w:r>
     </w:p>
     <w:p>
       <w:pPr>
+        <w:keepNext/>
         <w:spacing w:after="0" w:line="276" w:lineRule="auto"/>
+        <w:ind w:left="567"/>
         <w:jc w:val="both"/>
       </w:pPr>
       <w:r>
@@ -2432,12 +3135,29 @@
           <w:i w:val="0"/>
           <w:sz w:val="24"/>
         </w:rPr>
-        <w:t>3. Чувствуешь ли ты себя в классе комфортно? (да, всегда; обычно да; иногда нет; чаще нет)</w:t>
+        <w:t>•  Нет</w:t>
       </w:r>
     </w:p>
     <w:p>
       <w:pPr>
+        <w:keepNext/>
+        <w:spacing w:after="0" w:line="276" w:lineRule="auto" w:before="80"/>
+        <w:jc w:val="both"/>
+      </w:pPr>
+      <w:r>
+        <w:rPr>
+          <w:b/>
+          <w:i w:val="0"/>
+          <w:sz w:val="24"/>
+        </w:rPr>
+        <w:t>2. Как бы ты оценил(а) отношения с одноклассниками?</w:t>
+      </w:r>
+    </w:p>
+    <w:p>
+      <w:pPr>
+        <w:keepNext/>
         <w:spacing w:after="0" w:line="276" w:lineRule="auto"/>
+        <w:ind w:left="567"/>
         <w:jc w:val="both"/>
       </w:pPr>
       <w:r>
@@ -2446,17 +3166,224 @@
           <w:i w:val="0"/>
           <w:sz w:val="24"/>
         </w:rPr>
-        <w:t>4. Бывают ли в классе ссоры и конфликты? (очень редко; иногда; часто; почти всегда)</w:t>
+        <w:t>•  Очень хорошие</w:t>
       </w:r>
     </w:p>
     <w:p>
       <w:pPr>
+        <w:keepNext/>
         <w:spacing w:after="0" w:line="276" w:lineRule="auto"/>
+        <w:ind w:left="567"/>
         <w:jc w:val="both"/>
       </w:pPr>
       <w:r>
         <w:rPr>
           <w:b w:val="0"/>
+          <w:i w:val="0"/>
+          <w:sz w:val="24"/>
+        </w:rPr>
+        <w:t>•  Хорошие</w:t>
+      </w:r>
+    </w:p>
+    <w:p>
+      <w:pPr>
+        <w:keepNext/>
+        <w:spacing w:after="0" w:line="276" w:lineRule="auto"/>
+        <w:ind w:left="567"/>
+        <w:jc w:val="both"/>
+      </w:pPr>
+      <w:r>
+        <w:rPr>
+          <w:b w:val="0"/>
+          <w:i w:val="0"/>
+          <w:sz w:val="24"/>
+        </w:rPr>
+        <w:t>•  Нормальные</w:t>
+      </w:r>
+    </w:p>
+    <w:p>
+      <w:pPr>
+        <w:keepNext/>
+        <w:spacing w:after="0" w:line="276" w:lineRule="auto"/>
+        <w:ind w:left="567"/>
+        <w:jc w:val="both"/>
+      </w:pPr>
+      <w:r>
+        <w:rPr>
+          <w:b w:val="0"/>
+          <w:i w:val="0"/>
+          <w:sz w:val="24"/>
+        </w:rPr>
+        <w:t>•  Не очень хорошие</w:t>
+      </w:r>
+    </w:p>
+    <w:p>
+      <w:pPr>
+        <w:keepNext/>
+        <w:spacing w:after="0" w:line="276" w:lineRule="auto" w:before="80"/>
+        <w:jc w:val="both"/>
+      </w:pPr>
+      <w:r>
+        <w:rPr>
+          <w:b/>
+          <w:i w:val="0"/>
+          <w:sz w:val="24"/>
+        </w:rPr>
+        <w:t>3. Чувствуешь ли ты себя в классе комфортно?</w:t>
+      </w:r>
+    </w:p>
+    <w:p>
+      <w:pPr>
+        <w:keepNext/>
+        <w:spacing w:after="0" w:line="276" w:lineRule="auto"/>
+        <w:ind w:left="567"/>
+        <w:jc w:val="both"/>
+      </w:pPr>
+      <w:r>
+        <w:rPr>
+          <w:b w:val="0"/>
+          <w:i w:val="0"/>
+          <w:sz w:val="24"/>
+        </w:rPr>
+        <w:t>•  Да, всегда</w:t>
+      </w:r>
+    </w:p>
+    <w:p>
+      <w:pPr>
+        <w:keepNext/>
+        <w:spacing w:after="0" w:line="276" w:lineRule="auto"/>
+        <w:ind w:left="567"/>
+        <w:jc w:val="both"/>
+      </w:pPr>
+      <w:r>
+        <w:rPr>
+          <w:b w:val="0"/>
+          <w:i w:val="0"/>
+          <w:sz w:val="24"/>
+        </w:rPr>
+        <w:t>•  Обычно да</w:t>
+      </w:r>
+    </w:p>
+    <w:p>
+      <w:pPr>
+        <w:keepNext/>
+        <w:spacing w:after="0" w:line="276" w:lineRule="auto"/>
+        <w:ind w:left="567"/>
+        <w:jc w:val="both"/>
+      </w:pPr>
+      <w:r>
+        <w:rPr>
+          <w:b w:val="0"/>
+          <w:i w:val="0"/>
+          <w:sz w:val="24"/>
+        </w:rPr>
+        <w:t>•  Иногда нет</w:t>
+      </w:r>
+    </w:p>
+    <w:p>
+      <w:pPr>
+        <w:keepNext/>
+        <w:spacing w:after="0" w:line="276" w:lineRule="auto"/>
+        <w:ind w:left="567"/>
+        <w:jc w:val="both"/>
+      </w:pPr>
+      <w:r>
+        <w:rPr>
+          <w:b w:val="0"/>
+          <w:i w:val="0"/>
+          <w:sz w:val="24"/>
+        </w:rPr>
+        <w:t>•  Чаще нет</w:t>
+      </w:r>
+    </w:p>
+    <w:p>
+      <w:pPr>
+        <w:keepNext/>
+        <w:spacing w:after="0" w:line="276" w:lineRule="auto" w:before="80"/>
+        <w:jc w:val="both"/>
+      </w:pPr>
+      <w:r>
+        <w:rPr>
+          <w:b/>
+          <w:i w:val="0"/>
+          <w:sz w:val="24"/>
+        </w:rPr>
+        <w:t>4. Бывают ли в классе ссоры и конфликты?</w:t>
+      </w:r>
+    </w:p>
+    <w:p>
+      <w:pPr>
+        <w:keepNext/>
+        <w:spacing w:after="0" w:line="276" w:lineRule="auto"/>
+        <w:ind w:left="567"/>
+        <w:jc w:val="both"/>
+      </w:pPr>
+      <w:r>
+        <w:rPr>
+          <w:b w:val="0"/>
+          <w:i w:val="0"/>
+          <w:sz w:val="24"/>
+        </w:rPr>
+        <w:t>•  Очень редко</w:t>
+      </w:r>
+    </w:p>
+    <w:p>
+      <w:pPr>
+        <w:keepNext/>
+        <w:spacing w:after="0" w:line="276" w:lineRule="auto"/>
+        <w:ind w:left="567"/>
+        <w:jc w:val="both"/>
+      </w:pPr>
+      <w:r>
+        <w:rPr>
+          <w:b w:val="0"/>
+          <w:i w:val="0"/>
+          <w:sz w:val="24"/>
+        </w:rPr>
+        <w:t>•  Иногда</w:t>
+      </w:r>
+    </w:p>
+    <w:p>
+      <w:pPr>
+        <w:keepNext/>
+        <w:spacing w:after="0" w:line="276" w:lineRule="auto"/>
+        <w:ind w:left="567"/>
+        <w:jc w:val="both"/>
+      </w:pPr>
+      <w:r>
+        <w:rPr>
+          <w:b w:val="0"/>
+          <w:i w:val="0"/>
+          <w:sz w:val="24"/>
+        </w:rPr>
+        <w:t>•  Часто</w:t>
+      </w:r>
+    </w:p>
+    <w:p>
+      <w:pPr>
+        <w:keepNext/>
+        <w:spacing w:after="0" w:line="276" w:lineRule="auto"/>
+        <w:ind w:left="567"/>
+        <w:jc w:val="both"/>
+      </w:pPr>
+      <w:r>
+        <w:rPr>
+          <w:b w:val="0"/>
+          <w:i w:val="0"/>
+          <w:sz w:val="24"/>
+        </w:rPr>
+        <w:t>•  Почти всегда</w:t>
+      </w:r>
+    </w:p>
+    <w:p>
+      <w:pPr>
+        <w:keepNext/>
+        <w:spacing w:after="0" w:line="276" w:lineRule="auto" w:before="80"/>
+        <w:jc w:val="both"/>
+      </w:pPr>
+      <w:r>
+        <w:rPr>
+          <w:b/>
           <w:i w:val="0"/>
           <w:sz w:val="24"/>
         </w:rPr>
@@ -2466,6 +3393,7 @@
     <w:p>
       <w:pPr>
         <w:spacing w:after="0" w:line="276" w:lineRule="auto"/>
+        <w:ind w:left="567"/>
         <w:jc w:val="both"/>
       </w:pPr>
       <w:r>
@@ -2474,12 +3402,29 @@
           <w:i w:val="0"/>
           <w:sz w:val="24"/>
         </w:rPr>
-        <w:t>6. Как ты считаешь, есть ли в классе ученики, которых несправедливо обижают или не замечают? (нет; да, один-два человека; да, несколько человек; затрудняюсь ответить)</w:t>
+        <w:t>____________________________________________________________</w:t>
       </w:r>
     </w:p>
     <w:p>
       <w:pPr>
+        <w:keepNext/>
+        <w:spacing w:after="0" w:line="276" w:lineRule="auto" w:before="80"/>
+        <w:jc w:val="both"/>
+      </w:pPr>
+      <w:r>
+        <w:rPr>
+          <w:b/>
+          <w:i w:val="0"/>
+          <w:sz w:val="24"/>
+        </w:rPr>
+        <w:t>6. Как ты считаешь, есть ли в классе ученики, которых несправедливо обижают или не замечают?</w:t>
+      </w:r>
+    </w:p>
+    <w:p>
+      <w:pPr>
+        <w:keepNext/>
         <w:spacing w:after="0" w:line="276" w:lineRule="auto"/>
+        <w:ind w:left="567"/>
         <w:jc w:val="both"/>
       </w:pPr>
       <w:r>
@@ -2488,12 +3433,14 @@
           <w:i w:val="0"/>
           <w:sz w:val="24"/>
         </w:rPr>
-        <w:t>7. Хотел(а) бы ты перейти в другой класс? (нет; скорее нет; скорее да; да)</w:t>
+        <w:t>•  Нет</w:t>
       </w:r>
     </w:p>
     <w:p>
       <w:pPr>
+        <w:keepNext/>
         <w:spacing w:after="0" w:line="276" w:lineRule="auto"/>
+        <w:ind w:left="567"/>
         <w:jc w:val="both"/>
       </w:pPr>
       <w:r>
@@ -2502,17 +3449,208 @@
           <w:i w:val="0"/>
           <w:sz w:val="24"/>
         </w:rPr>
-        <w:t>8. Как ты считаешь, умеют ли ребята в твоём классе работать вместе (например, делать общий проект)? (да, очень хорошо; нормально; не очень; совсем не умеют)</w:t>
+        <w:t>•  Да, один-два человека</w:t>
       </w:r>
     </w:p>
     <w:p>
       <w:pPr>
+        <w:keepNext/>
         <w:spacing w:after="0" w:line="276" w:lineRule="auto"/>
+        <w:ind w:left="567"/>
         <w:jc w:val="both"/>
       </w:pPr>
       <w:r>
         <w:rPr>
           <w:b w:val="0"/>
+          <w:i w:val="0"/>
+          <w:sz w:val="24"/>
+        </w:rPr>
+        <w:t>•  Да, несколько человек</w:t>
+      </w:r>
+    </w:p>
+    <w:p>
+      <w:pPr>
+        <w:keepNext/>
+        <w:spacing w:after="0" w:line="276" w:lineRule="auto"/>
+        <w:ind w:left="567"/>
+        <w:jc w:val="both"/>
+      </w:pPr>
+      <w:r>
+        <w:rPr>
+          <w:b w:val="0"/>
+          <w:i w:val="0"/>
+          <w:sz w:val="24"/>
+        </w:rPr>
+        <w:t>•  Затрудняюсь ответить</w:t>
+      </w:r>
+    </w:p>
+    <w:p>
+      <w:pPr>
+        <w:keepNext/>
+        <w:spacing w:after="0" w:line="276" w:lineRule="auto" w:before="80"/>
+        <w:jc w:val="both"/>
+      </w:pPr>
+      <w:r>
+        <w:rPr>
+          <w:b/>
+          <w:i w:val="0"/>
+          <w:sz w:val="24"/>
+        </w:rPr>
+        <w:t>7. Хотел(а) бы ты перейти в другой класс?</w:t>
+      </w:r>
+    </w:p>
+    <w:p>
+      <w:pPr>
+        <w:keepNext/>
+        <w:spacing w:after="0" w:line="276" w:lineRule="auto"/>
+        <w:ind w:left="567"/>
+        <w:jc w:val="both"/>
+      </w:pPr>
+      <w:r>
+        <w:rPr>
+          <w:b w:val="0"/>
+          <w:i w:val="0"/>
+          <w:sz w:val="24"/>
+        </w:rPr>
+        <w:t>•  Нет</w:t>
+      </w:r>
+    </w:p>
+    <w:p>
+      <w:pPr>
+        <w:keepNext/>
+        <w:spacing w:after="0" w:line="276" w:lineRule="auto"/>
+        <w:ind w:left="567"/>
+        <w:jc w:val="both"/>
+      </w:pPr>
+      <w:r>
+        <w:rPr>
+          <w:b w:val="0"/>
+          <w:i w:val="0"/>
+          <w:sz w:val="24"/>
+        </w:rPr>
+        <w:t>•  Скорее нет</w:t>
+      </w:r>
+    </w:p>
+    <w:p>
+      <w:pPr>
+        <w:keepNext/>
+        <w:spacing w:after="0" w:line="276" w:lineRule="auto"/>
+        <w:ind w:left="567"/>
+        <w:jc w:val="both"/>
+      </w:pPr>
+      <w:r>
+        <w:rPr>
+          <w:b w:val="0"/>
+          <w:i w:val="0"/>
+          <w:sz w:val="24"/>
+        </w:rPr>
+        <w:t>•  Скорее да</w:t>
+      </w:r>
+    </w:p>
+    <w:p>
+      <w:pPr>
+        <w:keepNext/>
+        <w:spacing w:after="0" w:line="276" w:lineRule="auto"/>
+        <w:ind w:left="567"/>
+        <w:jc w:val="both"/>
+      </w:pPr>
+      <w:r>
+        <w:rPr>
+          <w:b w:val="0"/>
+          <w:i w:val="0"/>
+          <w:sz w:val="24"/>
+        </w:rPr>
+        <w:t>•  Да</w:t>
+      </w:r>
+    </w:p>
+    <w:p>
+      <w:pPr>
+        <w:keepNext/>
+        <w:spacing w:after="0" w:line="276" w:lineRule="auto" w:before="80"/>
+        <w:jc w:val="both"/>
+      </w:pPr>
+      <w:r>
+        <w:rPr>
+          <w:b/>
+          <w:i w:val="0"/>
+          <w:sz w:val="24"/>
+        </w:rPr>
+        <w:t>8. Как ты считаешь, умеют ли ребята в твоём классе работать вместе (например, делать общий проект)?</w:t>
+      </w:r>
+    </w:p>
+    <w:p>
+      <w:pPr>
+        <w:keepNext/>
+        <w:spacing w:after="0" w:line="276" w:lineRule="auto"/>
+        <w:ind w:left="567"/>
+        <w:jc w:val="both"/>
+      </w:pPr>
+      <w:r>
+        <w:rPr>
+          <w:b w:val="0"/>
+          <w:i w:val="0"/>
+          <w:sz w:val="24"/>
+        </w:rPr>
+        <w:t>•  Да, очень хорошо</w:t>
+      </w:r>
+    </w:p>
+    <w:p>
+      <w:pPr>
+        <w:keepNext/>
+        <w:spacing w:after="0" w:line="276" w:lineRule="auto"/>
+        <w:ind w:left="567"/>
+        <w:jc w:val="both"/>
+      </w:pPr>
+      <w:r>
+        <w:rPr>
+          <w:b w:val="0"/>
+          <w:i w:val="0"/>
+          <w:sz w:val="24"/>
+        </w:rPr>
+        <w:t>•  Нормально</w:t>
+      </w:r>
+    </w:p>
+    <w:p>
+      <w:pPr>
+        <w:keepNext/>
+        <w:spacing w:after="0" w:line="276" w:lineRule="auto"/>
+        <w:ind w:left="567"/>
+        <w:jc w:val="both"/>
+      </w:pPr>
+      <w:r>
+        <w:rPr>
+          <w:b w:val="0"/>
+          <w:i w:val="0"/>
+          <w:sz w:val="24"/>
+        </w:rPr>
+        <w:t>•  Не очень</w:t>
+      </w:r>
+    </w:p>
+    <w:p>
+      <w:pPr>
+        <w:keepNext/>
+        <w:spacing w:after="0" w:line="276" w:lineRule="auto"/>
+        <w:ind w:left="567"/>
+        <w:jc w:val="both"/>
+      </w:pPr>
+      <w:r>
+        <w:rPr>
+          <w:b w:val="0"/>
+          <w:i w:val="0"/>
+          <w:sz w:val="24"/>
+        </w:rPr>
+        <w:t>•  Совсем не умеют</w:t>
+      </w:r>
+    </w:p>
+    <w:p>
+      <w:pPr>
+        <w:keepNext/>
+        <w:spacing w:after="0" w:line="276" w:lineRule="auto" w:before="80"/>
+        <w:jc w:val="both"/>
+      </w:pPr>
+      <w:r>
+        <w:rPr>
+          <w:b/>
           <w:i w:val="0"/>
           <w:sz w:val="24"/>
         </w:rPr>
@@ -2522,6 +3660,7 @@
     <w:p>
       <w:pPr>
         <w:spacing w:after="0" w:line="276" w:lineRule="auto"/>
+        <w:ind w:left="567"/>
         <w:jc w:val="both"/>
       </w:pPr>
       <w:r>
@@ -2530,17 +3669,97 @@
           <w:i w:val="0"/>
           <w:sz w:val="24"/>
         </w:rPr>
-        <w:t>10. Как ты проводишь время на перемене? (общаюсь с друзьями из класса; общаюсь с друзьями из других классов; читаю / сижу в телефоне; другое)</w:t>
+        <w:t>____________________________________________________________</w:t>
       </w:r>
     </w:p>
     <w:p>
       <w:pPr>
+        <w:keepNext/>
+        <w:spacing w:after="0" w:line="276" w:lineRule="auto" w:before="80"/>
+        <w:jc w:val="both"/>
+      </w:pPr>
+      <w:r>
+        <w:rPr>
+          <w:b/>
+          <w:i w:val="0"/>
+          <w:sz w:val="24"/>
+        </w:rPr>
+        <w:t>10. Как ты проводишь время на перемене? (выбери один вариант)</w:t>
+      </w:r>
+    </w:p>
+    <w:p>
+      <w:pPr>
+        <w:keepNext/>
         <w:spacing w:after="0" w:line="276" w:lineRule="auto"/>
+        <w:ind w:left="567"/>
         <w:jc w:val="both"/>
       </w:pPr>
       <w:r>
         <w:rPr>
           <w:b w:val="0"/>
+          <w:i w:val="0"/>
+          <w:sz w:val="24"/>
+        </w:rPr>
+        <w:t>•  Общаюсь с друзьями из класса</w:t>
+      </w:r>
+    </w:p>
+    <w:p>
+      <w:pPr>
+        <w:keepNext/>
+        <w:spacing w:after="0" w:line="276" w:lineRule="auto"/>
+        <w:ind w:left="567"/>
+        <w:jc w:val="both"/>
+      </w:pPr>
+      <w:r>
+        <w:rPr>
+          <w:b w:val="0"/>
+          <w:i w:val="0"/>
+          <w:sz w:val="24"/>
+        </w:rPr>
+        <w:t>•  Общаюсь с друзьями из других классов</w:t>
+      </w:r>
+    </w:p>
+    <w:p>
+      <w:pPr>
+        <w:keepNext/>
+        <w:spacing w:after="0" w:line="276" w:lineRule="auto"/>
+        <w:ind w:left="567"/>
+        <w:jc w:val="both"/>
+      </w:pPr>
+      <w:r>
+        <w:rPr>
+          <w:b w:val="0"/>
+          <w:i w:val="0"/>
+          <w:sz w:val="24"/>
+        </w:rPr>
+        <w:t>•  Читаю / сижу в телефоне</w:t>
+      </w:r>
+    </w:p>
+    <w:p>
+      <w:pPr>
+        <w:keepNext/>
+        <w:spacing w:after="0" w:line="276" w:lineRule="auto"/>
+        <w:ind w:left="567"/>
+        <w:jc w:val="both"/>
+      </w:pPr>
+      <w:r>
+        <w:rPr>
+          <w:b w:val="0"/>
+          <w:i w:val="0"/>
+          <w:sz w:val="24"/>
+        </w:rPr>
+        <w:t>•  Другое: ____________________</w:t>
+      </w:r>
+    </w:p>
+    <w:p>
+      <w:pPr>
+        <w:keepNext/>
+        <w:spacing w:after="0" w:line="276" w:lineRule="auto" w:before="80"/>
+        <w:jc w:val="both"/>
+      </w:pPr>
+      <w:r>
+        <w:rPr>
+          <w:b/>
           <w:i w:val="0"/>
           <w:sz w:val="24"/>
         </w:rPr>
@@ -2550,6 +3769,7 @@
     <w:p>
       <w:pPr>
         <w:spacing w:after="0" w:line="276" w:lineRule="auto"/>
+        <w:ind w:left="567"/>
         <w:jc w:val="both"/>
       </w:pPr>
       <w:r>
@@ -2558,7 +3778,97 @@
           <w:i w:val="0"/>
           <w:sz w:val="24"/>
         </w:rPr>
+        <w:t>1. ____________________________________________________________</w:t>
+      </w:r>
+    </w:p>
+    <w:p>
+      <w:pPr>
+        <w:spacing w:after="0" w:line="276" w:lineRule="auto"/>
+        <w:ind w:left="567"/>
+        <w:jc w:val="both"/>
+      </w:pPr>
+      <w:r>
+        <w:rPr>
+          <w:b w:val="0"/>
+          <w:i w:val="0"/>
+          <w:sz w:val="24"/>
+        </w:rPr>
+        <w:t>2. ____________________________________________________________</w:t>
+      </w:r>
+    </w:p>
+    <w:p>
+      <w:pPr>
+        <w:spacing w:after="0" w:line="276" w:lineRule="auto"/>
+        <w:ind w:left="567"/>
+        <w:jc w:val="both"/>
+      </w:pPr>
+      <w:r>
+        <w:rPr>
+          <w:b w:val="0"/>
+          <w:i w:val="0"/>
+          <w:sz w:val="24"/>
+        </w:rPr>
+        <w:t>3. ____________________________________________________________</w:t>
+      </w:r>
+    </w:p>
+    <w:p>
+      <w:pPr>
+        <w:keepNext/>
+        <w:spacing w:after="0" w:line="276" w:lineRule="auto" w:before="80"/>
+        <w:jc w:val="both"/>
+      </w:pPr>
+      <w:r>
+        <w:rPr>
+          <w:b/>
+          <w:i w:val="0"/>
+          <w:sz w:val="24"/>
+        </w:rPr>
         <w:t>12. С кем из учеников вашего класса ты хотел(а) бы готовиться к контрольной работе или делать совместный проект? Напиши 3 фамилии в порядке предпочтения.</w:t>
+      </w:r>
+    </w:p>
+    <w:p>
+      <w:pPr>
+        <w:spacing w:after="0" w:line="276" w:lineRule="auto"/>
+        <w:ind w:left="567"/>
+        <w:jc w:val="both"/>
+      </w:pPr>
+      <w:r>
+        <w:rPr>
+          <w:b w:val="0"/>
+          <w:i w:val="0"/>
+          <w:sz w:val="24"/>
+        </w:rPr>
+        <w:t>1. ____________________________________________________________</w:t>
+      </w:r>
+    </w:p>
+    <w:p>
+      <w:pPr>
+        <w:spacing w:after="0" w:line="276" w:lineRule="auto"/>
+        <w:ind w:left="567"/>
+        <w:jc w:val="both"/>
+      </w:pPr>
+      <w:r>
+        <w:rPr>
+          <w:b w:val="0"/>
+          <w:i w:val="0"/>
+          <w:sz w:val="24"/>
+        </w:rPr>
+        <w:t>2. ____________________________________________________________</w:t>
+      </w:r>
+    </w:p>
+    <w:p>
+      <w:pPr>
+        <w:spacing w:after="0" w:line="276" w:lineRule="auto"/>
+        <w:ind w:left="567"/>
+        <w:jc w:val="both"/>
+      </w:pPr>
+      <w:r>
+        <w:rPr>
+          <w:b w:val="0"/>
+          <w:i w:val="0"/>
+          <w:sz w:val="24"/>
+        </w:rPr>
+        <w:t>3. ____________________________________________________________</w:t>
       </w:r>
     </w:p>
     <w:p>
@@ -2587,6 +3897,7 @@
     </w:p>
     <w:p>
       <w:pPr>
+        <w:pageBreakBefore w:val="0"/>
         <w:spacing w:after="0" w:line="276" w:lineRule="auto"/>
         <w:jc w:val="center"/>
       </w:pPr>
@@ -3299,7 +4610,7 @@
                 <w:b/>
                 <w:sz w:val="13"/>
               </w:rPr>
-              <w:t>Сделано</w:t>
+              <w:t>Σ</w:t>
             </w:r>
           </w:p>
         </w:tc>
@@ -19327,14 +20638,9 @@
         </w:tc>
       </w:tr>
     </w:tbl>
-    <w:p/>
-    <w:p>
-      <w:r>
-        <w:br w:type="page"/>
-      </w:r>
-    </w:p>
     <w:p>
       <w:pPr>
+        <w:pageBreakBefore/>
         <w:spacing w:after="0" w:line="276" w:lineRule="auto"/>
         <w:jc w:val="center"/>
       </w:pPr>
@@ -20047,7 +21353,7 @@
                 <w:b/>
                 <w:sz w:val="13"/>
               </w:rPr>
-              <w:t>Сделано</w:t>
+              <w:t>Σ</w:t>
             </w:r>
           </w:p>
         </w:tc>
@@ -36047,7 +37353,6 @@
         </w:tc>
       </w:tr>
     </w:tbl>
-    <w:p/>
     <w:p>
       <w:pPr>
         <w:sectPr>
@@ -36060,6 +37365,8 @@
     </w:p>
     <w:p>
       <w:pPr>
+        <w:keepNext/>
+        <w:pageBreakBefore w:val="0"/>
         <w:spacing w:after="120" w:line="276" w:lineRule="auto"/>
         <w:jc w:val="center"/>
       </w:pPr>
@@ -36088,6 +37395,11 @@
             <w:tcW w:type="dxa" w:w="3969"/>
           </w:tcPr>
           <w:p>
+            <w:pPr>
+              <w:spacing w:after="0" w:line="240" w:lineRule="auto"/>
+              <w:ind w:firstLine="0"/>
+              <w:jc w:val="left"/>
+            </w:pPr>
             <w:r/>
             <w:r>
               <w:rPr>
@@ -36103,6 +37415,11 @@
             <w:tcW w:type="dxa" w:w="2551"/>
           </w:tcPr>
           <w:p>
+            <w:pPr>
+              <w:spacing w:after="0" w:line="240" w:lineRule="auto"/>
+              <w:ind w:firstLine="0"/>
+              <w:jc w:val="left"/>
+            </w:pPr>
             <w:r/>
             <w:r>
               <w:rPr>
@@ -36118,6 +37435,11 @@
             <w:tcW w:type="dxa" w:w="2551"/>
           </w:tcPr>
           <w:p>
+            <w:pPr>
+              <w:spacing w:after="0" w:line="240" w:lineRule="auto"/>
+              <w:ind w:firstLine="0"/>
+              <w:jc w:val="left"/>
+            </w:pPr>
             <w:r/>
             <w:r>
               <w:rPr>
@@ -36135,6 +37457,11 @@
             <w:tcW w:type="dxa" w:w="3969"/>
           </w:tcPr>
           <w:p>
+            <w:pPr>
+              <w:spacing w:after="0" w:line="240" w:lineRule="auto"/>
+              <w:ind w:firstLine="0"/>
+              <w:jc w:val="left"/>
+            </w:pPr>
             <w:r/>
             <w:r>
               <w:rPr>
@@ -36149,6 +37476,11 @@
             <w:tcW w:type="dxa" w:w="2551"/>
           </w:tcPr>
           <w:p>
+            <w:pPr>
+              <w:spacing w:after="0" w:line="240" w:lineRule="auto"/>
+              <w:ind w:firstLine="0"/>
+              <w:jc w:val="left"/>
+            </w:pPr>
             <w:r/>
             <w:r>
               <w:rPr>
@@ -36163,6 +37495,11 @@
             <w:tcW w:type="dxa" w:w="2551"/>
           </w:tcPr>
           <w:p>
+            <w:pPr>
+              <w:spacing w:after="0" w:line="240" w:lineRule="auto"/>
+              <w:ind w:firstLine="0"/>
+              <w:jc w:val="left"/>
+            </w:pPr>
             <w:r/>
             <w:r>
               <w:rPr>
@@ -36179,6 +37516,11 @@
             <w:tcW w:type="dxa" w:w="3969"/>
           </w:tcPr>
           <w:p>
+            <w:pPr>
+              <w:spacing w:after="0" w:line="240" w:lineRule="auto"/>
+              <w:ind w:firstLine="0"/>
+              <w:jc w:val="left"/>
+            </w:pPr>
             <w:r/>
             <w:r>
               <w:rPr>
@@ -36193,6 +37535,11 @@
             <w:tcW w:type="dxa" w:w="2551"/>
           </w:tcPr>
           <w:p>
+            <w:pPr>
+              <w:spacing w:after="0" w:line="240" w:lineRule="auto"/>
+              <w:ind w:firstLine="0"/>
+              <w:jc w:val="left"/>
+            </w:pPr>
             <w:r/>
             <w:r>
               <w:rPr>
@@ -36207,6 +37554,11 @@
             <w:tcW w:type="dxa" w:w="2551"/>
           </w:tcPr>
           <w:p>
+            <w:pPr>
+              <w:spacing w:after="0" w:line="240" w:lineRule="auto"/>
+              <w:ind w:firstLine="0"/>
+              <w:jc w:val="left"/>
+            </w:pPr>
             <w:r/>
             <w:r>
               <w:rPr>
@@ -36223,6 +37575,11 @@
             <w:tcW w:type="dxa" w:w="3969"/>
           </w:tcPr>
           <w:p>
+            <w:pPr>
+              <w:spacing w:after="0" w:line="240" w:lineRule="auto"/>
+              <w:ind w:firstLine="0"/>
+              <w:jc w:val="left"/>
+            </w:pPr>
             <w:r/>
             <w:r>
               <w:rPr>
@@ -36237,6 +37594,11 @@
             <w:tcW w:type="dxa" w:w="2551"/>
           </w:tcPr>
           <w:p>
+            <w:pPr>
+              <w:spacing w:after="0" w:line="240" w:lineRule="auto"/>
+              <w:ind w:firstLine="0"/>
+              <w:jc w:val="left"/>
+            </w:pPr>
             <w:r/>
             <w:r>
               <w:rPr>
@@ -36251,6 +37613,11 @@
             <w:tcW w:type="dxa" w:w="2551"/>
           </w:tcPr>
           <w:p>
+            <w:pPr>
+              <w:spacing w:after="0" w:line="240" w:lineRule="auto"/>
+              <w:ind w:firstLine="0"/>
+              <w:jc w:val="left"/>
+            </w:pPr>
             <w:r/>
             <w:r>
               <w:rPr>
@@ -36267,6 +37634,11 @@
             <w:tcW w:type="dxa" w:w="3969"/>
           </w:tcPr>
           <w:p>
+            <w:pPr>
+              <w:spacing w:after="0" w:line="240" w:lineRule="auto"/>
+              <w:ind w:firstLine="0"/>
+              <w:jc w:val="left"/>
+            </w:pPr>
             <w:r/>
             <w:r>
               <w:rPr>
@@ -36281,6 +37653,11 @@
             <w:tcW w:type="dxa" w:w="2551"/>
           </w:tcPr>
           <w:p>
+            <w:pPr>
+              <w:spacing w:after="0" w:line="240" w:lineRule="auto"/>
+              <w:ind w:firstLine="0"/>
+              <w:jc w:val="left"/>
+            </w:pPr>
             <w:r/>
             <w:r>
               <w:rPr>
@@ -36295,6 +37672,11 @@
             <w:tcW w:type="dxa" w:w="2551"/>
           </w:tcPr>
           <w:p>
+            <w:pPr>
+              <w:spacing w:after="0" w:line="240" w:lineRule="auto"/>
+              <w:ind w:firstLine="0"/>
+              <w:jc w:val="left"/>
+            </w:pPr>
             <w:r/>
             <w:r>
               <w:rPr>
@@ -36311,6 +37693,11 @@
             <w:tcW w:type="dxa" w:w="3969"/>
           </w:tcPr>
           <w:p>
+            <w:pPr>
+              <w:spacing w:after="0" w:line="240" w:lineRule="auto"/>
+              <w:ind w:firstLine="0"/>
+              <w:jc w:val="left"/>
+            </w:pPr>
             <w:r/>
             <w:r>
               <w:rPr>
@@ -36325,6 +37712,11 @@
             <w:tcW w:type="dxa" w:w="2551"/>
           </w:tcPr>
           <w:p>
+            <w:pPr>
+              <w:spacing w:after="0" w:line="240" w:lineRule="auto"/>
+              <w:ind w:firstLine="0"/>
+              <w:jc w:val="left"/>
+            </w:pPr>
             <w:r/>
             <w:r>
               <w:rPr>
@@ -36339,6 +37731,11 @@
             <w:tcW w:type="dxa" w:w="2551"/>
           </w:tcPr>
           <w:p>
+            <w:pPr>
+              <w:spacing w:after="0" w:line="240" w:lineRule="auto"/>
+              <w:ind w:firstLine="0"/>
+              <w:jc w:val="left"/>
+            </w:pPr>
             <w:r/>
             <w:r>
               <w:rPr>
@@ -36355,6 +37752,11 @@
             <w:tcW w:type="dxa" w:w="3969"/>
           </w:tcPr>
           <w:p>
+            <w:pPr>
+              <w:spacing w:after="0" w:line="240" w:lineRule="auto"/>
+              <w:ind w:firstLine="0"/>
+              <w:jc w:val="left"/>
+            </w:pPr>
             <w:r/>
             <w:r>
               <w:rPr>
@@ -36369,6 +37771,11 @@
             <w:tcW w:type="dxa" w:w="2551"/>
           </w:tcPr>
           <w:p>
+            <w:pPr>
+              <w:spacing w:after="0" w:line="240" w:lineRule="auto"/>
+              <w:ind w:firstLine="0"/>
+              <w:jc w:val="left"/>
+            </w:pPr>
             <w:r/>
             <w:r>
               <w:rPr>
@@ -36383,6 +37790,11 @@
             <w:tcW w:type="dxa" w:w="2551"/>
           </w:tcPr>
           <w:p>
+            <w:pPr>
+              <w:spacing w:after="0" w:line="240" w:lineRule="auto"/>
+              <w:ind w:firstLine="0"/>
+              <w:jc w:val="left"/>
+            </w:pPr>
             <w:r/>
             <w:r>
               <w:rPr>
@@ -36399,6 +37811,11 @@
             <w:tcW w:type="dxa" w:w="3969"/>
           </w:tcPr>
           <w:p>
+            <w:pPr>
+              <w:spacing w:after="0" w:line="240" w:lineRule="auto"/>
+              <w:ind w:firstLine="0"/>
+              <w:jc w:val="left"/>
+            </w:pPr>
             <w:r/>
             <w:r>
               <w:rPr>
@@ -36413,6 +37830,11 @@
             <w:tcW w:type="dxa" w:w="2551"/>
           </w:tcPr>
           <w:p>
+            <w:pPr>
+              <w:spacing w:after="0" w:line="240" w:lineRule="auto"/>
+              <w:ind w:firstLine="0"/>
+              <w:jc w:val="left"/>
+            </w:pPr>
             <w:r/>
             <w:r>
               <w:rPr>
@@ -36427,6 +37849,11 @@
             <w:tcW w:type="dxa" w:w="2551"/>
           </w:tcPr>
           <w:p>
+            <w:pPr>
+              <w:spacing w:after="0" w:line="240" w:lineRule="auto"/>
+              <w:ind w:firstLine="0"/>
+              <w:jc w:val="left"/>
+            </w:pPr>
             <w:r/>
             <w:r>
               <w:rPr>
@@ -36443,6 +37870,11 @@
             <w:tcW w:type="dxa" w:w="3969"/>
           </w:tcPr>
           <w:p>
+            <w:pPr>
+              <w:spacing w:after="0" w:line="240" w:lineRule="auto"/>
+              <w:ind w:firstLine="0"/>
+              <w:jc w:val="left"/>
+            </w:pPr>
             <w:r/>
             <w:r>
               <w:rPr>
@@ -36457,6 +37889,11 @@
             <w:tcW w:type="dxa" w:w="2551"/>
           </w:tcPr>
           <w:p>
+            <w:pPr>
+              <w:spacing w:after="0" w:line="240" w:lineRule="auto"/>
+              <w:ind w:firstLine="0"/>
+              <w:jc w:val="left"/>
+            </w:pPr>
             <w:r/>
             <w:r>
               <w:rPr>
@@ -36471,6 +37908,11 @@
             <w:tcW w:type="dxa" w:w="2551"/>
           </w:tcPr>
           <w:p>
+            <w:pPr>
+              <w:spacing w:after="0" w:line="240" w:lineRule="auto"/>
+              <w:ind w:firstLine="0"/>
+              <w:jc w:val="left"/>
+            </w:pPr>
             <w:r/>
             <w:r>
               <w:rPr>
@@ -36487,6 +37929,11 @@
             <w:tcW w:type="dxa" w:w="3969"/>
           </w:tcPr>
           <w:p>
+            <w:pPr>
+              <w:spacing w:after="0" w:line="240" w:lineRule="auto"/>
+              <w:ind w:firstLine="0"/>
+              <w:jc w:val="left"/>
+            </w:pPr>
             <w:r/>
             <w:r>
               <w:rPr>
@@ -36501,6 +37948,11 @@
             <w:tcW w:type="dxa" w:w="2551"/>
           </w:tcPr>
           <w:p>
+            <w:pPr>
+              <w:spacing w:after="0" w:line="240" w:lineRule="auto"/>
+              <w:ind w:firstLine="0"/>
+              <w:jc w:val="left"/>
+            </w:pPr>
             <w:r/>
             <w:r>
               <w:rPr>
@@ -36515,6 +37967,11 @@
             <w:tcW w:type="dxa" w:w="2551"/>
           </w:tcPr>
           <w:p>
+            <w:pPr>
+              <w:spacing w:after="0" w:line="240" w:lineRule="auto"/>
+              <w:ind w:firstLine="0"/>
+              <w:jc w:val="left"/>
+            </w:pPr>
             <w:r/>
             <w:r>
               <w:rPr>
@@ -36557,6 +38014,11 @@
             <w:tcW w:type="dxa" w:w="2268"/>
           </w:tcPr>
           <w:p>
+            <w:pPr>
+              <w:spacing w:after="0" w:line="240" w:lineRule="auto"/>
+              <w:ind w:firstLine="0"/>
+              <w:jc w:val="left"/>
+            </w:pPr>
             <w:r/>
             <w:r>
               <w:rPr>
@@ -36572,6 +38034,11 @@
             <w:tcW w:type="dxa" w:w="3402"/>
           </w:tcPr>
           <w:p>
+            <w:pPr>
+              <w:spacing w:after="0" w:line="240" w:lineRule="auto"/>
+              <w:ind w:firstLine="0"/>
+              <w:jc w:val="left"/>
+            </w:pPr>
             <w:r/>
             <w:r>
               <w:rPr>
@@ -36587,6 +38054,11 @@
             <w:tcW w:type="dxa" w:w="3402"/>
           </w:tcPr>
           <w:p>
+            <w:pPr>
+              <w:spacing w:after="0" w:line="240" w:lineRule="auto"/>
+              <w:ind w:firstLine="0"/>
+              <w:jc w:val="left"/>
+            </w:pPr>
             <w:r/>
             <w:r>
               <w:rPr>
@@ -36604,6 +38076,11 @@
             <w:tcW w:type="dxa" w:w="2268"/>
           </w:tcPr>
           <w:p>
+            <w:pPr>
+              <w:spacing w:after="0" w:line="240" w:lineRule="auto"/>
+              <w:ind w:firstLine="0"/>
+              <w:jc w:val="left"/>
+            </w:pPr>
             <w:r/>
             <w:r>
               <w:rPr>
@@ -36618,6 +38095,11 @@
             <w:tcW w:type="dxa" w:w="3402"/>
           </w:tcPr>
           <w:p>
+            <w:pPr>
+              <w:spacing w:after="0" w:line="240" w:lineRule="auto"/>
+              <w:ind w:firstLine="0"/>
+              <w:jc w:val="left"/>
+            </w:pPr>
             <w:r/>
             <w:r>
               <w:rPr>
@@ -36632,6 +38114,11 @@
             <w:tcW w:type="dxa" w:w="3402"/>
           </w:tcPr>
           <w:p>
+            <w:pPr>
+              <w:spacing w:after="0" w:line="240" w:lineRule="auto"/>
+              <w:ind w:firstLine="0"/>
+              <w:jc w:val="left"/>
+            </w:pPr>
             <w:r/>
             <w:r>
               <w:rPr>
@@ -36648,6 +38135,11 @@
             <w:tcW w:type="dxa" w:w="2268"/>
           </w:tcPr>
           <w:p>
+            <w:pPr>
+              <w:spacing w:after="0" w:line="240" w:lineRule="auto"/>
+              <w:ind w:firstLine="0"/>
+              <w:jc w:val="left"/>
+            </w:pPr>
             <w:r/>
             <w:r>
               <w:rPr>
@@ -36662,6 +38154,11 @@
             <w:tcW w:type="dxa" w:w="3402"/>
           </w:tcPr>
           <w:p>
+            <w:pPr>
+              <w:spacing w:after="0" w:line="240" w:lineRule="auto"/>
+              <w:ind w:firstLine="0"/>
+              <w:jc w:val="left"/>
+            </w:pPr>
             <w:r/>
             <w:r>
               <w:rPr>
@@ -36676,6 +38173,11 @@
             <w:tcW w:type="dxa" w:w="3402"/>
           </w:tcPr>
           <w:p>
+            <w:pPr>
+              <w:spacing w:after="0" w:line="240" w:lineRule="auto"/>
+              <w:ind w:firstLine="0"/>
+              <w:jc w:val="left"/>
+            </w:pPr>
             <w:r/>
             <w:r>
               <w:rPr>
@@ -36692,6 +38194,11 @@
             <w:tcW w:type="dxa" w:w="2268"/>
           </w:tcPr>
           <w:p>
+            <w:pPr>
+              <w:spacing w:after="0" w:line="240" w:lineRule="auto"/>
+              <w:ind w:firstLine="0"/>
+              <w:jc w:val="left"/>
+            </w:pPr>
             <w:r/>
             <w:r>
               <w:rPr>
@@ -36706,6 +38213,11 @@
             <w:tcW w:type="dxa" w:w="3402"/>
           </w:tcPr>
           <w:p>
+            <w:pPr>
+              <w:spacing w:after="0" w:line="240" w:lineRule="auto"/>
+              <w:ind w:firstLine="0"/>
+              <w:jc w:val="left"/>
+            </w:pPr>
             <w:r/>
             <w:r>
               <w:rPr>
@@ -36720,6 +38232,11 @@
             <w:tcW w:type="dxa" w:w="3402"/>
           </w:tcPr>
           <w:p>
+            <w:pPr>
+              <w:spacing w:after="0" w:line="240" w:lineRule="auto"/>
+              <w:ind w:firstLine="0"/>
+              <w:jc w:val="left"/>
+            </w:pPr>
             <w:r/>
             <w:r>
               <w:rPr>
@@ -36736,6 +38253,11 @@
             <w:tcW w:type="dxa" w:w="2268"/>
           </w:tcPr>
           <w:p>
+            <w:pPr>
+              <w:spacing w:after="0" w:line="240" w:lineRule="auto"/>
+              <w:ind w:firstLine="0"/>
+              <w:jc w:val="left"/>
+            </w:pPr>
             <w:r/>
             <w:r>
               <w:rPr>
@@ -36750,6 +38272,11 @@
             <w:tcW w:type="dxa" w:w="3402"/>
           </w:tcPr>
           <w:p>
+            <w:pPr>
+              <w:spacing w:after="0" w:line="240" w:lineRule="auto"/>
+              <w:ind w:firstLine="0"/>
+              <w:jc w:val="left"/>
+            </w:pPr>
             <w:r/>
             <w:r>
               <w:rPr>
@@ -36764,6 +38291,11 @@
             <w:tcW w:type="dxa" w:w="3402"/>
           </w:tcPr>
           <w:p>
+            <w:pPr>
+              <w:spacing w:after="0" w:line="240" w:lineRule="auto"/>
+              <w:ind w:firstLine="0"/>
+              <w:jc w:val="left"/>
+            </w:pPr>
             <w:r/>
             <w:r>
               <w:rPr>
@@ -36971,6 +38503,8 @@
     </w:p>
     <w:p>
       <w:pPr>
+        <w:keepNext/>
+        <w:pageBreakBefore/>
         <w:spacing w:after="120" w:line="276" w:lineRule="auto"/>
         <w:jc w:val="center"/>
       </w:pPr>
@@ -36998,6 +38532,11 @@
             <w:tcW w:type="dxa" w:w="3118"/>
           </w:tcPr>
           <w:p>
+            <w:pPr>
+              <w:spacing w:after="0" w:line="240" w:lineRule="auto"/>
+              <w:ind w:firstLine="0"/>
+              <w:jc w:val="left"/>
+            </w:pPr>
             <w:r/>
             <w:r>
               <w:rPr>
@@ -37013,6 +38552,11 @@
             <w:tcW w:type="dxa" w:w="5953"/>
           </w:tcPr>
           <w:p>
+            <w:pPr>
+              <w:spacing w:after="0" w:line="240" w:lineRule="auto"/>
+              <w:ind w:firstLine="0"/>
+              <w:jc w:val="left"/>
+            </w:pPr>
             <w:r/>
             <w:r>
               <w:rPr>
@@ -37030,6 +38574,11 @@
             <w:tcW w:type="dxa" w:w="3118"/>
           </w:tcPr>
           <w:p>
+            <w:pPr>
+              <w:spacing w:after="0" w:line="240" w:lineRule="auto"/>
+              <w:ind w:firstLine="0"/>
+              <w:jc w:val="left"/>
+            </w:pPr>
             <w:r/>
             <w:r>
               <w:rPr>
@@ -37044,6 +38593,11 @@
             <w:tcW w:type="dxa" w:w="5953"/>
           </w:tcPr>
           <w:p>
+            <w:pPr>
+              <w:spacing w:after="0" w:line="240" w:lineRule="auto"/>
+              <w:ind w:firstLine="0"/>
+              <w:jc w:val="left"/>
+            </w:pPr>
             <w:r/>
             <w:r>
               <w:rPr>
@@ -37060,6 +38614,11 @@
             <w:tcW w:type="dxa" w:w="3118"/>
           </w:tcPr>
           <w:p>
+            <w:pPr>
+              <w:spacing w:after="0" w:line="240" w:lineRule="auto"/>
+              <w:ind w:firstLine="0"/>
+              <w:jc w:val="left"/>
+            </w:pPr>
             <w:r/>
             <w:r>
               <w:rPr>
@@ -37074,6 +38633,11 @@
             <w:tcW w:type="dxa" w:w="5953"/>
           </w:tcPr>
           <w:p>
+            <w:pPr>
+              <w:spacing w:after="0" w:line="240" w:lineRule="auto"/>
+              <w:ind w:firstLine="0"/>
+              <w:jc w:val="left"/>
+            </w:pPr>
             <w:r/>
             <w:r>
               <w:rPr>
@@ -37090,6 +38654,11 @@
             <w:tcW w:type="dxa" w:w="3118"/>
           </w:tcPr>
           <w:p>
+            <w:pPr>
+              <w:spacing w:after="0" w:line="240" w:lineRule="auto"/>
+              <w:ind w:firstLine="0"/>
+              <w:jc w:val="left"/>
+            </w:pPr>
             <w:r/>
             <w:r>
               <w:rPr>
@@ -37104,6 +38673,11 @@
             <w:tcW w:type="dxa" w:w="5953"/>
           </w:tcPr>
           <w:p>
+            <w:pPr>
+              <w:spacing w:after="0" w:line="240" w:lineRule="auto"/>
+              <w:ind w:firstLine="0"/>
+              <w:jc w:val="left"/>
+            </w:pPr>
             <w:r/>
             <w:r>
               <w:rPr>
@@ -37120,6 +38694,11 @@
             <w:tcW w:type="dxa" w:w="3118"/>
           </w:tcPr>
           <w:p>
+            <w:pPr>
+              <w:spacing w:after="0" w:line="240" w:lineRule="auto"/>
+              <w:ind w:firstLine="0"/>
+              <w:jc w:val="left"/>
+            </w:pPr>
             <w:r/>
             <w:r>
               <w:rPr>
@@ -37134,6 +38713,11 @@
             <w:tcW w:type="dxa" w:w="5953"/>
           </w:tcPr>
           <w:p>
+            <w:pPr>
+              <w:spacing w:after="0" w:line="240" w:lineRule="auto"/>
+              <w:ind w:firstLine="0"/>
+              <w:jc w:val="left"/>
+            </w:pPr>
             <w:r/>
             <w:r>
               <w:rPr>
@@ -37150,6 +38734,11 @@
             <w:tcW w:type="dxa" w:w="3118"/>
           </w:tcPr>
           <w:p>
+            <w:pPr>
+              <w:spacing w:after="0" w:line="240" w:lineRule="auto"/>
+              <w:ind w:firstLine="0"/>
+              <w:jc w:val="left"/>
+            </w:pPr>
             <w:r/>
             <w:r>
               <w:rPr>
@@ -37164,6 +38753,11 @@
             <w:tcW w:type="dxa" w:w="5953"/>
           </w:tcPr>
           <w:p>
+            <w:pPr>
+              <w:spacing w:after="0" w:line="240" w:lineRule="auto"/>
+              <w:ind w:firstLine="0"/>
+              <w:jc w:val="left"/>
+            </w:pPr>
             <w:r/>
             <w:r>
               <w:rPr>
@@ -37180,6 +38774,11 @@
             <w:tcW w:type="dxa" w:w="3118"/>
           </w:tcPr>
           <w:p>
+            <w:pPr>
+              <w:spacing w:after="0" w:line="240" w:lineRule="auto"/>
+              <w:ind w:firstLine="0"/>
+              <w:jc w:val="left"/>
+            </w:pPr>
             <w:r/>
             <w:r>
               <w:rPr>
@@ -37194,6 +38793,11 @@
             <w:tcW w:type="dxa" w:w="5953"/>
           </w:tcPr>
           <w:p>
+            <w:pPr>
+              <w:spacing w:after="0" w:line="240" w:lineRule="auto"/>
+              <w:ind w:firstLine="0"/>
+              <w:jc w:val="left"/>
+            </w:pPr>
             <w:r/>
             <w:r>
               <w:rPr>
@@ -37210,6 +38814,11 @@
             <w:tcW w:type="dxa" w:w="3118"/>
           </w:tcPr>
           <w:p>
+            <w:pPr>
+              <w:spacing w:after="0" w:line="240" w:lineRule="auto"/>
+              <w:ind w:firstLine="0"/>
+              <w:jc w:val="left"/>
+            </w:pPr>
             <w:r/>
             <w:r>
               <w:rPr>
@@ -37224,6 +38833,11 @@
             <w:tcW w:type="dxa" w:w="5953"/>
           </w:tcPr>
           <w:p>
+            <w:pPr>
+              <w:spacing w:after="0" w:line="240" w:lineRule="auto"/>
+              <w:ind w:firstLine="0"/>
+              <w:jc w:val="left"/>
+            </w:pPr>
             <w:r/>
             <w:r>
               <w:rPr>
@@ -37240,6 +38854,11 @@
             <w:tcW w:type="dxa" w:w="3118"/>
           </w:tcPr>
           <w:p>
+            <w:pPr>
+              <w:spacing w:after="0" w:line="240" w:lineRule="auto"/>
+              <w:ind w:firstLine="0"/>
+              <w:jc w:val="left"/>
+            </w:pPr>
             <w:r/>
             <w:r>
               <w:rPr>
@@ -37254,6 +38873,11 @@
             <w:tcW w:type="dxa" w:w="5953"/>
           </w:tcPr>
           <w:p>
+            <w:pPr>
+              <w:spacing w:after="0" w:line="240" w:lineRule="auto"/>
+              <w:ind w:firstLine="0"/>
+              <w:jc w:val="left"/>
+            </w:pPr>
             <w:r/>
             <w:r>
               <w:rPr>
@@ -37295,12 +38919,9 @@
       </w:r>
     </w:p>
     <w:p>
-      <w:r>
-        <w:br w:type="page"/>
-      </w:r>
-    </w:p>
-    <w:p>
       <w:pPr>
+        <w:keepNext/>
+        <w:pageBreakBefore/>
         <w:spacing w:after="120" w:line="276" w:lineRule="auto"/>
         <w:jc w:val="center"/>
       </w:pPr>
@@ -37309,7 +38930,7 @@
           <w:b/>
           <w:i w:val="0"/>
         </w:rPr>
-        <w:t>Социограммы</w:t>
+        <w:t>Социограмма 1. Эмоциональный критерий</w:t>
       </w:r>
     </w:p>
     <w:p>
@@ -37349,6 +38970,35 @@
             </a:graphic>
           </wp:inline>
         </w:drawing>
+      </w:r>
+    </w:p>
+    <w:p>
+      <w:pPr>
+        <w:spacing w:after="0" w:line="276" w:lineRule="auto"/>
+        <w:jc w:val="both"/>
+      </w:pPr>
+      <w:r>
+        <w:rPr>
+          <w:b w:val="0"/>
+          <w:i/>
+          <w:sz w:val="22"/>
+        </w:rPr>
+        <w:t>Номера соответствуют Приложению 1. Красные двусторонние стрелки — взаимные выборы, синие — односторонние. Пунктиром обведены обучающиеся, не заполнявшие анкету: они получали выборы, но сами их не делали. В скобках — число полученных выборов.</w:t>
+      </w:r>
+    </w:p>
+    <w:p>
+      <w:pPr>
+        <w:keepNext/>
+        <w:pageBreakBefore/>
+        <w:spacing w:after="120" w:line="276" w:lineRule="auto"/>
+        <w:jc w:val="center"/>
+      </w:pPr>
+      <w:r>
+        <w:rPr>
+          <w:b/>
+          <w:i w:val="0"/>
+        </w:rPr>
+        <w:t>Социограмма 2. Деловой критерий</w:t>
       </w:r>
     </w:p>
     <w:p>
@@ -37405,12 +39055,9 @@
       </w:r>
     </w:p>
     <w:p>
-      <w:r>
-        <w:br w:type="page"/>
-      </w:r>
-    </w:p>
-    <w:p>
       <w:pPr>
+        <w:keepNext/>
+        <w:pageBreakBefore/>
         <w:spacing w:after="120" w:line="276" w:lineRule="auto"/>
         <w:jc w:val="center"/>
       </w:pPr>
@@ -37462,13 +39109,61 @@
           <w:i w:val="0"/>
         </w:rPr>
         <w:t>Коэффициент взаимности высокий: 49 % по эмоциональному критерию и 39 % по деловому, или 62 и 50 %, если учитывать только выборы в адрес заполнивших анкету. Взаимных пар 16 и 11 соответственно. Это говорит не о сплочённости класса в целом, а о плотных микрогруппах, внутри которых выборы почти всегда взаимны:</w:t>
-        <w:br/>
+      </w:r>
+    </w:p>
+    <w:p>
+      <w:pPr>
+        <w:spacing w:after="0" w:line="276" w:lineRule="auto"/>
+        <w:ind w:left="709"/>
+        <w:jc w:val="both"/>
+      </w:pPr>
+      <w:r>
+        <w:rPr>
+          <w:b w:val="0"/>
+          <w:i w:val="0"/>
+        </w:rPr>
         <w:t>— группа девочек Бельская А. — Марчукова М. — Кораблинова А. — Евдокимова З., к которой примыкают Стрекач В. и Кирьянова Е.;</w:t>
-        <w:br/>
+      </w:r>
+    </w:p>
+    <w:p>
+      <w:pPr>
+        <w:spacing w:after="0" w:line="276" w:lineRule="auto"/>
+        <w:ind w:left="709"/>
+        <w:jc w:val="both"/>
+      </w:pPr>
+      <w:r>
+        <w:rPr>
+          <w:b w:val="0"/>
+          <w:i w:val="0"/>
+        </w:rPr>
         <w:t>— группа мальчиков Спирин Р. — Бабишев А. — Разумный Е. — Нестеренко К. (с выборами в адрес Шкурлетова);</w:t>
-        <w:br/>
+      </w:r>
+    </w:p>
+    <w:p>
+      <w:pPr>
+        <w:spacing w:after="0" w:line="276" w:lineRule="auto"/>
+        <w:ind w:left="709"/>
+        <w:jc w:val="both"/>
+      </w:pPr>
+      <w:r>
+        <w:rPr>
+          <w:b w:val="0"/>
+          <w:i w:val="0"/>
+        </w:rPr>
         <w:t>— группа мальчиков Карцев С. — Поливаев М. — Шульгин Т. (все связи взаимны) с выборами в адрес Кострова;</w:t>
-        <w:br/>
+      </w:r>
+    </w:p>
+    <w:p>
+      <w:pPr>
+        <w:spacing w:after="0" w:line="276" w:lineRule="auto"/>
+        <w:ind w:left="709"/>
+        <w:jc w:val="both"/>
+      </w:pPr>
+      <w:r>
+        <w:rPr>
+          <w:b w:val="0"/>
+          <w:i w:val="0"/>
+        </w:rPr>
         <w:t>— пары и небольшие группы Колчин М. — Новиков М. (с выборами в адрес Черникова Ф. и Рягузова М.) и Колчина В. — Лубошева М. (с выборами в адрес Белявцевой В.).</w:t>
       </w:r>
     </w:p>
@@ -37544,6 +39239,8 @@
     </w:p>
     <w:p>
       <w:pPr>
+        <w:keepNext/>
+        <w:pageBreakBefore w:val="0"/>
         <w:spacing w:after="120" w:line="276" w:lineRule="auto"/>
         <w:jc w:val="center"/>
       </w:pPr>
@@ -37655,6 +39352,8 @@
     </w:p>
     <w:p>
       <w:pPr>
+        <w:keepNext/>
+        <w:pageBreakBefore w:val="0"/>
         <w:spacing w:after="120" w:line="276" w:lineRule="auto"/>
         <w:jc w:val="center"/>
       </w:pPr>
@@ -37766,6 +39465,8 @@
     </w:p>
     <w:p>
       <w:pPr>
+        <w:keepNext/>
+        <w:pageBreakBefore w:val="0"/>
         <w:spacing w:after="120" w:line="276" w:lineRule="auto"/>
         <w:jc w:val="center"/>
       </w:pPr>

</xml_diff>

<commit_message>
Sociometry 7-B: attach illegible choices to closest surnames
Co-Authored-By: Claude Opus 5.5 <noreply@anthropic.com>
Claude-Session: https://claude.ai/code/session_01GFu2W451x5XtQ2jX1R5bt2
</commit_message>
<xml_diff>
--- a/praktika/sociometria_7B/Sociometria_7B.docx
+++ b/praktika/sociometria_7B/Sociometria_7B.docx
@@ -12629,6 +12629,7 @@
               <w:rPr>
                 <w:sz w:val="13"/>
               </w:rPr>
+              <w:t>+</w:t>
             </w:r>
           </w:p>
         </w:tc>
@@ -12870,7 +12871,7 @@
               <w:rPr>
                 <w:sz w:val="13"/>
               </w:rPr>
-              <w:t>2</w:t>
+              <w:t>3</w:t>
             </w:r>
           </w:p>
         </w:tc>
@@ -17472,109 +17473,110 @@
               <w:rPr>
                 <w:sz w:val="13"/>
               </w:rPr>
-            </w:r>
-          </w:p>
-        </w:tc>
-        <w:tc>
-          <w:tcPr>
-            <w:tcW w:type="dxa" w:w="351"/>
-          </w:tcPr>
-          <w:p>
-            <w:pPr>
-              <w:spacing w:after="0" w:before="0" w:line="240" w:lineRule="auto"/>
-              <w:jc w:val="center"/>
-            </w:pPr>
-            <w:r/>
-            <w:r>
-              <w:rPr>
-                <w:sz w:val="13"/>
-              </w:rPr>
-            </w:r>
-          </w:p>
-        </w:tc>
-        <w:tc>
-          <w:tcPr>
-            <w:tcW w:type="dxa" w:w="351"/>
-          </w:tcPr>
-          <w:p>
-            <w:pPr>
-              <w:spacing w:after="0" w:before="0" w:line="240" w:lineRule="auto"/>
-              <w:jc w:val="center"/>
-            </w:pPr>
-            <w:r/>
-            <w:r>
-              <w:rPr>
-                <w:sz w:val="13"/>
-              </w:rPr>
-            </w:r>
-          </w:p>
-        </w:tc>
-        <w:tc>
-          <w:tcPr>
-            <w:tcW w:type="dxa" w:w="351"/>
-          </w:tcPr>
-          <w:p>
-            <w:pPr>
-              <w:spacing w:after="0" w:before="0" w:line="240" w:lineRule="auto"/>
-              <w:jc w:val="center"/>
-            </w:pPr>
-            <w:r/>
-            <w:r>
-              <w:rPr>
-                <w:sz w:val="13"/>
-              </w:rPr>
-            </w:r>
-          </w:p>
-        </w:tc>
-        <w:tc>
-          <w:tcPr>
-            <w:tcW w:type="dxa" w:w="351"/>
-          </w:tcPr>
-          <w:p>
-            <w:pPr>
-              <w:spacing w:after="0" w:before="0" w:line="240" w:lineRule="auto"/>
-              <w:jc w:val="center"/>
-            </w:pPr>
-            <w:r/>
-            <w:r>
-              <w:rPr>
-                <w:sz w:val="13"/>
-              </w:rPr>
-            </w:r>
-          </w:p>
-        </w:tc>
-        <w:tc>
-          <w:tcPr>
-            <w:tcW w:type="dxa" w:w="351"/>
-          </w:tcPr>
-          <w:p>
-            <w:pPr>
-              <w:spacing w:after="0" w:before="0" w:line="240" w:lineRule="auto"/>
-              <w:jc w:val="center"/>
-            </w:pPr>
-            <w:r/>
-            <w:r>
-              <w:rPr>
-                <w:sz w:val="13"/>
-              </w:rPr>
-            </w:r>
-          </w:p>
-        </w:tc>
-        <w:tc>
-          <w:tcPr>
-            <w:tcW w:type="dxa" w:w="351"/>
-          </w:tcPr>
-          <w:p>
-            <w:pPr>
-              <w:spacing w:after="0" w:before="0" w:line="240" w:lineRule="auto"/>
-              <w:jc w:val="center"/>
-            </w:pPr>
-            <w:r/>
-            <w:r>
-              <w:rPr>
-                <w:sz w:val="13"/>
-              </w:rPr>
-              <w:t>1</w:t>
+              <w:t>+</w:t>
+            </w:r>
+          </w:p>
+        </w:tc>
+        <w:tc>
+          <w:tcPr>
+            <w:tcW w:type="dxa" w:w="351"/>
+          </w:tcPr>
+          <w:p>
+            <w:pPr>
+              <w:spacing w:after="0" w:before="0" w:line="240" w:lineRule="auto"/>
+              <w:jc w:val="center"/>
+            </w:pPr>
+            <w:r/>
+            <w:r>
+              <w:rPr>
+                <w:sz w:val="13"/>
+              </w:rPr>
+            </w:r>
+          </w:p>
+        </w:tc>
+        <w:tc>
+          <w:tcPr>
+            <w:tcW w:type="dxa" w:w="351"/>
+          </w:tcPr>
+          <w:p>
+            <w:pPr>
+              <w:spacing w:after="0" w:before="0" w:line="240" w:lineRule="auto"/>
+              <w:jc w:val="center"/>
+            </w:pPr>
+            <w:r/>
+            <w:r>
+              <w:rPr>
+                <w:sz w:val="13"/>
+              </w:rPr>
+            </w:r>
+          </w:p>
+        </w:tc>
+        <w:tc>
+          <w:tcPr>
+            <w:tcW w:type="dxa" w:w="351"/>
+          </w:tcPr>
+          <w:p>
+            <w:pPr>
+              <w:spacing w:after="0" w:before="0" w:line="240" w:lineRule="auto"/>
+              <w:jc w:val="center"/>
+            </w:pPr>
+            <w:r/>
+            <w:r>
+              <w:rPr>
+                <w:sz w:val="13"/>
+              </w:rPr>
+            </w:r>
+          </w:p>
+        </w:tc>
+        <w:tc>
+          <w:tcPr>
+            <w:tcW w:type="dxa" w:w="351"/>
+          </w:tcPr>
+          <w:p>
+            <w:pPr>
+              <w:spacing w:after="0" w:before="0" w:line="240" w:lineRule="auto"/>
+              <w:jc w:val="center"/>
+            </w:pPr>
+            <w:r/>
+            <w:r>
+              <w:rPr>
+                <w:sz w:val="13"/>
+              </w:rPr>
+            </w:r>
+          </w:p>
+        </w:tc>
+        <w:tc>
+          <w:tcPr>
+            <w:tcW w:type="dxa" w:w="351"/>
+          </w:tcPr>
+          <w:p>
+            <w:pPr>
+              <w:spacing w:after="0" w:before="0" w:line="240" w:lineRule="auto"/>
+              <w:jc w:val="center"/>
+            </w:pPr>
+            <w:r/>
+            <w:r>
+              <w:rPr>
+                <w:sz w:val="13"/>
+              </w:rPr>
+            </w:r>
+          </w:p>
+        </w:tc>
+        <w:tc>
+          <w:tcPr>
+            <w:tcW w:type="dxa" w:w="351"/>
+          </w:tcPr>
+          <w:p>
+            <w:pPr>
+              <w:spacing w:after="0" w:before="0" w:line="240" w:lineRule="auto"/>
+              <w:jc w:val="center"/>
+            </w:pPr>
+            <w:r/>
+            <w:r>
+              <w:rPr>
+                <w:sz w:val="13"/>
+              </w:rPr>
+              <w:t>2</w:t>
             </w:r>
           </w:p>
         </w:tc>
@@ -19719,6 +19721,25 @@
                 <w:b/>
                 <w:sz w:val="13"/>
               </w:rPr>
+              <w:t>3</w:t>
+            </w:r>
+          </w:p>
+        </w:tc>
+        <w:tc>
+          <w:tcPr>
+            <w:tcW w:type="dxa" w:w="351"/>
+          </w:tcPr>
+          <w:p>
+            <w:pPr>
+              <w:spacing w:after="0" w:before="0" w:line="240" w:lineRule="auto"/>
+              <w:jc w:val="center"/>
+            </w:pPr>
+            <w:r/>
+            <w:r>
+              <w:rPr>
+                <w:b/>
+                <w:sz w:val="13"/>
+              </w:rPr>
               <w:t>2</w:t>
             </w:r>
           </w:p>
@@ -19757,6 +19778,101 @@
                 <w:b/>
                 <w:sz w:val="13"/>
               </w:rPr>
+              <w:t>3</w:t>
+            </w:r>
+          </w:p>
+        </w:tc>
+        <w:tc>
+          <w:tcPr>
+            <w:tcW w:type="dxa" w:w="351"/>
+          </w:tcPr>
+          <w:p>
+            <w:pPr>
+              <w:spacing w:after="0" w:before="0" w:line="240" w:lineRule="auto"/>
+              <w:jc w:val="center"/>
+            </w:pPr>
+            <w:r/>
+            <w:r>
+              <w:rPr>
+                <w:b/>
+                <w:sz w:val="13"/>
+              </w:rPr>
+              <w:t>1</w:t>
+            </w:r>
+          </w:p>
+        </w:tc>
+        <w:tc>
+          <w:tcPr>
+            <w:tcW w:type="dxa" w:w="351"/>
+          </w:tcPr>
+          <w:p>
+            <w:pPr>
+              <w:spacing w:after="0" w:before="0" w:line="240" w:lineRule="auto"/>
+              <w:jc w:val="center"/>
+            </w:pPr>
+            <w:r/>
+            <w:r>
+              <w:rPr>
+                <w:b/>
+                <w:sz w:val="13"/>
+              </w:rPr>
+              <w:t>0</w:t>
+            </w:r>
+          </w:p>
+        </w:tc>
+        <w:tc>
+          <w:tcPr>
+            <w:tcW w:type="dxa" w:w="351"/>
+          </w:tcPr>
+          <w:p>
+            <w:pPr>
+              <w:spacing w:after="0" w:before="0" w:line="240" w:lineRule="auto"/>
+              <w:jc w:val="center"/>
+            </w:pPr>
+            <w:r/>
+            <w:r>
+              <w:rPr>
+                <w:b/>
+                <w:sz w:val="13"/>
+              </w:rPr>
+              <w:t>0</w:t>
+            </w:r>
+          </w:p>
+        </w:tc>
+        <w:tc>
+          <w:tcPr>
+            <w:tcW w:type="dxa" w:w="351"/>
+          </w:tcPr>
+          <w:p>
+            <w:pPr>
+              <w:spacing w:after="0" w:before="0" w:line="240" w:lineRule="auto"/>
+              <w:jc w:val="center"/>
+            </w:pPr>
+            <w:r/>
+            <w:r>
+              <w:rPr>
+                <w:b/>
+                <w:sz w:val="13"/>
+              </w:rPr>
+              <w:t>3</w:t>
+            </w:r>
+          </w:p>
+        </w:tc>
+        <w:tc>
+          <w:tcPr>
+            <w:tcW w:type="dxa" w:w="351"/>
+          </w:tcPr>
+          <w:p>
+            <w:pPr>
+              <w:spacing w:after="0" w:before="0" w:line="240" w:lineRule="auto"/>
+              <w:jc w:val="center"/>
+            </w:pPr>
+            <w:r/>
+            <w:r>
+              <w:rPr>
+                <w:b/>
+                <w:sz w:val="13"/>
+              </w:rPr>
               <w:t>2</w:t>
             </w:r>
           </w:p>
@@ -19776,7 +19892,7 @@
                 <w:b/>
                 <w:sz w:val="13"/>
               </w:rPr>
-              <w:t>3</w:t>
+              <w:t>1</w:t>
             </w:r>
           </w:p>
         </w:tc>
@@ -19795,6 +19911,63 @@
                 <w:b/>
                 <w:sz w:val="13"/>
               </w:rPr>
+              <w:t>0</w:t>
+            </w:r>
+          </w:p>
+        </w:tc>
+        <w:tc>
+          <w:tcPr>
+            <w:tcW w:type="dxa" w:w="351"/>
+          </w:tcPr>
+          <w:p>
+            <w:pPr>
+              <w:spacing w:after="0" w:before="0" w:line="240" w:lineRule="auto"/>
+              <w:jc w:val="center"/>
+            </w:pPr>
+            <w:r/>
+            <w:r>
+              <w:rPr>
+                <w:b/>
+                <w:sz w:val="13"/>
+              </w:rPr>
+              <w:t>4</w:t>
+            </w:r>
+          </w:p>
+        </w:tc>
+        <w:tc>
+          <w:tcPr>
+            <w:tcW w:type="dxa" w:w="351"/>
+          </w:tcPr>
+          <w:p>
+            <w:pPr>
+              <w:spacing w:after="0" w:before="0" w:line="240" w:lineRule="auto"/>
+              <w:jc w:val="center"/>
+            </w:pPr>
+            <w:r/>
+            <w:r>
+              <w:rPr>
+                <w:b/>
+                <w:sz w:val="13"/>
+              </w:rPr>
+              <w:t>2</w:t>
+            </w:r>
+          </w:p>
+        </w:tc>
+        <w:tc>
+          <w:tcPr>
+            <w:tcW w:type="dxa" w:w="351"/>
+          </w:tcPr>
+          <w:p>
+            <w:pPr>
+              <w:spacing w:after="0" w:before="0" w:line="240" w:lineRule="auto"/>
+              <w:jc w:val="center"/>
+            </w:pPr>
+            <w:r/>
+            <w:r>
+              <w:rPr>
+                <w:b/>
+                <w:sz w:val="13"/>
+              </w:rPr>
               <w:t>1</w:t>
             </w:r>
           </w:p>
@@ -19814,178 +19987,7 @@
                 <w:b/>
                 <w:sz w:val="13"/>
               </w:rPr>
-              <w:t>0</w:t>
-            </w:r>
-          </w:p>
-        </w:tc>
-        <w:tc>
-          <w:tcPr>
-            <w:tcW w:type="dxa" w:w="351"/>
-          </w:tcPr>
-          <w:p>
-            <w:pPr>
-              <w:spacing w:after="0" w:before="0" w:line="240" w:lineRule="auto"/>
-              <w:jc w:val="center"/>
-            </w:pPr>
-            <w:r/>
-            <w:r>
-              <w:rPr>
-                <w:b/>
-                <w:sz w:val="13"/>
-              </w:rPr>
-              <w:t>0</w:t>
-            </w:r>
-          </w:p>
-        </w:tc>
-        <w:tc>
-          <w:tcPr>
-            <w:tcW w:type="dxa" w:w="351"/>
-          </w:tcPr>
-          <w:p>
-            <w:pPr>
-              <w:spacing w:after="0" w:before="0" w:line="240" w:lineRule="auto"/>
-              <w:jc w:val="center"/>
-            </w:pPr>
-            <w:r/>
-            <w:r>
-              <w:rPr>
-                <w:b/>
-                <w:sz w:val="13"/>
-              </w:rPr>
-              <w:t>3</w:t>
-            </w:r>
-          </w:p>
-        </w:tc>
-        <w:tc>
-          <w:tcPr>
-            <w:tcW w:type="dxa" w:w="351"/>
-          </w:tcPr>
-          <w:p>
-            <w:pPr>
-              <w:spacing w:after="0" w:before="0" w:line="240" w:lineRule="auto"/>
-              <w:jc w:val="center"/>
-            </w:pPr>
-            <w:r/>
-            <w:r>
-              <w:rPr>
-                <w:b/>
-                <w:sz w:val="13"/>
-              </w:rPr>
-              <w:t>1</w:t>
-            </w:r>
-          </w:p>
-        </w:tc>
-        <w:tc>
-          <w:tcPr>
-            <w:tcW w:type="dxa" w:w="351"/>
-          </w:tcPr>
-          <w:p>
-            <w:pPr>
-              <w:spacing w:after="0" w:before="0" w:line="240" w:lineRule="auto"/>
-              <w:jc w:val="center"/>
-            </w:pPr>
-            <w:r/>
-            <w:r>
-              <w:rPr>
-                <w:b/>
-                <w:sz w:val="13"/>
-              </w:rPr>
-              <w:t>1</w:t>
-            </w:r>
-          </w:p>
-        </w:tc>
-        <w:tc>
-          <w:tcPr>
-            <w:tcW w:type="dxa" w:w="351"/>
-          </w:tcPr>
-          <w:p>
-            <w:pPr>
-              <w:spacing w:after="0" w:before="0" w:line="240" w:lineRule="auto"/>
-              <w:jc w:val="center"/>
-            </w:pPr>
-            <w:r/>
-            <w:r>
-              <w:rPr>
-                <w:b/>
-                <w:sz w:val="13"/>
-              </w:rPr>
-              <w:t>0</w:t>
-            </w:r>
-          </w:p>
-        </w:tc>
-        <w:tc>
-          <w:tcPr>
-            <w:tcW w:type="dxa" w:w="351"/>
-          </w:tcPr>
-          <w:p>
-            <w:pPr>
-              <w:spacing w:after="0" w:before="0" w:line="240" w:lineRule="auto"/>
-              <w:jc w:val="center"/>
-            </w:pPr>
-            <w:r/>
-            <w:r>
-              <w:rPr>
-                <w:b/>
-                <w:sz w:val="13"/>
-              </w:rPr>
-              <w:t>4</w:t>
-            </w:r>
-          </w:p>
-        </w:tc>
-        <w:tc>
-          <w:tcPr>
-            <w:tcW w:type="dxa" w:w="351"/>
-          </w:tcPr>
-          <w:p>
-            <w:pPr>
-              <w:spacing w:after="0" w:before="0" w:line="240" w:lineRule="auto"/>
-              <w:jc w:val="center"/>
-            </w:pPr>
-            <w:r/>
-            <w:r>
-              <w:rPr>
-                <w:b/>
-                <w:sz w:val="13"/>
-              </w:rPr>
-              <w:t>2</w:t>
-            </w:r>
-          </w:p>
-        </w:tc>
-        <w:tc>
-          <w:tcPr>
-            <w:tcW w:type="dxa" w:w="351"/>
-          </w:tcPr>
-          <w:p>
-            <w:pPr>
-              <w:spacing w:after="0" w:before="0" w:line="240" w:lineRule="auto"/>
-              <w:jc w:val="center"/>
-            </w:pPr>
-            <w:r/>
-            <w:r>
-              <w:rPr>
-                <w:b/>
-                <w:sz w:val="13"/>
-              </w:rPr>
-              <w:t>1</w:t>
-            </w:r>
-          </w:p>
-        </w:tc>
-        <w:tc>
-          <w:tcPr>
-            <w:tcW w:type="dxa" w:w="351"/>
-          </w:tcPr>
-          <w:p>
-            <w:pPr>
-              <w:spacing w:after="0" w:before="0" w:line="240" w:lineRule="auto"/>
-              <w:jc w:val="center"/>
-            </w:pPr>
-            <w:r/>
-            <w:r>
-              <w:rPr>
-                <w:b/>
-                <w:sz w:val="13"/>
-              </w:rPr>
-              <w:t>65</w:t>
+              <w:t>67</w:t>
             </w:r>
           </w:p>
         </w:tc>
@@ -37663,7 +37665,7 @@
               <w:rPr>
                 <w:sz w:val="22"/>
               </w:rPr>
-              <w:t>65</w:t>
+              <w:t>67</w:t>
             </w:r>
           </w:p>
         </w:tc>
@@ -37722,7 +37724,7 @@
               <w:rPr>
                 <w:sz w:val="22"/>
               </w:rPr>
-              <w:t>2,1</w:t>
+              <w:t>2,2</w:t>
             </w:r>
           </w:p>
         </w:tc>
@@ -37840,7 +37842,7 @@
               <w:rPr>
                 <w:sz w:val="22"/>
               </w:rPr>
-              <w:t>49 %</w:t>
+              <w:t>48 %</w:t>
             </w:r>
           </w:p>
         </w:tc>
@@ -37899,7 +37901,7 @@
               <w:rPr>
                 <w:sz w:val="22"/>
               </w:rPr>
-              <w:t>62 %</w:t>
+              <w:t>60 %</w:t>
             </w:r>
           </w:p>
         </w:tc>
@@ -37958,7 +37960,7 @@
               <w:rPr>
                 <w:sz w:val="22"/>
               </w:rPr>
-              <w:t>4 из 65 (6 %)</w:t>
+              <w:t>4 из 67 (6 %)</w:t>
             </w:r>
           </w:p>
         </w:tc>
@@ -38164,7 +38166,7 @@
               <w:rPr>
                 <w:sz w:val="20"/>
               </w:rPr>
-              <w:t>Шкурлетов (4); Карцев С., Спирин Р., Черников Ф. (3)</w:t>
+              <w:t>Шкурлетов (4); Карцев С., Поливаев М., Спирин Р., Черников Ф. (3)</w:t>
             </w:r>
           </w:p>
         </w:tc>
@@ -38223,7 +38225,7 @@
               <w:rPr>
                 <w:sz w:val="20"/>
               </w:rPr>
-              <w:t>Бабишев А., Колчин М., Костров, Нестеренко К., Новиков М., Поливаев М., Разумный Е., Рягузов М., Шульгин Т. (2); Белявцева В., Кирьянова Е., Колчина В., Лубошева М., Мастеренко А., Машкина, Стрекач В., Чернышев, Чумакова М., Юневич (1)</w:t>
+              <w:t>Бабишев А., Колчин М., Костров, Нестеренко К., Новиков М., Разумный Е., Рягузов М., Чернышев, Шульгин Т. (2); Белявцева В., Кирьянова Е., Колчина В., Лубошева М., Мастеренко А., Машкина, Стрекач В., Чумакова М., Юневич (1)</w:t>
             </w:r>
           </w:p>
         </w:tc>
@@ -38456,7 +38458,7 @@
           <w:i w:val="0"/>
           <w:sz w:val="24"/>
         </w:rPr>
-        <w:t>— Не удалось установить, кого имели в виду: «Дима Черемисов» и «Дудак» (Хохлов М.), «Пансласт» (Нестеренко К.), «Саша …» (Бакин Г.). Эти выборы не засчитаны.</w:t>
+        <w:t>— Неразборчиво написанные фамилии отнесены к наиболее похожим фамилиям одноклассников: «Дима Черемисов» (Хохлов М.) — Чернышев, «Пансласт» (Нестеренко К.) — Поливаев М., «Дудак» (Хохлов М., вопрос 5) — Бакин Г. Выбор «Саша …» (Бакин Г.) соотнести не удалось, он не засчитан.</w:t>
       </w:r>
     </w:p>
     <w:p>
@@ -39094,7 +39096,7 @@
           <w:b w:val="0"/>
           <w:i w:val="0"/>
         </w:rPr>
-        <w:t>Наиболее высокий социометрический статус — у Бельской А. (7 выборов по обоим критериям), Марчуковой М. (6 и 7), Кораблиновой А. (6 и 5) и Евдокимовой З. (5 по эмоциональному критерию) при среднем 2,1 и 1,8. Эти же девочки чаще всего названы и как те, к кому можно обратиться за помощью (вопрос 5). Совпадение лидеров по двум критериям высокое: их выбирают и как спутниц в поездке, и как партнёров по учёбе. Среди мальчиков ярко выраженных лидеров нет; больше других выборов получили Шкурлетов, Спирин Р., Карцев С., Черников Ф. и Костров (по 3–4). Важно, что Шкурлетов, Черников Ф. и Костров анкету не заполняли, поэтому их собственные выборы неизвестны.</w:t>
+        <w:t>Наиболее высокий социометрический статус — у Бельской А. (7 выборов по обоим критериям), Марчуковой М. (6 и 7), Кораблиновой А. (6 и 5) и Евдокимовой З. (5 по эмоциональному критерию) при среднем 2,1 и 1,8. Эти же девочки чаще всего названы и как те, к кому можно обратиться за помощью (вопрос 5). Совпадение лидеров по двум критериям высокое: их выбирают и как спутниц в поездке, и как партнёров по учёбе. Среди мальчиков ярко выраженных лидеров нет; больше других выборов получили Шкурлетов, Спирин Р., Карцев С., Поливаев М., Черников Ф. и Костров (по 3–4). Важно, что Шкурлетов, Черников Ф. и Костров анкету не заполняли, поэтому их собственные выборы неизвестны.</w:t>
       </w:r>
     </w:p>
     <w:p>
@@ -39108,7 +39110,7 @@
           <w:b w:val="0"/>
           <w:i w:val="0"/>
         </w:rPr>
-        <w:t>Коэффициент взаимности высокий: 49 % по эмоциональному критерию и 39 % по деловому, или 62 и 50 %, если учитывать только выборы в адрес заполнивших анкету. Взаимных пар 16 и 11 соответственно. Это говорит не о сплочённости класса в целом, а о плотных микрогруппах, внутри которых выборы почти всегда взаимны:</w:t>
+        <w:t>Коэффициент взаимности высокий: 48 % по эмоциональному критерию и 39 % по деловому, или 60 и 50 %, если учитывать только выборы в адрес заполнивших анкету. Взаимных пар 16 и 11 соответственно. Это говорит не о сплочённости класса в целом, а о плотных микрогруппах, внутри которых выборы почти всегда взаимны:</w:t>
       </w:r>
     </w:p>
     <w:p>
@@ -39178,7 +39180,7 @@
           <w:b w:val="0"/>
           <w:i w:val="0"/>
         </w:rPr>
-        <w:t>Класс резко разделён по гендерному признаку: выборы между мальчиками и девочками составляют всего 4 из 65 (6 %) по эмоциональному и 2 из 57 (4 %) по деловому критерию. Мальчики и девочки фактически образуют два отдельных коллектива.</w:t>
+        <w:t>Класс резко разделён по гендерному признаку: выборы между мальчиками и девочками составляют всего 4 из 67 (6 %) по эмоциональному и 2 из 57 (4 %) по деловому критерию. Мальчики и девочки фактически образуют два отдельных коллектива.</w:t>
       </w:r>
     </w:p>
     <w:p>

</xml_diff>

<commit_message>
Sociometry 7-B: school No.74 Voronezh, questionnaire page flow
Co-Authored-By: Claude Opus 5.5 <noreply@anthropic.com>
Claude-Session: https://claude.ai/code/session_01GFu2W451x5XtQ2jX1R5bt2
</commit_message>
<xml_diff>
--- a/praktika/sociometria_7B/Sociometria_7B.docx
+++ b/praktika/sociometria_7B/Sociometria_7B.docx
@@ -108,7 +108,7 @@
     <w:p>
       <w:pPr>
         <w:spacing w:after="0" w:line="276" w:lineRule="auto"/>
-        <w:jc w:val="both"/>
+        <w:jc w:val="left"/>
       </w:pPr>
       <w:r>
         <w:rPr>
@@ -121,14 +121,14 @@
     <w:p>
       <w:pPr>
         <w:spacing w:after="0" w:line="276" w:lineRule="auto"/>
-        <w:jc w:val="both"/>
+        <w:jc w:val="left"/>
       </w:pPr>
       <w:r>
         <w:rPr>
           <w:b w:val="0"/>
           <w:i w:val="0"/>
         </w:rPr>
-        <w:t>Место прохождения практики: МБОУ «Образовательный центр им. А. Н. Косыгина», г. Красногорск, 7-Б класс</w:t>
+        <w:t>Место прохождения практики: МБОУ СОШ № 74, г. Воронеж, ул. Переверткина, д. 34, 7-Б класс</w:t>
       </w:r>
     </w:p>
     <w:p>
@@ -3040,7 +3040,7 @@
         <w:rPr>
           <w:b/>
           <w:i w:val="0"/>
-          <w:sz w:val="24"/>
+          <w:sz w:val="26"/>
         </w:rPr>
         <w:t>Анкета учащегося</w:t>
       </w:r>
@@ -3048,7 +3048,7 @@
     <w:p>
       <w:pPr>
         <w:spacing w:after="80" w:line="276" w:lineRule="auto"/>
-        <w:jc w:val="both"/>
+        <w:jc w:val="left"/>
       </w:pPr>
       <w:r>
         <w:rPr>
@@ -3056,14 +3056,14 @@
           <w:i w:val="0"/>
           <w:sz w:val="24"/>
         </w:rPr>
-        <w:t>Фамилия, имя: ______________________________ Класс: ________ Дата: ________</w:t>
+        <w:t>Фамилия, имя: ____________________________ Класс: _______ Дата: _______</w:t>
       </w:r>
     </w:p>
     <w:p>
       <w:pPr>
         <w:keepNext/>
-        <w:spacing w:after="0" w:line="276" w:lineRule="auto" w:before="80"/>
-        <w:jc w:val="both"/>
+        <w:spacing w:after="0" w:line="276" w:lineRule="auto" w:before="120"/>
+        <w:jc w:val="left"/>
       </w:pPr>
       <w:r>
         <w:rPr>
@@ -3079,7 +3079,7 @@
         <w:keepNext/>
         <w:spacing w:after="0" w:line="276" w:lineRule="auto"/>
         <w:ind w:left="567"/>
-        <w:jc w:val="both"/>
+        <w:jc w:val="left"/>
       </w:pPr>
       <w:r>
         <w:rPr>
@@ -3095,7 +3095,7 @@
         <w:keepNext/>
         <w:spacing w:after="0" w:line="276" w:lineRule="auto"/>
         <w:ind w:left="567"/>
-        <w:jc w:val="both"/>
+        <w:jc w:val="left"/>
       </w:pPr>
       <w:r>
         <w:rPr>
@@ -3111,7 +3111,417 @@
         <w:keepNext/>
         <w:spacing w:after="0" w:line="276" w:lineRule="auto"/>
         <w:ind w:left="567"/>
-        <w:jc w:val="both"/>
+        <w:jc w:val="left"/>
+      </w:pPr>
+      <w:r>
+        <w:rPr>
+          <w:b w:val="0"/>
+          <w:i w:val="0"/>
+          <w:sz w:val="24"/>
+        </w:rPr>
+        <w:t>•  Скорее нет</w:t>
+      </w:r>
+    </w:p>
+    <w:p>
+      <w:pPr>
+        <w:keepNext w:val="0"/>
+        <w:spacing w:after="0" w:line="276" w:lineRule="auto"/>
+        <w:ind w:left="567"/>
+        <w:jc w:val="left"/>
+      </w:pPr>
+      <w:r>
+        <w:rPr>
+          <w:b w:val="0"/>
+          <w:i w:val="0"/>
+          <w:sz w:val="24"/>
+        </w:rPr>
+        <w:t>•  Нет</w:t>
+      </w:r>
+    </w:p>
+    <w:p>
+      <w:pPr>
+        <w:keepNext/>
+        <w:spacing w:after="0" w:line="276" w:lineRule="auto" w:before="120"/>
+        <w:jc w:val="left"/>
+      </w:pPr>
+      <w:r>
+        <w:rPr>
+          <w:b/>
+          <w:i w:val="0"/>
+          <w:sz w:val="24"/>
+        </w:rPr>
+        <w:t>2. Как бы ты оценил(а) отношения с одноклассниками?</w:t>
+      </w:r>
+    </w:p>
+    <w:p>
+      <w:pPr>
+        <w:keepNext/>
+        <w:spacing w:after="0" w:line="276" w:lineRule="auto"/>
+        <w:ind w:left="567"/>
+        <w:jc w:val="left"/>
+      </w:pPr>
+      <w:r>
+        <w:rPr>
+          <w:b w:val="0"/>
+          <w:i w:val="0"/>
+          <w:sz w:val="24"/>
+        </w:rPr>
+        <w:t>•  Очень хорошие</w:t>
+      </w:r>
+    </w:p>
+    <w:p>
+      <w:pPr>
+        <w:keepNext/>
+        <w:spacing w:after="0" w:line="276" w:lineRule="auto"/>
+        <w:ind w:left="567"/>
+        <w:jc w:val="left"/>
+      </w:pPr>
+      <w:r>
+        <w:rPr>
+          <w:b w:val="0"/>
+          <w:i w:val="0"/>
+          <w:sz w:val="24"/>
+        </w:rPr>
+        <w:t>•  Хорошие</w:t>
+      </w:r>
+    </w:p>
+    <w:p>
+      <w:pPr>
+        <w:keepNext/>
+        <w:spacing w:after="0" w:line="276" w:lineRule="auto"/>
+        <w:ind w:left="567"/>
+        <w:jc w:val="left"/>
+      </w:pPr>
+      <w:r>
+        <w:rPr>
+          <w:b w:val="0"/>
+          <w:i w:val="0"/>
+          <w:sz w:val="24"/>
+        </w:rPr>
+        <w:t>•  Нормальные</w:t>
+      </w:r>
+    </w:p>
+    <w:p>
+      <w:pPr>
+        <w:keepNext w:val="0"/>
+        <w:spacing w:after="0" w:line="276" w:lineRule="auto"/>
+        <w:ind w:left="567"/>
+        <w:jc w:val="left"/>
+      </w:pPr>
+      <w:r>
+        <w:rPr>
+          <w:b w:val="0"/>
+          <w:i w:val="0"/>
+          <w:sz w:val="24"/>
+        </w:rPr>
+        <w:t>•  Не очень хорошие</w:t>
+      </w:r>
+    </w:p>
+    <w:p>
+      <w:pPr>
+        <w:keepNext/>
+        <w:spacing w:after="0" w:line="276" w:lineRule="auto" w:before="120"/>
+        <w:jc w:val="left"/>
+      </w:pPr>
+      <w:r>
+        <w:rPr>
+          <w:b/>
+          <w:i w:val="0"/>
+          <w:sz w:val="24"/>
+        </w:rPr>
+        <w:t>3. Чувствуешь ли ты себя в классе комфортно?</w:t>
+      </w:r>
+    </w:p>
+    <w:p>
+      <w:pPr>
+        <w:keepNext/>
+        <w:spacing w:after="0" w:line="276" w:lineRule="auto"/>
+        <w:ind w:left="567"/>
+        <w:jc w:val="left"/>
+      </w:pPr>
+      <w:r>
+        <w:rPr>
+          <w:b w:val="0"/>
+          <w:i w:val="0"/>
+          <w:sz w:val="24"/>
+        </w:rPr>
+        <w:t>•  Да, всегда</w:t>
+      </w:r>
+    </w:p>
+    <w:p>
+      <w:pPr>
+        <w:keepNext/>
+        <w:spacing w:after="0" w:line="276" w:lineRule="auto"/>
+        <w:ind w:left="567"/>
+        <w:jc w:val="left"/>
+      </w:pPr>
+      <w:r>
+        <w:rPr>
+          <w:b w:val="0"/>
+          <w:i w:val="0"/>
+          <w:sz w:val="24"/>
+        </w:rPr>
+        <w:t>•  Обычно да</w:t>
+      </w:r>
+    </w:p>
+    <w:p>
+      <w:pPr>
+        <w:keepNext/>
+        <w:spacing w:after="0" w:line="276" w:lineRule="auto"/>
+        <w:ind w:left="567"/>
+        <w:jc w:val="left"/>
+      </w:pPr>
+      <w:r>
+        <w:rPr>
+          <w:b w:val="0"/>
+          <w:i w:val="0"/>
+          <w:sz w:val="24"/>
+        </w:rPr>
+        <w:t>•  Иногда нет</w:t>
+      </w:r>
+    </w:p>
+    <w:p>
+      <w:pPr>
+        <w:keepNext w:val="0"/>
+        <w:spacing w:after="0" w:line="276" w:lineRule="auto"/>
+        <w:ind w:left="567"/>
+        <w:jc w:val="left"/>
+      </w:pPr>
+      <w:r>
+        <w:rPr>
+          <w:b w:val="0"/>
+          <w:i w:val="0"/>
+          <w:sz w:val="24"/>
+        </w:rPr>
+        <w:t>•  Чаще нет</w:t>
+      </w:r>
+    </w:p>
+    <w:p>
+      <w:pPr>
+        <w:keepNext/>
+        <w:spacing w:after="0" w:line="276" w:lineRule="auto" w:before="120"/>
+        <w:jc w:val="left"/>
+      </w:pPr>
+      <w:r>
+        <w:rPr>
+          <w:b/>
+          <w:i w:val="0"/>
+          <w:sz w:val="24"/>
+        </w:rPr>
+        <w:t>4. Бывают ли в классе ссоры и конфликты?</w:t>
+      </w:r>
+    </w:p>
+    <w:p>
+      <w:pPr>
+        <w:keepNext/>
+        <w:spacing w:after="0" w:line="276" w:lineRule="auto"/>
+        <w:ind w:left="567"/>
+        <w:jc w:val="left"/>
+      </w:pPr>
+      <w:r>
+        <w:rPr>
+          <w:b w:val="0"/>
+          <w:i w:val="0"/>
+          <w:sz w:val="24"/>
+        </w:rPr>
+        <w:t>•  Очень редко</w:t>
+      </w:r>
+    </w:p>
+    <w:p>
+      <w:pPr>
+        <w:keepNext/>
+        <w:spacing w:after="0" w:line="276" w:lineRule="auto"/>
+        <w:ind w:left="567"/>
+        <w:jc w:val="left"/>
+      </w:pPr>
+      <w:r>
+        <w:rPr>
+          <w:b w:val="0"/>
+          <w:i w:val="0"/>
+          <w:sz w:val="24"/>
+        </w:rPr>
+        <w:t>•  Иногда</w:t>
+      </w:r>
+    </w:p>
+    <w:p>
+      <w:pPr>
+        <w:keepNext/>
+        <w:spacing w:after="0" w:line="276" w:lineRule="auto"/>
+        <w:ind w:left="567"/>
+        <w:jc w:val="left"/>
+      </w:pPr>
+      <w:r>
+        <w:rPr>
+          <w:b w:val="0"/>
+          <w:i w:val="0"/>
+          <w:sz w:val="24"/>
+        </w:rPr>
+        <w:t>•  Часто</w:t>
+      </w:r>
+    </w:p>
+    <w:p>
+      <w:pPr>
+        <w:keepNext w:val="0"/>
+        <w:spacing w:after="0" w:line="276" w:lineRule="auto"/>
+        <w:ind w:left="567"/>
+        <w:jc w:val="left"/>
+      </w:pPr>
+      <w:r>
+        <w:rPr>
+          <w:b w:val="0"/>
+          <w:i w:val="0"/>
+          <w:sz w:val="24"/>
+        </w:rPr>
+        <w:t>•  Почти всегда</w:t>
+      </w:r>
+    </w:p>
+    <w:p>
+      <w:pPr>
+        <w:keepNext/>
+        <w:spacing w:after="0" w:line="276" w:lineRule="auto" w:before="120"/>
+        <w:jc w:val="left"/>
+      </w:pPr>
+      <w:r>
+        <w:rPr>
+          <w:b/>
+          <w:i w:val="0"/>
+          <w:sz w:val="24"/>
+        </w:rPr>
+        <w:t>5. Если у тебя возникает проблема, к кому из одноклассников ты можешь обратиться за помощью? (можно указать несколько фамилий или написать «никто»)</w:t>
+      </w:r>
+    </w:p>
+    <w:p>
+      <w:pPr>
+        <w:keepNext w:val="0"/>
+        <w:spacing w:after="0" w:line="276" w:lineRule="auto"/>
+        <w:ind w:left="567"/>
+        <w:jc w:val="left"/>
+      </w:pPr>
+      <w:r>
+        <w:rPr>
+          <w:b w:val="0"/>
+          <w:i w:val="0"/>
+          <w:sz w:val="24"/>
+        </w:rPr>
+        <w:t>_______________________________________________________</w:t>
+      </w:r>
+    </w:p>
+    <w:p>
+      <w:pPr>
+        <w:keepNext/>
+        <w:spacing w:after="0" w:line="276" w:lineRule="auto" w:before="120"/>
+        <w:jc w:val="left"/>
+      </w:pPr>
+      <w:r>
+        <w:rPr>
+          <w:b/>
+          <w:i w:val="0"/>
+          <w:sz w:val="24"/>
+        </w:rPr>
+        <w:t>6. Как ты считаешь, есть ли в классе ученики, которых несправедливо обижают или не замечают?</w:t>
+      </w:r>
+    </w:p>
+    <w:p>
+      <w:pPr>
+        <w:keepNext/>
+        <w:spacing w:after="0" w:line="276" w:lineRule="auto"/>
+        <w:ind w:left="567"/>
+        <w:jc w:val="left"/>
+      </w:pPr>
+      <w:r>
+        <w:rPr>
+          <w:b w:val="0"/>
+          <w:i w:val="0"/>
+          <w:sz w:val="24"/>
+        </w:rPr>
+        <w:t>•  Нет</w:t>
+      </w:r>
+    </w:p>
+    <w:p>
+      <w:pPr>
+        <w:keepNext/>
+        <w:spacing w:after="0" w:line="276" w:lineRule="auto"/>
+        <w:ind w:left="567"/>
+        <w:jc w:val="left"/>
+      </w:pPr>
+      <w:r>
+        <w:rPr>
+          <w:b w:val="0"/>
+          <w:i w:val="0"/>
+          <w:sz w:val="24"/>
+        </w:rPr>
+        <w:t>•  Да, один-два человека</w:t>
+      </w:r>
+    </w:p>
+    <w:p>
+      <w:pPr>
+        <w:keepNext/>
+        <w:spacing w:after="0" w:line="276" w:lineRule="auto"/>
+        <w:ind w:left="567"/>
+        <w:jc w:val="left"/>
+      </w:pPr>
+      <w:r>
+        <w:rPr>
+          <w:b w:val="0"/>
+          <w:i w:val="0"/>
+          <w:sz w:val="24"/>
+        </w:rPr>
+        <w:t>•  Да, несколько человек</w:t>
+      </w:r>
+    </w:p>
+    <w:p>
+      <w:pPr>
+        <w:keepNext w:val="0"/>
+        <w:spacing w:after="0" w:line="276" w:lineRule="auto"/>
+        <w:ind w:left="567"/>
+        <w:jc w:val="left"/>
+      </w:pPr>
+      <w:r>
+        <w:rPr>
+          <w:b w:val="0"/>
+          <w:i w:val="0"/>
+          <w:sz w:val="24"/>
+        </w:rPr>
+        <w:t>•  Затрудняюсь ответить</w:t>
+      </w:r>
+    </w:p>
+    <w:p>
+      <w:pPr>
+        <w:keepNext/>
+        <w:spacing w:after="0" w:line="276" w:lineRule="auto" w:before="120"/>
+        <w:jc w:val="left"/>
+      </w:pPr>
+      <w:r>
+        <w:rPr>
+          <w:b/>
+          <w:i w:val="0"/>
+          <w:sz w:val="24"/>
+        </w:rPr>
+        <w:t>7. Хотел(а) бы ты перейти в другой класс?</w:t>
+      </w:r>
+    </w:p>
+    <w:p>
+      <w:pPr>
+        <w:keepNext/>
+        <w:spacing w:after="0" w:line="276" w:lineRule="auto"/>
+        <w:ind w:left="567"/>
+        <w:jc w:val="left"/>
+      </w:pPr>
+      <w:r>
+        <w:rPr>
+          <w:b w:val="0"/>
+          <w:i w:val="0"/>
+          <w:sz w:val="24"/>
+        </w:rPr>
+        <w:t>•  Нет</w:t>
+      </w:r>
+    </w:p>
+    <w:p>
+      <w:pPr>
+        <w:keepNext/>
+        <w:spacing w:after="0" w:line="276" w:lineRule="auto"/>
+        <w:ind w:left="567"/>
+        <w:jc w:val="left"/>
       </w:pPr>
       <w:r>
         <w:rPr>
@@ -3127,416 +3537,7 @@
         <w:keepNext/>
         <w:spacing w:after="0" w:line="276" w:lineRule="auto"/>
         <w:ind w:left="567"/>
-        <w:jc w:val="both"/>
-      </w:pPr>
-      <w:r>
-        <w:rPr>
-          <w:b w:val="0"/>
-          <w:i w:val="0"/>
-          <w:sz w:val="24"/>
-        </w:rPr>
-        <w:t>•  Нет</w:t>
-      </w:r>
-    </w:p>
-    <w:p>
-      <w:pPr>
-        <w:keepNext/>
-        <w:spacing w:after="0" w:line="276" w:lineRule="auto" w:before="80"/>
-        <w:jc w:val="both"/>
-      </w:pPr>
-      <w:r>
-        <w:rPr>
-          <w:b/>
-          <w:i w:val="0"/>
-          <w:sz w:val="24"/>
-        </w:rPr>
-        <w:t>2. Как бы ты оценил(а) отношения с одноклассниками?</w:t>
-      </w:r>
-    </w:p>
-    <w:p>
-      <w:pPr>
-        <w:keepNext/>
-        <w:spacing w:after="0" w:line="276" w:lineRule="auto"/>
-        <w:ind w:left="567"/>
-        <w:jc w:val="both"/>
-      </w:pPr>
-      <w:r>
-        <w:rPr>
-          <w:b w:val="0"/>
-          <w:i w:val="0"/>
-          <w:sz w:val="24"/>
-        </w:rPr>
-        <w:t>•  Очень хорошие</w:t>
-      </w:r>
-    </w:p>
-    <w:p>
-      <w:pPr>
-        <w:keepNext/>
-        <w:spacing w:after="0" w:line="276" w:lineRule="auto"/>
-        <w:ind w:left="567"/>
-        <w:jc w:val="both"/>
-      </w:pPr>
-      <w:r>
-        <w:rPr>
-          <w:b w:val="0"/>
-          <w:i w:val="0"/>
-          <w:sz w:val="24"/>
-        </w:rPr>
-        <w:t>•  Хорошие</w:t>
-      </w:r>
-    </w:p>
-    <w:p>
-      <w:pPr>
-        <w:keepNext/>
-        <w:spacing w:after="0" w:line="276" w:lineRule="auto"/>
-        <w:ind w:left="567"/>
-        <w:jc w:val="both"/>
-      </w:pPr>
-      <w:r>
-        <w:rPr>
-          <w:b w:val="0"/>
-          <w:i w:val="0"/>
-          <w:sz w:val="24"/>
-        </w:rPr>
-        <w:t>•  Нормальные</w:t>
-      </w:r>
-    </w:p>
-    <w:p>
-      <w:pPr>
-        <w:keepNext/>
-        <w:spacing w:after="0" w:line="276" w:lineRule="auto"/>
-        <w:ind w:left="567"/>
-        <w:jc w:val="both"/>
-      </w:pPr>
-      <w:r>
-        <w:rPr>
-          <w:b w:val="0"/>
-          <w:i w:val="0"/>
-          <w:sz w:val="24"/>
-        </w:rPr>
-        <w:t>•  Не очень хорошие</w:t>
-      </w:r>
-    </w:p>
-    <w:p>
-      <w:pPr>
-        <w:keepNext/>
-        <w:spacing w:after="0" w:line="276" w:lineRule="auto" w:before="80"/>
-        <w:jc w:val="both"/>
-      </w:pPr>
-      <w:r>
-        <w:rPr>
-          <w:b/>
-          <w:i w:val="0"/>
-          <w:sz w:val="24"/>
-        </w:rPr>
-        <w:t>3. Чувствуешь ли ты себя в классе комфортно?</w:t>
-      </w:r>
-    </w:p>
-    <w:p>
-      <w:pPr>
-        <w:keepNext/>
-        <w:spacing w:after="0" w:line="276" w:lineRule="auto"/>
-        <w:ind w:left="567"/>
-        <w:jc w:val="both"/>
-      </w:pPr>
-      <w:r>
-        <w:rPr>
-          <w:b w:val="0"/>
-          <w:i w:val="0"/>
-          <w:sz w:val="24"/>
-        </w:rPr>
-        <w:t>•  Да, всегда</w:t>
-      </w:r>
-    </w:p>
-    <w:p>
-      <w:pPr>
-        <w:keepNext/>
-        <w:spacing w:after="0" w:line="276" w:lineRule="auto"/>
-        <w:ind w:left="567"/>
-        <w:jc w:val="both"/>
-      </w:pPr>
-      <w:r>
-        <w:rPr>
-          <w:b w:val="0"/>
-          <w:i w:val="0"/>
-          <w:sz w:val="24"/>
-        </w:rPr>
-        <w:t>•  Обычно да</w:t>
-      </w:r>
-    </w:p>
-    <w:p>
-      <w:pPr>
-        <w:keepNext/>
-        <w:spacing w:after="0" w:line="276" w:lineRule="auto"/>
-        <w:ind w:left="567"/>
-        <w:jc w:val="both"/>
-      </w:pPr>
-      <w:r>
-        <w:rPr>
-          <w:b w:val="0"/>
-          <w:i w:val="0"/>
-          <w:sz w:val="24"/>
-        </w:rPr>
-        <w:t>•  Иногда нет</w:t>
-      </w:r>
-    </w:p>
-    <w:p>
-      <w:pPr>
-        <w:keepNext/>
-        <w:spacing w:after="0" w:line="276" w:lineRule="auto"/>
-        <w:ind w:left="567"/>
-        <w:jc w:val="both"/>
-      </w:pPr>
-      <w:r>
-        <w:rPr>
-          <w:b w:val="0"/>
-          <w:i w:val="0"/>
-          <w:sz w:val="24"/>
-        </w:rPr>
-        <w:t>•  Чаще нет</w:t>
-      </w:r>
-    </w:p>
-    <w:p>
-      <w:pPr>
-        <w:keepNext/>
-        <w:spacing w:after="0" w:line="276" w:lineRule="auto" w:before="80"/>
-        <w:jc w:val="both"/>
-      </w:pPr>
-      <w:r>
-        <w:rPr>
-          <w:b/>
-          <w:i w:val="0"/>
-          <w:sz w:val="24"/>
-        </w:rPr>
-        <w:t>4. Бывают ли в классе ссоры и конфликты?</w:t>
-      </w:r>
-    </w:p>
-    <w:p>
-      <w:pPr>
-        <w:keepNext/>
-        <w:spacing w:after="0" w:line="276" w:lineRule="auto"/>
-        <w:ind w:left="567"/>
-        <w:jc w:val="both"/>
-      </w:pPr>
-      <w:r>
-        <w:rPr>
-          <w:b w:val="0"/>
-          <w:i w:val="0"/>
-          <w:sz w:val="24"/>
-        </w:rPr>
-        <w:t>•  Очень редко</w:t>
-      </w:r>
-    </w:p>
-    <w:p>
-      <w:pPr>
-        <w:keepNext/>
-        <w:spacing w:after="0" w:line="276" w:lineRule="auto"/>
-        <w:ind w:left="567"/>
-        <w:jc w:val="both"/>
-      </w:pPr>
-      <w:r>
-        <w:rPr>
-          <w:b w:val="0"/>
-          <w:i w:val="0"/>
-          <w:sz w:val="24"/>
-        </w:rPr>
-        <w:t>•  Иногда</w:t>
-      </w:r>
-    </w:p>
-    <w:p>
-      <w:pPr>
-        <w:keepNext/>
-        <w:spacing w:after="0" w:line="276" w:lineRule="auto"/>
-        <w:ind w:left="567"/>
-        <w:jc w:val="both"/>
-      </w:pPr>
-      <w:r>
-        <w:rPr>
-          <w:b w:val="0"/>
-          <w:i w:val="0"/>
-          <w:sz w:val="24"/>
-        </w:rPr>
-        <w:t>•  Часто</w:t>
-      </w:r>
-    </w:p>
-    <w:p>
-      <w:pPr>
-        <w:keepNext/>
-        <w:spacing w:after="0" w:line="276" w:lineRule="auto"/>
-        <w:ind w:left="567"/>
-        <w:jc w:val="both"/>
-      </w:pPr>
-      <w:r>
-        <w:rPr>
-          <w:b w:val="0"/>
-          <w:i w:val="0"/>
-          <w:sz w:val="24"/>
-        </w:rPr>
-        <w:t>•  Почти всегда</w:t>
-      </w:r>
-    </w:p>
-    <w:p>
-      <w:pPr>
-        <w:keepNext/>
-        <w:spacing w:after="0" w:line="276" w:lineRule="auto" w:before="80"/>
-        <w:jc w:val="both"/>
-      </w:pPr>
-      <w:r>
-        <w:rPr>
-          <w:b/>
-          <w:i w:val="0"/>
-          <w:sz w:val="24"/>
-        </w:rPr>
-        <w:t>5. Если у тебя возникает проблема, к кому из одноклассников ты можешь обратиться за помощью? (можно указать несколько фамилий или написать «никто»)</w:t>
-      </w:r>
-    </w:p>
-    <w:p>
-      <w:pPr>
-        <w:spacing w:after="0" w:line="276" w:lineRule="auto"/>
-        <w:ind w:left="567"/>
-        <w:jc w:val="both"/>
-      </w:pPr>
-      <w:r>
-        <w:rPr>
-          <w:b w:val="0"/>
-          <w:i w:val="0"/>
-          <w:sz w:val="24"/>
-        </w:rPr>
-        <w:t>____________________________________________________________</w:t>
-      </w:r>
-    </w:p>
-    <w:p>
-      <w:pPr>
-        <w:keepNext/>
-        <w:spacing w:after="0" w:line="276" w:lineRule="auto" w:before="80"/>
-        <w:jc w:val="both"/>
-      </w:pPr>
-      <w:r>
-        <w:rPr>
-          <w:b/>
-          <w:i w:val="0"/>
-          <w:sz w:val="24"/>
-        </w:rPr>
-        <w:t>6. Как ты считаешь, есть ли в классе ученики, которых несправедливо обижают или не замечают?</w:t>
-      </w:r>
-    </w:p>
-    <w:p>
-      <w:pPr>
-        <w:keepNext/>
-        <w:spacing w:after="0" w:line="276" w:lineRule="auto"/>
-        <w:ind w:left="567"/>
-        <w:jc w:val="both"/>
-      </w:pPr>
-      <w:r>
-        <w:rPr>
-          <w:b w:val="0"/>
-          <w:i w:val="0"/>
-          <w:sz w:val="24"/>
-        </w:rPr>
-        <w:t>•  Нет</w:t>
-      </w:r>
-    </w:p>
-    <w:p>
-      <w:pPr>
-        <w:keepNext/>
-        <w:spacing w:after="0" w:line="276" w:lineRule="auto"/>
-        <w:ind w:left="567"/>
-        <w:jc w:val="both"/>
-      </w:pPr>
-      <w:r>
-        <w:rPr>
-          <w:b w:val="0"/>
-          <w:i w:val="0"/>
-          <w:sz w:val="24"/>
-        </w:rPr>
-        <w:t>•  Да, один-два человека</w:t>
-      </w:r>
-    </w:p>
-    <w:p>
-      <w:pPr>
-        <w:keepNext/>
-        <w:spacing w:after="0" w:line="276" w:lineRule="auto"/>
-        <w:ind w:left="567"/>
-        <w:jc w:val="both"/>
-      </w:pPr>
-      <w:r>
-        <w:rPr>
-          <w:b w:val="0"/>
-          <w:i w:val="0"/>
-          <w:sz w:val="24"/>
-        </w:rPr>
-        <w:t>•  Да, несколько человек</w:t>
-      </w:r>
-    </w:p>
-    <w:p>
-      <w:pPr>
-        <w:keepNext/>
-        <w:spacing w:after="0" w:line="276" w:lineRule="auto"/>
-        <w:ind w:left="567"/>
-        <w:jc w:val="both"/>
-      </w:pPr>
-      <w:r>
-        <w:rPr>
-          <w:b w:val="0"/>
-          <w:i w:val="0"/>
-          <w:sz w:val="24"/>
-        </w:rPr>
-        <w:t>•  Затрудняюсь ответить</w:t>
-      </w:r>
-    </w:p>
-    <w:p>
-      <w:pPr>
-        <w:keepNext/>
-        <w:spacing w:after="0" w:line="276" w:lineRule="auto" w:before="80"/>
-        <w:jc w:val="both"/>
-      </w:pPr>
-      <w:r>
-        <w:rPr>
-          <w:b/>
-          <w:i w:val="0"/>
-          <w:sz w:val="24"/>
-        </w:rPr>
-        <w:t>7. Хотел(а) бы ты перейти в другой класс?</w:t>
-      </w:r>
-    </w:p>
-    <w:p>
-      <w:pPr>
-        <w:keepNext/>
-        <w:spacing w:after="0" w:line="276" w:lineRule="auto"/>
-        <w:ind w:left="567"/>
-        <w:jc w:val="both"/>
-      </w:pPr>
-      <w:r>
-        <w:rPr>
-          <w:b w:val="0"/>
-          <w:i w:val="0"/>
-          <w:sz w:val="24"/>
-        </w:rPr>
-        <w:t>•  Нет</w:t>
-      </w:r>
-    </w:p>
-    <w:p>
-      <w:pPr>
-        <w:keepNext/>
-        <w:spacing w:after="0" w:line="276" w:lineRule="auto"/>
-        <w:ind w:left="567"/>
-        <w:jc w:val="both"/>
-      </w:pPr>
-      <w:r>
-        <w:rPr>
-          <w:b w:val="0"/>
-          <w:i w:val="0"/>
-          <w:sz w:val="24"/>
-        </w:rPr>
-        <w:t>•  Скорее нет</w:t>
-      </w:r>
-    </w:p>
-    <w:p>
-      <w:pPr>
-        <w:keepNext/>
-        <w:spacing w:after="0" w:line="276" w:lineRule="auto"/>
-        <w:ind w:left="567"/>
-        <w:jc w:val="both"/>
+        <w:jc w:val="left"/>
       </w:pPr>
       <w:r>
         <w:rPr>
@@ -3549,10 +3550,10 @@
     </w:p>
     <w:p>
       <w:pPr>
-        <w:keepNext/>
+        <w:keepNext w:val="0"/>
         <w:spacing w:after="0" w:line="276" w:lineRule="auto"/>
         <w:ind w:left="567"/>
-        <w:jc w:val="both"/>
+        <w:jc w:val="left"/>
       </w:pPr>
       <w:r>
         <w:rPr>
@@ -3566,8 +3567,8 @@
     <w:p>
       <w:pPr>
         <w:keepNext/>
-        <w:spacing w:after="0" w:line="276" w:lineRule="auto" w:before="80"/>
-        <w:jc w:val="both"/>
+        <w:spacing w:after="0" w:line="276" w:lineRule="auto" w:before="120"/>
+        <w:jc w:val="left"/>
       </w:pPr>
       <w:r>
         <w:rPr>
@@ -3583,7 +3584,7 @@
         <w:keepNext/>
         <w:spacing w:after="0" w:line="276" w:lineRule="auto"/>
         <w:ind w:left="567"/>
-        <w:jc w:val="both"/>
+        <w:jc w:val="left"/>
       </w:pPr>
       <w:r>
         <w:rPr>
@@ -3599,7 +3600,7 @@
         <w:keepNext/>
         <w:spacing w:after="0" w:line="276" w:lineRule="auto"/>
         <w:ind w:left="567"/>
-        <w:jc w:val="both"/>
+        <w:jc w:val="left"/>
       </w:pPr>
       <w:r>
         <w:rPr>
@@ -3615,7 +3616,7 @@
         <w:keepNext/>
         <w:spacing w:after="0" w:line="276" w:lineRule="auto"/>
         <w:ind w:left="567"/>
-        <w:jc w:val="both"/>
+        <w:jc w:val="left"/>
       </w:pPr>
       <w:r>
         <w:rPr>
@@ -3628,10 +3629,10 @@
     </w:p>
     <w:p>
       <w:pPr>
-        <w:keepNext/>
+        <w:keepNext w:val="0"/>
         <w:spacing w:after="0" w:line="276" w:lineRule="auto"/>
         <w:ind w:left="567"/>
-        <w:jc w:val="both"/>
+        <w:jc w:val="left"/>
       </w:pPr>
       <w:r>
         <w:rPr>
@@ -3645,8 +3646,8 @@
     <w:p>
       <w:pPr>
         <w:keepNext/>
-        <w:spacing w:after="0" w:line="276" w:lineRule="auto" w:before="80"/>
-        <w:jc w:val="both"/>
+        <w:spacing w:after="0" w:line="276" w:lineRule="auto" w:before="120"/>
+        <w:jc w:val="left"/>
       </w:pPr>
       <w:r>
         <w:rPr>
@@ -3659,9 +3660,10 @@
     </w:p>
     <w:p>
       <w:pPr>
+        <w:keepNext w:val="0"/>
         <w:spacing w:after="0" w:line="276" w:lineRule="auto"/>
         <w:ind w:left="567"/>
-        <w:jc w:val="both"/>
+        <w:jc w:val="left"/>
       </w:pPr>
       <w:r>
         <w:rPr>
@@ -3669,14 +3671,14 @@
           <w:i w:val="0"/>
           <w:sz w:val="24"/>
         </w:rPr>
-        <w:t>____________________________________________________________</w:t>
+        <w:t>_______________________________________________________</w:t>
       </w:r>
     </w:p>
     <w:p>
       <w:pPr>
         <w:keepNext/>
-        <w:spacing w:after="0" w:line="276" w:lineRule="auto" w:before="80"/>
-        <w:jc w:val="both"/>
+        <w:spacing w:after="0" w:line="276" w:lineRule="auto" w:before="120"/>
+        <w:jc w:val="left"/>
       </w:pPr>
       <w:r>
         <w:rPr>
@@ -3692,7 +3694,7 @@
         <w:keepNext/>
         <w:spacing w:after="0" w:line="276" w:lineRule="auto"/>
         <w:ind w:left="567"/>
-        <w:jc w:val="both"/>
+        <w:jc w:val="left"/>
       </w:pPr>
       <w:r>
         <w:rPr>
@@ -3708,7 +3710,7 @@
         <w:keepNext/>
         <w:spacing w:after="0" w:line="276" w:lineRule="auto"/>
         <w:ind w:left="567"/>
-        <w:jc w:val="both"/>
+        <w:jc w:val="left"/>
       </w:pPr>
       <w:r>
         <w:rPr>
@@ -3724,7 +3726,7 @@
         <w:keepNext/>
         <w:spacing w:after="0" w:line="276" w:lineRule="auto"/>
         <w:ind w:left="567"/>
-        <w:jc w:val="both"/>
+        <w:jc w:val="left"/>
       </w:pPr>
       <w:r>
         <w:rPr>
@@ -3737,10 +3739,10 @@
     </w:p>
     <w:p>
       <w:pPr>
-        <w:keepNext/>
+        <w:keepNext w:val="0"/>
         <w:spacing w:after="0" w:line="276" w:lineRule="auto"/>
         <w:ind w:left="567"/>
-        <w:jc w:val="both"/>
+        <w:jc w:val="left"/>
       </w:pPr>
       <w:r>
         <w:rPr>
@@ -3754,8 +3756,8 @@
     <w:p>
       <w:pPr>
         <w:keepNext/>
-        <w:spacing w:after="0" w:line="276" w:lineRule="auto" w:before="80"/>
-        <w:jc w:val="both"/>
+        <w:spacing w:after="0" w:line="276" w:lineRule="auto" w:before="120"/>
+        <w:jc w:val="left"/>
       </w:pPr>
       <w:r>
         <w:rPr>
@@ -3768,9 +3770,10 @@
     </w:p>
     <w:p>
       <w:pPr>
+        <w:keepNext/>
         <w:spacing w:after="0" w:line="276" w:lineRule="auto"/>
         <w:ind w:left="567"/>
-        <w:jc w:val="both"/>
+        <w:jc w:val="left"/>
       </w:pPr>
       <w:r>
         <w:rPr>
@@ -3778,14 +3781,15 @@
           <w:i w:val="0"/>
           <w:sz w:val="24"/>
         </w:rPr>
-        <w:t>1. ____________________________________________________________</w:t>
+        <w:t>1. _______________________________________________________</w:t>
       </w:r>
     </w:p>
     <w:p>
       <w:pPr>
+        <w:keepNext/>
         <w:spacing w:after="0" w:line="276" w:lineRule="auto"/>
         <w:ind w:left="567"/>
-        <w:jc w:val="both"/>
+        <w:jc w:val="left"/>
       </w:pPr>
       <w:r>
         <w:rPr>
@@ -3793,14 +3797,15 @@
           <w:i w:val="0"/>
           <w:sz w:val="24"/>
         </w:rPr>
-        <w:t>2. ____________________________________________________________</w:t>
+        <w:t>2. _______________________________________________________</w:t>
       </w:r>
     </w:p>
     <w:p>
       <w:pPr>
+        <w:keepNext w:val="0"/>
         <w:spacing w:after="0" w:line="276" w:lineRule="auto"/>
         <w:ind w:left="567"/>
-        <w:jc w:val="both"/>
+        <w:jc w:val="left"/>
       </w:pPr>
       <w:r>
         <w:rPr>
@@ -3808,14 +3813,14 @@
           <w:i w:val="0"/>
           <w:sz w:val="24"/>
         </w:rPr>
-        <w:t>3. ____________________________________________________________</w:t>
+        <w:t>3. _______________________________________________________</w:t>
       </w:r>
     </w:p>
     <w:p>
       <w:pPr>
         <w:keepNext/>
-        <w:spacing w:after="0" w:line="276" w:lineRule="auto" w:before="80"/>
-        <w:jc w:val="both"/>
+        <w:spacing w:after="0" w:line="276" w:lineRule="auto" w:before="120"/>
+        <w:jc w:val="left"/>
       </w:pPr>
       <w:r>
         <w:rPr>
@@ -3828,9 +3833,10 @@
     </w:p>
     <w:p>
       <w:pPr>
+        <w:keepNext/>
         <w:spacing w:after="0" w:line="276" w:lineRule="auto"/>
         <w:ind w:left="567"/>
-        <w:jc w:val="both"/>
+        <w:jc w:val="left"/>
       </w:pPr>
       <w:r>
         <w:rPr>
@@ -3838,14 +3844,15 @@
           <w:i w:val="0"/>
           <w:sz w:val="24"/>
         </w:rPr>
-        <w:t>1. ____________________________________________________________</w:t>
+        <w:t>1. _______________________________________________________</w:t>
       </w:r>
     </w:p>
     <w:p>
       <w:pPr>
+        <w:keepNext/>
         <w:spacing w:after="0" w:line="276" w:lineRule="auto"/>
         <w:ind w:left="567"/>
-        <w:jc w:val="both"/>
+        <w:jc w:val="left"/>
       </w:pPr>
       <w:r>
         <w:rPr>
@@ -3853,14 +3860,15 @@
           <w:i w:val="0"/>
           <w:sz w:val="24"/>
         </w:rPr>
-        <w:t>2. ____________________________________________________________</w:t>
+        <w:t>2. _______________________________________________________</w:t>
       </w:r>
     </w:p>
     <w:p>
       <w:pPr>
+        <w:keepNext w:val="0"/>
         <w:spacing w:after="0" w:line="276" w:lineRule="auto"/>
         <w:ind w:left="567"/>
-        <w:jc w:val="both"/>
+        <w:jc w:val="left"/>
       </w:pPr>
       <w:r>
         <w:rPr>
@@ -3868,13 +3876,13 @@
           <w:i w:val="0"/>
           <w:sz w:val="24"/>
         </w:rPr>
-        <w:t>3. ____________________________________________________________</w:t>
+        <w:t>3. _______________________________________________________</w:t>
       </w:r>
     </w:p>
     <w:p>
       <w:pPr>
-        <w:spacing w:after="0" w:line="276" w:lineRule="auto"/>
-        <w:jc w:val="both"/>
+        <w:spacing w:after="0" w:line="276" w:lineRule="auto" w:before="160"/>
+        <w:jc w:val="left"/>
       </w:pPr>
       <w:r>
         <w:rPr>

</xml_diff>